<commit_message>
ajuste no conteúdo do relatório, template atualizado.
</commit_message>
<xml_diff>
--- a/src/assets/report/template_provisorio.docx
+++ b/src/assets/report/template_provisorio.docx
@@ -119,31 +119,7 @@
           <w:szCs w:val="32"/>
           <w:lang w:val="pt-BR"/>
         </w:rPr>
-        <w:t>{</w:t>
-      </w:r>
-      <w:proofErr w:type="spellStart"/>
-      <w:r>
-        <w:rPr>
-          <w:rFonts w:ascii="Calibri" w:eastAsia="Calibri" w:hAnsi="Calibri" w:cs="Calibri"/>
-          <w:b/>
-          <w:bCs/>
-          <w:sz w:val="32"/>
-          <w:szCs w:val="32"/>
-          <w:lang w:val="pt-BR"/>
-        </w:rPr>
-        <w:t>name</w:t>
-      </w:r>
-      <w:proofErr w:type="spellEnd"/>
-      <w:r>
-        <w:rPr>
-          <w:rFonts w:ascii="Calibri" w:eastAsia="Calibri" w:hAnsi="Calibri" w:cs="Calibri"/>
-          <w:b/>
-          <w:bCs/>
-          <w:sz w:val="32"/>
-          <w:szCs w:val="32"/>
-          <w:lang w:val="pt-BR"/>
-        </w:rPr>
-        <w:t>}}</w:t>
+        <w:t>{name}}</w:t>
       </w:r>
     </w:p>
     <w:p>
@@ -188,47 +164,11 @@
           <w:rFonts w:ascii="Calibri" w:eastAsia="Calibri" w:hAnsi="Calibri" w:cs="Calibri"/>
           <w:lang w:val="pt-BR"/>
         </w:rPr>
-        <w:t xml:space="preserve">A análise de </w:t>
-      </w:r>
-      <w:proofErr w:type="spellStart"/>
-      <w:r>
-        <w:rPr>
-          <w:rFonts w:ascii="Calibri" w:eastAsia="Calibri" w:hAnsi="Calibri" w:cs="Calibri"/>
-          <w:lang w:val="pt-BR"/>
-        </w:rPr>
-        <w:t>biorressonância</w:t>
-      </w:r>
-      <w:proofErr w:type="spellEnd"/>
-      <w:r>
-        <w:rPr>
-          <w:rFonts w:ascii="Calibri" w:eastAsia="Calibri" w:hAnsi="Calibri" w:cs="Calibri"/>
-          <w:lang w:val="pt-BR"/>
-        </w:rPr>
-        <w:t xml:space="preserve"> (por sistemas como </w:t>
-      </w:r>
-      <w:proofErr w:type="spellStart"/>
-      <w:r>
-        <w:rPr>
-          <w:rFonts w:ascii="Calibri" w:eastAsia="Calibri" w:hAnsi="Calibri" w:cs="Calibri"/>
-          <w:lang w:val="pt-BR"/>
-        </w:rPr>
-        <w:t>Prosync</w:t>
-      </w:r>
-      <w:proofErr w:type="spellEnd"/>
-      <w:r>
-        <w:rPr>
-          <w:rFonts w:ascii="Calibri" w:eastAsia="Calibri" w:hAnsi="Calibri" w:cs="Calibri"/>
-          <w:lang w:val="pt-BR"/>
-        </w:rPr>
-        <w:t>, Oberon ou Meta Hunter) não substitui o diagnóstico clínico. Seu propósito é identificar e medir padrões de frequência vibracional emitidos por tecidos e órgãos do corpo, comparando-os com assinaturas de frequência consideradas ideais.</w:t>
+        <w:t xml:space="preserve">A biorressonância é uma avaliação funcional e complementar que observa padrões de resposta do organismo a diferentes estímulos. Ela não substitui diagnósticos médicos, mas auxilia na identificação de tendências de sobrecarga ou equilíbrio no funcionamento do corpo. </w:t>
       </w:r>
     </w:p>
     <w:p>
       <w:pPr>
-        <w:numPr>
-          <w:ilvl w:val="0"/>
-          <w:numId w:val="4"/>
-        </w:numPr>
         <w:rPr>
           <w:rFonts w:ascii="Calibri" w:eastAsia="Calibri" w:hAnsi="Calibri" w:cs="Calibri"/>
           <w:lang w:val="pt-BR"/>
@@ -239,46 +179,14 @@
           <w:rFonts w:ascii="Calibri" w:eastAsia="Calibri" w:hAnsi="Calibri" w:cs="Calibri"/>
           <w:lang w:val="pt-BR"/>
         </w:rPr>
-        <w:t xml:space="preserve">Princípio Básico: Cada célula, estrutura e microrganismo vibra dentro de uma faixa de frequência específica. O sistema de </w:t>
-      </w:r>
-      <w:proofErr w:type="spellStart"/>
-      <w:r>
-        <w:rPr>
-          <w:rFonts w:ascii="Calibri" w:eastAsia="Calibri" w:hAnsi="Calibri" w:cs="Calibri"/>
-          <w:lang w:val="pt-BR"/>
-        </w:rPr>
-        <w:t>biorressonância</w:t>
-      </w:r>
-      <w:proofErr w:type="spellEnd"/>
-      <w:r>
-        <w:rPr>
-          <w:rFonts w:ascii="Calibri" w:eastAsia="Calibri" w:hAnsi="Calibri" w:cs="Calibri"/>
-          <w:lang w:val="pt-BR"/>
-        </w:rPr>
-        <w:t xml:space="preserve"> compara a frequência medida no paciente com faixas de referência estabelecidas por pesquisa biofísica.</w:t>
+        <w:t>Os padrões observados podem indicar estresse celular (sobrecarga das células), resposta inflamatória (ativação do sistema de defesa) e, quando persistentes, desequilíbrios biológicos que afetam sistemas como o digestivo, imunológico, hormonal e nervoso. A análise contribui para compreender esses processos e orientar cuidados integrativos.</w:t>
       </w:r>
     </w:p>
     <w:p>
       <w:pPr>
-        <w:numPr>
-          <w:ilvl w:val="0"/>
-          <w:numId w:val="4"/>
-        </w:numPr>
-        <w:rPr>
-          <w:rFonts w:ascii="Calibri" w:eastAsia="Calibri" w:hAnsi="Calibri" w:cs="Calibri"/>
-          <w:lang w:val="pt-BR"/>
-        </w:rPr>
-      </w:pPr>
-      <w:r>
-        <w:rPr>
-          <w:rFonts w:ascii="Calibri" w:eastAsia="Calibri" w:hAnsi="Calibri" w:cs="Calibri"/>
-          <w:lang w:val="pt-BR"/>
-        </w:rPr>
-        <w:t>Detecção de Desvios: A incongruência entre a frequência ideal e a frequência detectada é registrada como um "desvio". Esse desvio é frequentemente interpretado como um indicativo de estresse celular, resposta inflamatória e/ou presença de agentes biológicos.</w:t>
-      </w:r>
-    </w:p>
-    <w:p>
-      <w:pPr>
+        <w:tabs>
+          <w:tab w:val="left" w:pos="3165"/>
+        </w:tabs>
         <w:rPr>
           <w:rFonts w:ascii="Calibri" w:eastAsia="Calibri" w:hAnsi="Calibri" w:cs="Calibri"/>
           <w:b/>
@@ -307,6 +215,9 @@
     </w:p>
     <w:p>
       <w:pPr>
+        <w:tabs>
+          <w:tab w:val="left" w:pos="3165"/>
+        </w:tabs>
         <w:rPr>
           <w:rFonts w:ascii="Calibri" w:eastAsia="Calibri" w:hAnsi="Calibri" w:cs="Calibri"/>
           <w:lang w:val="pt-BR"/>
@@ -315,43 +226,160 @@
       <w:r>
         <w:rPr>
           <w:rFonts w:ascii="Calibri" w:eastAsia="Calibri" w:hAnsi="Calibri" w:cs="Calibri"/>
+          <w:b/>
+          <w:bCs/>
           <w:lang w:val="pt-BR"/>
         </w:rPr>
-        <w:t xml:space="preserve">A análise de </w:t>
-      </w:r>
-      <w:proofErr w:type="spellStart"/>
-      <w:r>
-        <w:rPr>
-          <w:rFonts w:ascii="Calibri" w:eastAsia="Calibri" w:hAnsi="Calibri" w:cs="Calibri"/>
-          <w:lang w:val="pt-BR"/>
-        </w:rPr>
-        <w:t>biorress</w:t>
+        <w:t xml:space="preserve">2.1. Patologias </w:t>
       </w:r>
       <w:r>
         <w:rPr>
           <w:rFonts w:ascii="Calibri" w:eastAsia="Calibri" w:hAnsi="Calibri" w:cs="Calibri"/>
           <w:lang w:val="pt-BR"/>
         </w:rPr>
-        <w:t>onâ</w:t>
+        <w:t>- identifica tendências funcionais associadas a possíveis patologias ativas ou em potencial, sem caráter diagnóstico. Esses achados indicam áreas de sobrecarga ou desequilíbrio, auxiliando na prevenção e no direcionamento de cuidados integrativos.</w:t>
+      </w:r>
+    </w:p>
+    <w:p>
+      <w:pPr>
+        <w:tabs>
+          <w:tab w:val="left" w:pos="3165"/>
+        </w:tabs>
+        <w:rPr>
+          <w:rFonts w:ascii="Calibri" w:eastAsia="Calibri" w:hAnsi="Calibri" w:cs="Calibri"/>
+          <w:lang w:val="pt-BR"/>
+        </w:rPr>
+      </w:pPr>
+      <w:r>
+        <w:rPr>
+          <w:rFonts w:ascii="Calibri" w:eastAsia="Calibri" w:hAnsi="Calibri" w:cs="Calibri"/>
+          <w:b/>
+          <w:bCs/>
+          <w:lang w:val="pt-BR"/>
+        </w:rPr>
+        <w:t xml:space="preserve">2.2. Microrganismos </w:t>
       </w:r>
       <w:r>
         <w:rPr>
           <w:rFonts w:ascii="Calibri" w:eastAsia="Calibri" w:hAnsi="Calibri" w:cs="Calibri"/>
           <w:lang w:val="pt-BR"/>
         </w:rPr>
-        <w:t>ncia</w:t>
+        <w:t>-  identifica vírus, bactérias, helmintos e protozoários que podem estar afetando o organismo , mas a manifestação varia conforme as particularidades fisiológicas e energéticas individuais, pois podem resultar da combinação sinérgica de cada microrganismo com toxinas  e até mesmo  com fatores psicoemocionais.</w:t>
       </w:r>
-      <w:proofErr w:type="spellEnd"/>
+    </w:p>
+    <w:p>
+      <w:pPr>
+        <w:tabs>
+          <w:tab w:val="left" w:pos="3165"/>
+        </w:tabs>
+        <w:rPr>
+          <w:rFonts w:ascii="Calibri" w:eastAsia="Calibri" w:hAnsi="Calibri" w:cs="Calibri"/>
+          <w:lang w:val="pt-BR"/>
+        </w:rPr>
+      </w:pPr>
+      <w:r>
+        <w:rPr>
+          <w:rFonts w:ascii="Calibri" w:eastAsia="Calibri" w:hAnsi="Calibri" w:cs="Calibri"/>
+          <w:b/>
+          <w:bCs/>
+          <w:lang w:val="pt-BR"/>
+        </w:rPr>
+        <w:t xml:space="preserve">2.3. Toxinas  - </w:t>
+      </w:r>
       <w:r>
         <w:rPr>
           <w:rFonts w:ascii="Calibri" w:eastAsia="Calibri" w:hAnsi="Calibri" w:cs="Calibri"/>
           <w:lang w:val="pt-BR"/>
         </w:rPr>
-        <w:t xml:space="preserve"> pode ser categorizada em diferentes seções para avaliar o impacto dos fatores que interferem no equilíbrio orgânico e energético do indivíduo.</w:t>
+        <w:t>identifica metais pesados, solventes, agrotóxicos, xenoestrógenos, radiação e toxinas diversas (ambientais, alimentares, intestinais, nervosas e farmacológicas). Tais substâncias contribuem para o aumento do estresse oxidativo, desestabilização metabólica e redução da eficiência imunológica, bem como alteram o pH dos tecidos e favorecem a disbiose, facilitando a proliferação de microrganismos oportunistas.</w:t>
       </w:r>
     </w:p>
     <w:p>
       <w:pPr>
+        <w:tabs>
+          <w:tab w:val="left" w:pos="3165"/>
+        </w:tabs>
+        <w:rPr>
+          <w:rFonts w:ascii="Calibri" w:eastAsia="Calibri" w:hAnsi="Calibri" w:cs="Calibri"/>
+          <w:lang w:val="pt-BR"/>
+        </w:rPr>
+      </w:pPr>
+      <w:r>
+        <w:rPr>
+          <w:rFonts w:ascii="Calibri" w:eastAsia="Calibri" w:hAnsi="Calibri" w:cs="Calibri"/>
+          <w:b/>
+          <w:bCs/>
+          <w:lang w:val="pt-BR"/>
+        </w:rPr>
+        <w:t xml:space="preserve">2.4. Campo morfogenético - </w:t>
+      </w:r>
+      <w:r>
+        <w:rPr>
+          <w:rFonts w:ascii="Calibri" w:eastAsia="Calibri" w:hAnsi="Calibri" w:cs="Calibri"/>
+          <w:lang w:val="pt-BR"/>
+        </w:rPr>
+        <w:t>identifica padrões associados a conteúdos emocionais recorrentes, compreendidos como experiências internas vividas de forma repetida ou prolongada. Esses estados geram estresse adaptativo no organismo, que se expressa por meio de respostas neurofisiológicas mensuráveis, como alterações na atividade elétrica cerebral, na coerência cardíaca, na função imunológica e na regulação neuroendócrina.</w:t>
+      </w:r>
+    </w:p>
+    <w:p>
+      <w:pPr>
+        <w:tabs>
+          <w:tab w:val="left" w:pos="3165"/>
+        </w:tabs>
+        <w:rPr>
+          <w:rFonts w:ascii="Calibri" w:eastAsia="Calibri" w:hAnsi="Calibri" w:cs="Calibri"/>
+          <w:lang w:val="pt-BR"/>
+        </w:rPr>
+      </w:pPr>
+      <w:r>
+        <w:rPr>
+          <w:rFonts w:ascii="Calibri" w:eastAsia="Calibri" w:hAnsi="Calibri" w:cs="Calibri"/>
+          <w:b/>
+          <w:bCs/>
+          <w:lang w:val="pt-BR"/>
+        </w:rPr>
+        <w:t xml:space="preserve">2.5. Pedras e cristais - </w:t>
+      </w:r>
+      <w:r>
+        <w:rPr>
+          <w:rFonts w:ascii="Calibri" w:eastAsia="Calibri" w:hAnsi="Calibri" w:cs="Calibri"/>
+          <w:lang w:val="pt-BR"/>
+        </w:rPr>
+        <w:t>possuem padrões vibracionais estáveis que, no contexto biofísico, podem atuar como suportes externos ao equilíbrio funcional do organismo. A afinidade observada sugere uma tendência à autorregulação, com possível apoio à estabilidade física e emocional.</w:t>
+      </w:r>
+    </w:p>
+    <w:p>
+      <w:pPr>
+        <w:tabs>
+          <w:tab w:val="left" w:pos="3165"/>
+        </w:tabs>
+        <w:rPr>
+          <w:rFonts w:ascii="Calibri" w:eastAsia="Calibri" w:hAnsi="Calibri" w:cs="Calibri"/>
+          <w:lang w:val="pt-BR"/>
+        </w:rPr>
+      </w:pPr>
+      <w:r>
+        <w:rPr>
+          <w:rFonts w:ascii="Calibri" w:eastAsia="Calibri" w:hAnsi="Calibri" w:cs="Calibri"/>
+          <w:b/>
+          <w:bCs/>
+          <w:lang w:val="pt-BR"/>
+        </w:rPr>
+        <w:t xml:space="preserve">2.6. Alimentos - </w:t>
+      </w:r>
+      <w:r>
+        <w:rPr>
+          <w:rFonts w:ascii="Calibri" w:eastAsia="Calibri" w:hAnsi="Calibri" w:cs="Calibri"/>
+          <w:lang w:val="pt-BR"/>
+        </w:rPr>
+        <w:t xml:space="preserve">essa análise não substitui orientações nutricionais convencionais, mas indica como o organismo responde aos alimentos testados, os que melhor se adaptam e os que podem causar sobrecarga metabólica. </w:t>
+      </w:r>
+    </w:p>
+    <w:p>
+      <w:pPr>
+        <w:tabs>
+          <w:tab w:val="left" w:pos="3165"/>
+        </w:tabs>
         <w:rPr>
           <w:rFonts w:ascii="Calibri" w:eastAsia="Calibri" w:hAnsi="Calibri" w:cs="Calibri"/>
           <w:b/>
@@ -366,322 +394,7 @@
           <w:bCs/>
           <w:lang w:val="pt-BR"/>
         </w:rPr>
-        <w:t>2.1. Microrganismos</w:t>
-      </w:r>
-    </w:p>
-    <w:p>
-      <w:pPr>
-        <w:tabs>
-          <w:tab w:val="num" w:pos="720"/>
-        </w:tabs>
-        <w:rPr>
-          <w:rFonts w:ascii="Calibri" w:eastAsia="Calibri" w:hAnsi="Calibri" w:cs="Calibri"/>
-          <w:lang w:val="pt-BR"/>
-        </w:rPr>
-      </w:pPr>
-      <w:r>
-        <w:rPr>
-          <w:rFonts w:ascii="Calibri" w:eastAsia="Calibri" w:hAnsi="Calibri" w:cs="Calibri"/>
-          <w:lang w:val="pt-BR"/>
-        </w:rPr>
-        <w:t>Esta categoria identifica microrganismos que apresentam ressonância com o campo biológico do paciente. Os sintomas associados refletem descrições clínicas reconhecidas, mas a manifestação varia conforme as particularidades fisiológicas e energéticas individuais.</w:t>
-      </w:r>
-    </w:p>
-    <w:p>
-      <w:pPr>
-        <w:rPr>
-          <w:rFonts w:ascii="Calibri" w:eastAsia="Calibri" w:hAnsi="Calibri" w:cs="Calibri"/>
-          <w:lang w:val="pt-BR"/>
-        </w:rPr>
-      </w:pPr>
-      <w:r>
-        <w:rPr>
-          <w:rFonts w:ascii="Calibri" w:eastAsia="Calibri" w:hAnsi="Calibri" w:cs="Calibri"/>
-          <w:lang w:val="pt-BR"/>
-        </w:rPr>
-        <w:t>Na abordagem integrativa, desequilíbrios de bem-estar podem resultar da combinação sinérgica de um microrganismo com uma toxina associada.</w:t>
-      </w:r>
-    </w:p>
-    <w:p>
-      <w:pPr>
-        <w:rPr>
-          <w:rFonts w:ascii="Calibri" w:eastAsia="Calibri" w:hAnsi="Calibri" w:cs="Calibri"/>
-          <w:b/>
-          <w:bCs/>
-          <w:lang w:val="pt-BR"/>
-        </w:rPr>
-      </w:pPr>
-      <w:r>
-        <w:rPr>
-          <w:rFonts w:ascii="Calibri" w:eastAsia="Calibri" w:hAnsi="Calibri" w:cs="Calibri"/>
-          <w:b/>
-          <w:bCs/>
-          <w:lang w:val="pt-BR"/>
-        </w:rPr>
-        <w:t>2.2. Toxinas</w:t>
-      </w:r>
-    </w:p>
-    <w:p>
-      <w:pPr>
-        <w:tabs>
-          <w:tab w:val="num" w:pos="720"/>
-        </w:tabs>
-        <w:rPr>
-          <w:rFonts w:ascii="Calibri" w:eastAsia="Calibri" w:hAnsi="Calibri" w:cs="Calibri"/>
-          <w:lang w:val="pt-BR"/>
-        </w:rPr>
-      </w:pPr>
-      <w:r>
-        <w:rPr>
-          <w:rFonts w:ascii="Calibri" w:eastAsia="Calibri" w:hAnsi="Calibri" w:cs="Calibri"/>
-          <w:lang w:val="pt-BR"/>
-        </w:rPr>
-        <w:t xml:space="preserve">Esta análise inclui metais pesados, solventes, agrotóxicos, </w:t>
-      </w:r>
-      <w:proofErr w:type="spellStart"/>
-      <w:r>
-        <w:rPr>
-          <w:rFonts w:ascii="Calibri" w:eastAsia="Calibri" w:hAnsi="Calibri" w:cs="Calibri"/>
-          <w:lang w:val="pt-BR"/>
-        </w:rPr>
-        <w:t>xenoestrógenos</w:t>
-      </w:r>
-      <w:proofErr w:type="spellEnd"/>
-      <w:r>
-        <w:rPr>
-          <w:rFonts w:ascii="Calibri" w:eastAsia="Calibri" w:hAnsi="Calibri" w:cs="Calibri"/>
-          <w:lang w:val="pt-BR"/>
-        </w:rPr>
-        <w:t>, radiação e toxinas diversas (ambientais, alimentares, intestinais, nervosas e farmacológicas).</w:t>
-      </w:r>
-      <w:r>
-        <w:rPr>
-          <w:rFonts w:ascii="Calibri" w:eastAsia="Calibri" w:hAnsi="Calibri" w:cs="Calibri"/>
-          <w:lang w:val="pt-BR"/>
-        </w:rPr>
-        <w:t xml:space="preserve"> </w:t>
-      </w:r>
-    </w:p>
-    <w:p>
-      <w:pPr>
-        <w:tabs>
-          <w:tab w:val="num" w:pos="720"/>
-        </w:tabs>
-        <w:rPr>
-          <w:rFonts w:ascii="Calibri" w:eastAsia="Calibri" w:hAnsi="Calibri" w:cs="Calibri"/>
-          <w:lang w:val="pt-BR"/>
-        </w:rPr>
-      </w:pPr>
-      <w:r>
-        <w:rPr>
-          <w:rFonts w:ascii="Calibri" w:eastAsia="Calibri" w:hAnsi="Calibri" w:cs="Calibri"/>
-          <w:lang w:val="pt-BR"/>
-        </w:rPr>
-        <w:t>Tais substâncias contribuem para o aumento do estresse oxidativo, desestabilização metabólica e redução da eficiência imunológica, bem como alteram o pH dos tecidos e favorecem a disbiose, facilitando a proliferação de microrganismos oportunistas.</w:t>
-      </w:r>
-    </w:p>
-    <w:p>
-      <w:pPr>
-        <w:rPr>
-          <w:rFonts w:ascii="Calibri" w:eastAsia="Calibri" w:hAnsi="Calibri" w:cs="Calibri"/>
-          <w:b/>
-          <w:bCs/>
-          <w:lang w:val="pt-BR"/>
-        </w:rPr>
-      </w:pPr>
-      <w:r>
-        <w:rPr>
-          <w:rFonts w:ascii="Calibri" w:eastAsia="Calibri" w:hAnsi="Calibri" w:cs="Calibri"/>
-          <w:b/>
-          <w:bCs/>
-          <w:lang w:val="pt-BR"/>
-        </w:rPr>
-        <w:t xml:space="preserve">2.3. Campo </w:t>
-      </w:r>
-      <w:proofErr w:type="spellStart"/>
-      <w:r>
-        <w:rPr>
-          <w:rFonts w:ascii="Calibri" w:eastAsia="Calibri" w:hAnsi="Calibri" w:cs="Calibri"/>
-          <w:b/>
-          <w:bCs/>
-          <w:lang w:val="pt-BR"/>
-        </w:rPr>
-        <w:t>Morfogenético</w:t>
-      </w:r>
-      <w:proofErr w:type="spellEnd"/>
-    </w:p>
-    <w:p>
-      <w:pPr>
-        <w:rPr>
-          <w:rFonts w:ascii="Calibri" w:eastAsia="Calibri" w:hAnsi="Calibri" w:cs="Calibri"/>
-          <w:lang w:val="pt-BR"/>
-        </w:rPr>
-      </w:pPr>
-      <w:r>
-        <w:rPr>
-          <w:rFonts w:ascii="Calibri" w:eastAsia="Calibri" w:hAnsi="Calibri" w:cs="Calibri"/>
-          <w:lang w:val="pt-BR"/>
-        </w:rPr>
-        <w:t xml:space="preserve">O campo </w:t>
-      </w:r>
-      <w:proofErr w:type="spellStart"/>
-      <w:r>
-        <w:rPr>
-          <w:rFonts w:ascii="Calibri" w:eastAsia="Calibri" w:hAnsi="Calibri" w:cs="Calibri"/>
-          <w:lang w:val="pt-BR"/>
-        </w:rPr>
-        <w:t>morfogenético</w:t>
-      </w:r>
-      <w:proofErr w:type="spellEnd"/>
-      <w:r>
-        <w:rPr>
-          <w:rFonts w:ascii="Calibri" w:eastAsia="Calibri" w:hAnsi="Calibri" w:cs="Calibri"/>
-          <w:lang w:val="pt-BR"/>
-        </w:rPr>
-        <w:t xml:space="preserve"> é captado via </w:t>
-      </w:r>
-      <w:proofErr w:type="spellStart"/>
-      <w:r>
-        <w:rPr>
-          <w:rFonts w:ascii="Calibri" w:eastAsia="Calibri" w:hAnsi="Calibri" w:cs="Calibri"/>
-          <w:lang w:val="pt-BR"/>
-        </w:rPr>
-        <w:t>biorressonância</w:t>
-      </w:r>
-      <w:proofErr w:type="spellEnd"/>
-      <w:r>
-        <w:rPr>
-          <w:rFonts w:ascii="Calibri" w:eastAsia="Calibri" w:hAnsi="Calibri" w:cs="Calibri"/>
-          <w:lang w:val="pt-BR"/>
-        </w:rPr>
-        <w:t xml:space="preserve"> para identificar o impacto de fatores psicoemocionais e sociais</w:t>
-      </w:r>
-      <w:r>
-        <w:rPr>
-          <w:rFonts w:ascii="Calibri" w:eastAsia="Calibri" w:hAnsi="Calibri" w:cs="Calibri"/>
-          <w:lang w:val="pt-BR"/>
-        </w:rPr>
-        <w:t xml:space="preserve">  no organismo. </w:t>
-      </w:r>
-    </w:p>
-    <w:p>
-      <w:pPr>
-        <w:rPr>
-          <w:rFonts w:ascii="Calibri" w:eastAsia="Calibri" w:hAnsi="Calibri" w:cs="Calibri"/>
-          <w:lang w:val="pt-BR"/>
-        </w:rPr>
-      </w:pPr>
-      <w:r>
-        <w:rPr>
-          <w:rFonts w:ascii="Calibri" w:eastAsia="Calibri" w:hAnsi="Calibri" w:cs="Calibri"/>
-          <w:lang w:val="pt-BR"/>
-        </w:rPr>
-        <w:t>Pesquisas demonstram que estresse crônico, emoções persistentes e conflitos psicossociais induzem alterações mensuráveis na atividade elétrica cerebral, coerência cardíaca, função imunológica e regulação neuroendócrina.</w:t>
-      </w:r>
-    </w:p>
-    <w:p>
-      <w:pPr>
-        <w:rPr>
-          <w:rFonts w:ascii="Calibri" w:eastAsia="Calibri" w:hAnsi="Calibri" w:cs="Calibri"/>
-          <w:b/>
-          <w:bCs/>
-          <w:lang w:val="pt-BR"/>
-        </w:rPr>
-      </w:pPr>
-      <w:r>
-        <w:rPr>
-          <w:rFonts w:ascii="Calibri" w:eastAsia="Calibri" w:hAnsi="Calibri" w:cs="Calibri"/>
-          <w:b/>
-          <w:bCs/>
-          <w:lang w:val="pt-BR"/>
-        </w:rPr>
-        <w:lastRenderedPageBreak/>
-        <w:t>2.4. Alimentos</w:t>
-      </w:r>
-    </w:p>
-    <w:p>
-      <w:pPr>
-        <w:rPr>
-          <w:rFonts w:ascii="Calibri" w:eastAsia="Calibri" w:hAnsi="Calibri" w:cs="Calibri"/>
-          <w:lang w:val="pt-BR"/>
-        </w:rPr>
-      </w:pPr>
-      <w:r>
-        <w:rPr>
-          <w:rFonts w:ascii="Calibri" w:eastAsia="Calibri" w:hAnsi="Calibri" w:cs="Calibri"/>
-          <w:lang w:val="pt-BR"/>
-        </w:rPr>
-        <w:t>Esta análise não substitui as orientações nutricionais convencionais, mas indica como alimentos específicos podem influenciar o equilíbrio energético, digestório, inflamatório e imunológico.</w:t>
-      </w:r>
-    </w:p>
-    <w:p>
-      <w:pPr>
-        <w:tabs>
-          <w:tab w:val="num" w:pos="720"/>
-        </w:tabs>
-        <w:rPr>
-          <w:rFonts w:ascii="Calibri" w:eastAsia="Calibri" w:hAnsi="Calibri" w:cs="Calibri"/>
-          <w:lang w:val="pt-BR"/>
-        </w:rPr>
-      </w:pPr>
-      <w:r>
-        <w:rPr>
-          <w:rFonts w:ascii="Calibri" w:eastAsia="Calibri" w:hAnsi="Calibri" w:cs="Calibri"/>
-          <w:lang w:val="pt-BR"/>
-        </w:rPr>
-        <w:t>A compatibilidade alimentar é determinada pela ressonância entre o organismo e cada alimento testado. Os padrões de ressonância sugerem se o alimento contribui para a harmonia fisiológica ou, inversamente, aumenta o estresse metabólico.</w:t>
-      </w:r>
-    </w:p>
-    <w:p>
-      <w:pPr>
-        <w:rPr>
-          <w:rFonts w:ascii="Calibri" w:eastAsia="Calibri" w:hAnsi="Calibri" w:cs="Calibri"/>
-          <w:b/>
-          <w:bCs/>
-          <w:lang w:val="pt-BR"/>
-        </w:rPr>
-      </w:pPr>
-      <w:r>
-        <w:rPr>
-          <w:rFonts w:ascii="Calibri" w:eastAsia="Calibri" w:hAnsi="Calibri" w:cs="Calibri"/>
-          <w:b/>
-          <w:bCs/>
-          <w:lang w:val="pt-BR"/>
-        </w:rPr>
-        <w:t>2.5. Pedras e Cristais</w:t>
-      </w:r>
-    </w:p>
-    <w:p>
-      <w:pPr>
-        <w:rPr>
-          <w:rFonts w:ascii="Calibri" w:eastAsia="Calibri" w:hAnsi="Calibri" w:cs="Calibri"/>
-          <w:lang w:val="pt-BR"/>
-        </w:rPr>
-      </w:pPr>
-      <w:r>
-        <w:rPr>
-          <w:rFonts w:ascii="Calibri" w:eastAsia="Calibri" w:hAnsi="Calibri" w:cs="Calibri"/>
-          <w:lang w:val="pt-BR"/>
-        </w:rPr>
-        <w:t>Pedras e cristais possuem uma organização atômica altamente estável, emitindo padrões vibracionais constantes (referências de coerência).</w:t>
-      </w:r>
-    </w:p>
-    <w:p>
-      <w:pPr>
-        <w:tabs>
-          <w:tab w:val="num" w:pos="720"/>
-        </w:tabs>
-        <w:rPr>
-          <w:rFonts w:ascii="Calibri" w:eastAsia="Calibri" w:hAnsi="Calibri" w:cs="Calibri"/>
-          <w:lang w:val="pt-BR"/>
-        </w:rPr>
-      </w:pPr>
-      <w:r>
-        <w:rPr>
-          <w:rFonts w:ascii="Calibri" w:eastAsia="Calibri" w:hAnsi="Calibri" w:cs="Calibri"/>
-          <w:lang w:val="pt-BR"/>
-        </w:rPr>
-        <w:t>Esses padrões podem interagir com sistemas biológicos e emocionais em desregulação. Sendo assim, a afinidade com determinados cristais sugere que o organismo está buscando restaurar sua própria estabilidade, e esses elementos podem atuar como suportes externos para favorecer esse processo contribuindo para a redução do estresse, estabilização emocional, regulação do sistema nervoso autônomo e aumento da vitalidade.</w:t>
+        <w:tab/>
       </w:r>
     </w:p>
     <w:p>
@@ -706,7 +419,7 @@
     </w:p>
     <w:p>
       <w:pPr>
-        <w:spacing w:after="0" w:line="240" w:lineRule="auto"/>
+        <w:spacing w:after="120" w:line="240" w:lineRule="auto"/>
         <w:rPr>
           <w:rFonts w:ascii="Calibri" w:eastAsia="Calibri" w:hAnsi="Calibri" w:cs="Calibri"/>
           <w:lang w:val="pt-BR"/>
@@ -725,24 +438,21 @@
           <w:rFonts w:ascii="Calibri" w:eastAsia="Calibri" w:hAnsi="Calibri" w:cs="Calibri"/>
           <w:lang w:val="pt-BR"/>
         </w:rPr>
-        <w:t xml:space="preserve"> entre o padrão de frequência ideal de um órgão, tecido, microrganismo ou substância e a frequência detectada no paciente. </w:t>
+        <w:t xml:space="preserve"> entre o padrão de frequência ideal de um órgão, tecido, microrganismo ou substância e a frequência detectada no paciente.  </w:t>
       </w:r>
     </w:p>
     <w:p>
       <w:pPr>
-        <w:spacing w:after="0" w:line="240" w:lineRule="auto"/>
-        <w:jc w:val="center"/>
+        <w:spacing w:after="120" w:line="240" w:lineRule="auto"/>
         <w:rPr>
           <w:rFonts w:ascii="Calibri" w:eastAsia="Calibri" w:hAnsi="Calibri" w:cs="Calibri"/>
-          <w:b/>
-          <w:bCs/>
           <w:lang w:val="pt-BR"/>
         </w:rPr>
       </w:pPr>
     </w:p>
     <w:p>
       <w:pPr>
-        <w:spacing w:after="0" w:line="240" w:lineRule="auto"/>
+        <w:spacing w:after="120" w:line="240" w:lineRule="auto"/>
         <w:rPr>
           <w:rFonts w:ascii="Calibri" w:eastAsia="Calibri" w:hAnsi="Calibri" w:cs="Calibri"/>
           <w:lang w:val="pt-BR"/>
@@ -755,58 +465,24 @@
           <w:bCs/>
           <w:lang w:val="pt-BR"/>
         </w:rPr>
-        <w:t xml:space="preserve">No sistema </w:t>
-      </w:r>
-      <w:proofErr w:type="spellStart"/>
-      <w:r>
-        <w:rPr>
-          <w:rFonts w:ascii="Calibri" w:eastAsia="Calibri" w:hAnsi="Calibri" w:cs="Calibri"/>
-          <w:b/>
-          <w:bCs/>
-          <w:lang w:val="pt-BR"/>
-        </w:rPr>
-        <w:t>Prosync</w:t>
-      </w:r>
-      <w:proofErr w:type="spellEnd"/>
-      <w:r>
-        <w:rPr>
-          <w:rFonts w:ascii="Calibri" w:eastAsia="Calibri" w:hAnsi="Calibri" w:cs="Calibri"/>
-          <w:lang w:val="pt-BR"/>
-        </w:rPr>
-        <w:t xml:space="preserve"> , os resultados da análise  são apresentados no formato D = X/Y, onde: X = frequência do microrganismo ou substância analisada e  Y = frequência do paciente.</w:t>
+        <w:t>No sistema ProSync</w:t>
       </w:r>
       <w:r>
         <w:rPr>
           <w:rFonts w:ascii="Calibri" w:eastAsia="Calibri" w:hAnsi="Calibri" w:cs="Calibri"/>
           <w:lang w:val="pt-BR"/>
         </w:rPr>
-        <w:t xml:space="preserve"> </w:t>
+        <w:t>, os resultados da análise são apresentados no formato D = X/Y, em que X representa a frequência do microrganismo ou substância analisada e Y a frequência do paciente. É considerada normal uma faixa de variação de ±10%, dentro da qual pequenas diferenças não indicam desequilíbrio. Quando essa diferença ultrapassa essa faixa, o resultado sugere maior reatividade ou desequilíbrio funcional.</w:t>
       </w:r>
     </w:p>
     <w:p>
       <w:pPr>
-        <w:spacing w:after="0" w:line="240" w:lineRule="auto"/>
+        <w:spacing w:after="120" w:line="240" w:lineRule="auto"/>
         <w:rPr>
           <w:rFonts w:ascii="Calibri" w:eastAsia="Calibri" w:hAnsi="Calibri" w:cs="Calibri"/>
           <w:lang w:val="pt-BR"/>
         </w:rPr>
       </w:pPr>
-    </w:p>
-    <w:p>
-      <w:pPr>
-        <w:spacing w:after="0" w:line="240" w:lineRule="auto"/>
-        <w:rPr>
-          <w:rFonts w:ascii="Calibri" w:eastAsia="Calibri" w:hAnsi="Calibri" w:cs="Calibri"/>
-          <w:lang w:val="pt-BR"/>
-        </w:rPr>
-      </w:pPr>
-      <w:r>
-        <w:rPr>
-          <w:rFonts w:ascii="Calibri" w:eastAsia="Calibri" w:hAnsi="Calibri" w:cs="Calibri"/>
-          <w:lang w:val="pt-BR"/>
-        </w:rPr>
-        <w:t>O sistema considera o desvio padrão de ±10%  de X em relação ao valor de Y. Quando X está mais de 10% acima ou abaixo de Y indica divergência e possível reatividade bioenergética ou um processo inflamatório relacionado ao agente testado.</w:t>
-      </w:r>
     </w:p>
     <w:p>
       <w:pPr>
@@ -860,14 +536,12 @@
                 <w:rFonts w:ascii="Calibri" w:eastAsia="Calibri" w:hAnsi="Calibri" w:cs="Calibri"/>
               </w:rPr>
             </w:pPr>
-            <w:proofErr w:type="spellStart"/>
             <w:r>
               <w:rPr>
                 <w:rFonts w:ascii="Calibri" w:eastAsia="Calibri" w:hAnsi="Calibri" w:cs="Calibri"/>
               </w:rPr>
               <w:t>Aspectos</w:t>
             </w:r>
-            <w:proofErr w:type="spellEnd"/>
           </w:p>
         </w:tc>
         <w:tc>
@@ -916,14 +590,12 @@
                 <w:rFonts w:ascii="Calibri" w:eastAsia="Calibri" w:hAnsi="Calibri" w:cs="Calibri"/>
               </w:rPr>
             </w:pPr>
-            <w:proofErr w:type="spellStart"/>
             <w:r>
               <w:rPr>
                 <w:rFonts w:ascii="Calibri" w:eastAsia="Calibri" w:hAnsi="Calibri" w:cs="Calibri"/>
               </w:rPr>
               <w:t>Interpretação</w:t>
             </w:r>
-            <w:proofErr w:type="spellEnd"/>
           </w:p>
         </w:tc>
       </w:tr>
@@ -944,7 +616,6 @@
                 <w:szCs w:val="20"/>
               </w:rPr>
             </w:pPr>
-            <w:proofErr w:type="spellStart"/>
             <w:r>
               <w:rPr>
                 <w:rFonts w:ascii="Calibri" w:eastAsia="Calibri" w:hAnsi="Calibri" w:cs="Calibri"/>
@@ -953,7 +624,6 @@
               </w:rPr>
               <w:t>Microrganismos</w:t>
             </w:r>
-            <w:proofErr w:type="spellEnd"/>
           </w:p>
         </w:tc>
         <w:tc>
@@ -1234,7 +904,6 @@
                 <w:szCs w:val="20"/>
               </w:rPr>
             </w:pPr>
-            <w:proofErr w:type="spellStart"/>
             <w:r>
               <w:rPr>
                 <w:rFonts w:ascii="Calibri" w:eastAsia="Calibri" w:hAnsi="Calibri" w:cs="Calibri"/>
@@ -1243,7 +912,6 @@
               </w:rPr>
               <w:t>Toxinas</w:t>
             </w:r>
-            <w:proofErr w:type="spellEnd"/>
           </w:p>
         </w:tc>
         <w:tc>
@@ -1631,41 +1299,13 @@
               </w:rPr>
               <w:t xml:space="preserve">Não ressoa com o organismo. </w:t>
             </w:r>
-            <w:proofErr w:type="spellStart"/>
             <w:r>
               <w:rPr>
                 <w:rFonts w:ascii="Calibri" w:eastAsia="Calibri" w:hAnsi="Calibri" w:cs="Calibri"/>
                 <w:sz w:val="20"/>
                 <w:szCs w:val="20"/>
               </w:rPr>
-              <w:t>Ausência</w:t>
-            </w:r>
-            <w:proofErr w:type="spellEnd"/>
-            <w:r>
-              <w:rPr>
-                <w:rFonts w:ascii="Calibri" w:eastAsia="Calibri" w:hAnsi="Calibri" w:cs="Calibri"/>
-                <w:sz w:val="20"/>
-                <w:szCs w:val="20"/>
-              </w:rPr>
-              <w:t xml:space="preserve"> de carga </w:t>
-            </w:r>
-            <w:proofErr w:type="spellStart"/>
-            <w:r>
-              <w:rPr>
-                <w:rFonts w:ascii="Calibri" w:eastAsia="Calibri" w:hAnsi="Calibri" w:cs="Calibri"/>
-                <w:sz w:val="20"/>
-                <w:szCs w:val="20"/>
-              </w:rPr>
-              <w:t>tóxica</w:t>
-            </w:r>
-            <w:proofErr w:type="spellEnd"/>
-            <w:r>
-              <w:rPr>
-                <w:rFonts w:ascii="Calibri" w:eastAsia="Calibri" w:hAnsi="Calibri" w:cs="Calibri"/>
-                <w:sz w:val="20"/>
-                <w:szCs w:val="20"/>
-              </w:rPr>
-              <w:t>.</w:t>
+              <w:t>Ausência de carga tóxica.</w:t>
             </w:r>
           </w:p>
         </w:tc>
@@ -1704,18 +1344,8 @@
                 <w:sz w:val="20"/>
                 <w:szCs w:val="20"/>
               </w:rPr>
-              <w:t xml:space="preserve">Campo </w:t>
+              <w:t>Campo morfogenético</w:t>
             </w:r>
-            <w:proofErr w:type="spellStart"/>
-            <w:r>
-              <w:rPr>
-                <w:rFonts w:ascii="Calibri" w:eastAsia="Calibri" w:hAnsi="Calibri" w:cs="Calibri"/>
-                <w:sz w:val="20"/>
-                <w:szCs w:val="20"/>
-              </w:rPr>
-              <w:t>morfogenético</w:t>
-            </w:r>
-            <w:proofErr w:type="spellEnd"/>
           </w:p>
         </w:tc>
         <w:tc>
@@ -1912,115 +1542,7 @@
                 <w:sz w:val="20"/>
                 <w:szCs w:val="20"/>
               </w:rPr>
-              <w:t xml:space="preserve">Pode </w:t>
-            </w:r>
-            <w:proofErr w:type="spellStart"/>
-            <w:r>
-              <w:rPr>
-                <w:rFonts w:ascii="Calibri" w:eastAsia="Calibri" w:hAnsi="Calibri" w:cs="Calibri"/>
-                <w:sz w:val="20"/>
-                <w:szCs w:val="20"/>
-              </w:rPr>
-              <w:t>estar</w:t>
-            </w:r>
-            <w:proofErr w:type="spellEnd"/>
-            <w:r>
-              <w:rPr>
-                <w:rFonts w:ascii="Calibri" w:eastAsia="Calibri" w:hAnsi="Calibri" w:cs="Calibri"/>
-                <w:sz w:val="20"/>
-                <w:szCs w:val="20"/>
-              </w:rPr>
-              <w:t xml:space="preserve"> </w:t>
-            </w:r>
-            <w:proofErr w:type="spellStart"/>
-            <w:r>
-              <w:rPr>
-                <w:rFonts w:ascii="Calibri" w:eastAsia="Calibri" w:hAnsi="Calibri" w:cs="Calibri"/>
-                <w:sz w:val="20"/>
-                <w:szCs w:val="20"/>
-              </w:rPr>
-              <w:t>ligada</w:t>
-            </w:r>
-            <w:proofErr w:type="spellEnd"/>
-            <w:r>
-              <w:rPr>
-                <w:rFonts w:ascii="Calibri" w:eastAsia="Calibri" w:hAnsi="Calibri" w:cs="Calibri"/>
-                <w:sz w:val="20"/>
-                <w:szCs w:val="20"/>
-              </w:rPr>
-              <w:t xml:space="preserve"> a </w:t>
-            </w:r>
-            <w:proofErr w:type="spellStart"/>
-            <w:r>
-              <w:rPr>
-                <w:rFonts w:ascii="Calibri" w:eastAsia="Calibri" w:hAnsi="Calibri" w:cs="Calibri"/>
-                <w:sz w:val="20"/>
-                <w:szCs w:val="20"/>
-              </w:rPr>
-              <w:t>memórias</w:t>
-            </w:r>
-            <w:proofErr w:type="spellEnd"/>
-            <w:r>
-              <w:rPr>
-                <w:rFonts w:ascii="Calibri" w:eastAsia="Calibri" w:hAnsi="Calibri" w:cs="Calibri"/>
-                <w:sz w:val="20"/>
-                <w:szCs w:val="20"/>
-              </w:rPr>
-              <w:t xml:space="preserve"> </w:t>
-            </w:r>
-            <w:proofErr w:type="spellStart"/>
-            <w:r>
-              <w:rPr>
-                <w:rFonts w:ascii="Calibri" w:eastAsia="Calibri" w:hAnsi="Calibri" w:cs="Calibri"/>
-                <w:sz w:val="20"/>
-                <w:szCs w:val="20"/>
-              </w:rPr>
-              <w:t>ou</w:t>
-            </w:r>
-            <w:proofErr w:type="spellEnd"/>
-            <w:r>
-              <w:rPr>
-                <w:rFonts w:ascii="Calibri" w:eastAsia="Calibri" w:hAnsi="Calibri" w:cs="Calibri"/>
-                <w:sz w:val="20"/>
-                <w:szCs w:val="20"/>
-              </w:rPr>
-              <w:t xml:space="preserve"> </w:t>
-            </w:r>
-            <w:proofErr w:type="spellStart"/>
-            <w:r>
-              <w:rPr>
-                <w:rFonts w:ascii="Calibri" w:eastAsia="Calibri" w:hAnsi="Calibri" w:cs="Calibri"/>
-                <w:sz w:val="20"/>
-                <w:szCs w:val="20"/>
-              </w:rPr>
-              <w:t>padrões</w:t>
-            </w:r>
-            <w:proofErr w:type="spellEnd"/>
-            <w:r>
-              <w:rPr>
-                <w:rFonts w:ascii="Calibri" w:eastAsia="Calibri" w:hAnsi="Calibri" w:cs="Calibri"/>
-                <w:sz w:val="20"/>
-                <w:szCs w:val="20"/>
-              </w:rPr>
-              <w:t xml:space="preserve"> </w:t>
-            </w:r>
-            <w:proofErr w:type="spellStart"/>
-            <w:r>
-              <w:rPr>
-                <w:rFonts w:ascii="Calibri" w:eastAsia="Calibri" w:hAnsi="Calibri" w:cs="Calibri"/>
-                <w:sz w:val="20"/>
-                <w:szCs w:val="20"/>
-              </w:rPr>
-              <w:t>recorrentes</w:t>
-            </w:r>
-            <w:proofErr w:type="spellEnd"/>
-            <w:r>
-              <w:rPr>
-                <w:rFonts w:ascii="Calibri" w:eastAsia="Calibri" w:hAnsi="Calibri" w:cs="Calibri"/>
-                <w:sz w:val="20"/>
-                <w:szCs w:val="20"/>
-              </w:rPr>
-              <w:t>.</w:t>
+              <w:t>Pode estar ligada a memórias ou padrões recorrentes.</w:t>
             </w:r>
           </w:p>
         </w:tc>
@@ -2654,7 +2176,6 @@
           <w:b/>
           <w:bCs/>
         </w:rPr>
-        <w:lastRenderedPageBreak/>
         <w:t>4. RESULTADOS DAS ANÁLISES</w:t>
       </w:r>
     </w:p>
@@ -2675,8 +2196,7 @@
         <w:tblLook w:val="0400" w:firstRow="0" w:lastRow="0" w:firstColumn="0" w:lastColumn="0" w:noHBand="0" w:noVBand="1"/>
       </w:tblPr>
       <w:tblGrid>
-        <w:gridCol w:w="3222"/>
-        <w:gridCol w:w="6237"/>
+        <w:gridCol w:w="9459"/>
         <w:gridCol w:w="1134"/>
       </w:tblGrid>
       <w:tr>
@@ -2685,7 +2205,7 @@
         </w:trPr>
         <w:tc>
           <w:tcPr>
-            <w:tcW w:w="3222" w:type="dxa"/>
+            <w:tcW w:w="9459" w:type="dxa"/>
             <w:shd w:val="clear" w:color="auto" w:fill="D9D9D9"/>
           </w:tcPr>
           <w:p>
@@ -2715,32 +2235,52 @@
                 <w:bCs/>
                 <w:lang w:val="pt-BR"/>
               </w:rPr>
-              <w:t xml:space="preserve"> - TIPO</w:t>
+              <w:t xml:space="preserve"> </w:t>
             </w:r>
-          </w:p>
-        </w:tc>
-        <w:tc>
-          <w:tcPr>
-            <w:tcW w:w="6237" w:type="dxa"/>
-            <w:shd w:val="clear" w:color="auto" w:fill="D9D9D9"/>
-          </w:tcPr>
-          <w:p>
-            <w:pPr>
-              <w:spacing w:after="0" w:line="240" w:lineRule="auto"/>
-              <w:jc w:val="center"/>
+            <w:r>
               <w:rPr>
                 <w:rFonts w:ascii="Calibri" w:eastAsia="Calibri" w:hAnsi="Calibri" w:cs="Calibri"/>
                 <w:b/>
                 <w:bCs/>
-              </w:rPr>
-            </w:pPr>
+                <w:lang w:val="pt-BR"/>
+              </w:rPr>
+              <w:t>–</w:t>
+            </w:r>
             <w:r>
               <w:rPr>
                 <w:rFonts w:ascii="Calibri" w:eastAsia="Calibri" w:hAnsi="Calibri" w:cs="Calibri"/>
                 <w:b/>
                 <w:bCs/>
-              </w:rPr>
-              <w:t>SINTOMAS FREQUENTES</w:t>
+                <w:lang w:val="pt-BR"/>
+              </w:rPr>
+              <w:t xml:space="preserve"> TIPO</w:t>
+            </w:r>
+            <w:r>
+              <w:rPr>
+                <w:rFonts w:ascii="Calibri" w:eastAsia="Calibri" w:hAnsi="Calibri" w:cs="Calibri"/>
+                <w:b/>
+                <w:bCs/>
+                <w:lang w:val="pt-BR"/>
+              </w:rPr>
+              <w:t xml:space="preserve"> </w:t>
+            </w:r>
+            <w:r>
+              <w:rPr>
+                <w:rFonts w:ascii="Calibri" w:eastAsia="Calibri" w:hAnsi="Calibri" w:cs="Calibri"/>
+                <w:b/>
+                <w:bCs/>
+                <w:lang w:val="pt-BR"/>
+              </w:rPr>
+              <w:t>–</w:t>
+            </w:r>
+            <w:r>
+              <w:rPr>
+                <w:rFonts w:ascii="Calibri" w:eastAsia="Calibri" w:hAnsi="Calibri" w:cs="Calibri"/>
+                <w:b/>
+                <w:bCs/>
+                <w:lang w:val="pt-BR"/>
+              </w:rPr>
+              <w:t xml:space="preserve"> SINTOMAS FREQUENTES</w:t>
             </w:r>
           </w:p>
         </w:tc>
@@ -2777,7 +2317,7 @@
         <w:tc>
           <w:tcPr>
             <w:tcW w:w="10593" w:type="dxa"/>
-            <w:gridSpan w:val="3"/>
+            <w:gridSpan w:val="2"/>
           </w:tcPr>
           <w:p>
             <w:pPr>
@@ -2791,27 +2331,7 @@
               <w:rPr>
                 <w:rFonts w:ascii="Calibri" w:eastAsia="Calibri" w:hAnsi="Calibri" w:cs="Calibri"/>
               </w:rPr>
-              <w:t>{%</w:t>
-            </w:r>
-            <w:r>
-              <w:rPr>
-                <w:rFonts w:ascii="Calibri" w:eastAsia="Calibri" w:hAnsi="Calibri" w:cs="Calibri"/>
-              </w:rPr>
-              <w:t xml:space="preserve">tr for item in </w:t>
-            </w:r>
-            <w:proofErr w:type="spellStart"/>
-            <w:r>
-              <w:rPr>
-                <w:rFonts w:ascii="Calibri" w:eastAsia="Calibri" w:hAnsi="Calibri" w:cs="Calibri"/>
-              </w:rPr>
-              <w:t>table_microorganism</w:t>
-            </w:r>
-            <w:proofErr w:type="spellEnd"/>
-            <w:r>
-              <w:rPr>
-                <w:rFonts w:ascii="Calibri" w:eastAsia="Calibri" w:hAnsi="Calibri" w:cs="Calibri"/>
-              </w:rPr>
-              <w:t>%}</w:t>
+              <w:t>{%tr for item in table_microorganism%}</w:t>
             </w:r>
           </w:p>
         </w:tc>
@@ -2822,7 +2342,7 @@
         </w:trPr>
         <w:tc>
           <w:tcPr>
-            <w:tcW w:w="3222" w:type="dxa"/>
+            <w:tcW w:w="9459" w:type="dxa"/>
           </w:tcPr>
           <w:p>
             <w:pPr>
@@ -2834,55 +2354,46 @@
             <w:r>
               <w:rPr>
                 <w:rFonts w:ascii="Calibri" w:eastAsia="Calibri" w:hAnsi="Calibri" w:cs="Calibri"/>
-              </w:rPr>
-              <w:t>{{</w:t>
+                <w:b/>
+                <w:bCs/>
+              </w:rPr>
+              <w:t>{{item.nome}}</w:t>
             </w:r>
-            <w:proofErr w:type="spellStart"/>
             <w:r>
               <w:rPr>
                 <w:rFonts w:ascii="Calibri" w:eastAsia="Calibri" w:hAnsi="Calibri" w:cs="Calibri"/>
               </w:rPr>
-              <w:t>item.nome</w:t>
+              <w:t xml:space="preserve"> – </w:t>
             </w:r>
-            <w:proofErr w:type="spellEnd"/>
             <w:r>
               <w:rPr>
                 <w:rFonts w:ascii="Calibri" w:eastAsia="Calibri" w:hAnsi="Calibri" w:cs="Calibri"/>
               </w:rPr>
-              <w:t>}}</w:t>
+              <w:t>{{item.tipo}}</w:t>
             </w:r>
-          </w:p>
-        </w:tc>
-        <w:tc>
-          <w:tcPr>
-            <w:tcW w:w="6237" w:type="dxa"/>
-          </w:tcPr>
-          <w:p>
-            <w:pPr>
-              <w:spacing w:after="0" w:line="240" w:lineRule="auto"/>
-              <w:rPr>
-                <w:rFonts w:ascii="Calibri" w:eastAsia="Calibri" w:hAnsi="Calibri" w:cs="Calibri"/>
-              </w:rPr>
-            </w:pPr>
             <w:r>
               <w:rPr>
                 <w:rFonts w:ascii="Calibri" w:eastAsia="Calibri" w:hAnsi="Calibri" w:cs="Calibri"/>
               </w:rPr>
-              <w:t>{{</w:t>
+              <w:t xml:space="preserve"> </w:t>
             </w:r>
-            <w:proofErr w:type="spellStart"/>
             <w:r>
               <w:rPr>
                 <w:rFonts w:ascii="Calibri" w:eastAsia="Calibri" w:hAnsi="Calibri" w:cs="Calibri"/>
               </w:rPr>
-              <w:t>item.sintomas</w:t>
+              <w:t>–</w:t>
             </w:r>
-            <w:proofErr w:type="spellEnd"/>
             <w:r>
               <w:rPr>
                 <w:rFonts w:ascii="Calibri" w:eastAsia="Calibri" w:hAnsi="Calibri" w:cs="Calibri"/>
               </w:rPr>
-              <w:t>}}</w:t>
+              <w:t xml:space="preserve"> </w:t>
+            </w:r>
+            <w:r>
+              <w:rPr>
+                <w:rFonts w:ascii="Calibri" w:eastAsia="Calibri" w:hAnsi="Calibri" w:cs="Calibri"/>
+              </w:rPr>
+              <w:t>{{item.sintomas}}</w:t>
             </w:r>
           </w:p>
         </w:tc>
@@ -2902,21 +2413,7 @@
               <w:rPr>
                 <w:rFonts w:ascii="Calibri" w:eastAsia="Calibri" w:hAnsi="Calibri" w:cs="Calibri"/>
               </w:rPr>
-              <w:t>{{</w:t>
-            </w:r>
-            <w:proofErr w:type="spellStart"/>
-            <w:r>
-              <w:rPr>
-                <w:rFonts w:ascii="Calibri" w:eastAsia="Calibri" w:hAnsi="Calibri" w:cs="Calibri"/>
-              </w:rPr>
-              <w:t>item.D</w:t>
-            </w:r>
-            <w:proofErr w:type="spellEnd"/>
-            <w:r>
-              <w:rPr>
-                <w:rFonts w:ascii="Calibri" w:eastAsia="Calibri" w:hAnsi="Calibri" w:cs="Calibri"/>
-              </w:rPr>
-              <w:t>}}</w:t>
+              <w:t>{{item.D}}</w:t>
             </w:r>
           </w:p>
         </w:tc>
@@ -2928,7 +2425,7 @@
         <w:tc>
           <w:tcPr>
             <w:tcW w:w="10593" w:type="dxa"/>
-            <w:gridSpan w:val="3"/>
+            <w:gridSpan w:val="2"/>
           </w:tcPr>
           <w:p>
             <w:pPr>
@@ -2942,21 +2439,7 @@
               <w:rPr>
                 <w:rFonts w:ascii="Calibri" w:eastAsia="Calibri" w:hAnsi="Calibri" w:cs="Calibri"/>
               </w:rPr>
-              <w:t xml:space="preserve">{%tr </w:t>
-            </w:r>
-            <w:proofErr w:type="spellStart"/>
-            <w:r>
-              <w:rPr>
-                <w:rFonts w:ascii="Calibri" w:eastAsia="Calibri" w:hAnsi="Calibri" w:cs="Calibri"/>
-              </w:rPr>
-              <w:t>endfor</w:t>
-            </w:r>
-            <w:proofErr w:type="spellEnd"/>
-            <w:r>
-              <w:rPr>
-                <w:rFonts w:ascii="Calibri" w:eastAsia="Calibri" w:hAnsi="Calibri" w:cs="Calibri"/>
-              </w:rPr>
-              <w:t xml:space="preserve"> %}</w:t>
+              <w:t>{%tr endfor %}</w:t>
             </w:r>
           </w:p>
         </w:tc>
@@ -2989,8 +2472,7 @@
         <w:tblLook w:val="0400" w:firstRow="0" w:lastRow="0" w:firstColumn="0" w:lastColumn="0" w:noHBand="0" w:noVBand="1"/>
       </w:tblPr>
       <w:tblGrid>
-        <w:gridCol w:w="3222"/>
-        <w:gridCol w:w="6237"/>
+        <w:gridCol w:w="9459"/>
         <w:gridCol w:w="1134"/>
       </w:tblGrid>
       <w:tr>
@@ -2999,7 +2481,7 @@
         </w:trPr>
         <w:tc>
           <w:tcPr>
-            <w:tcW w:w="3222" w:type="dxa"/>
+            <w:tcW w:w="9459" w:type="dxa"/>
             <w:shd w:val="clear" w:color="auto" w:fill="D9D9D9"/>
           </w:tcPr>
           <w:p>
@@ -3029,30 +2511,32 @@
                 <w:bCs/>
                 <w:lang w:val="pt-BR"/>
               </w:rPr>
-              <w:t>PROSYNC - TIPO</w:t>
+              <w:t xml:space="preserve">PROSYNC – TIPO </w:t>
             </w:r>
-          </w:p>
-        </w:tc>
-        <w:tc>
-          <w:tcPr>
-            <w:tcW w:w="6237" w:type="dxa"/>
-            <w:shd w:val="clear" w:color="auto" w:fill="D9D9D9"/>
-          </w:tcPr>
-          <w:p>
-            <w:pPr>
-              <w:spacing w:after="0" w:line="240" w:lineRule="auto"/>
-              <w:jc w:val="center"/>
+            <w:r>
               <w:rPr>
                 <w:rFonts w:ascii="Calibri" w:eastAsia="Calibri" w:hAnsi="Calibri" w:cs="Calibri"/>
                 <w:b/>
                 <w:bCs/>
-              </w:rPr>
-            </w:pPr>
+                <w:lang w:val="pt-BR"/>
+              </w:rPr>
+              <w:t>–</w:t>
+            </w:r>
             <w:r>
               <w:rPr>
                 <w:rFonts w:ascii="Calibri" w:eastAsia="Calibri" w:hAnsi="Calibri" w:cs="Calibri"/>
                 <w:b/>
                 <w:bCs/>
+                <w:lang w:val="pt-BR"/>
+              </w:rPr>
+              <w:t xml:space="preserve"> </w:t>
+            </w:r>
+            <w:r>
+              <w:rPr>
+                <w:rFonts w:ascii="Calibri" w:eastAsia="Calibri" w:hAnsi="Calibri" w:cs="Calibri"/>
+                <w:b/>
+                <w:bCs/>
+                <w:lang w:val="pt-BR"/>
               </w:rPr>
               <w:t>SINTOMAS FREQUENTES</w:t>
             </w:r>
@@ -3091,7 +2575,7 @@
         <w:tc>
           <w:tcPr>
             <w:tcW w:w="10593" w:type="dxa"/>
-            <w:gridSpan w:val="3"/>
+            <w:gridSpan w:val="2"/>
           </w:tcPr>
           <w:p>
             <w:pPr>
@@ -3105,14 +2589,7 @@
               <w:rPr>
                 <w:rFonts w:ascii="Calibri" w:eastAsia="Calibri" w:hAnsi="Calibri" w:cs="Calibri"/>
               </w:rPr>
-              <w:t xml:space="preserve">{%tr for item in </w:t>
-            </w:r>
-            <w:proofErr w:type="spellStart"/>
-            <w:r>
-              <w:rPr>
-                <w:rFonts w:ascii="Calibri" w:eastAsia="Calibri" w:hAnsi="Calibri" w:cs="Calibri"/>
-              </w:rPr>
-              <w:t>tab</w:t>
+              <w:t>{%tr for item in tab</w:t>
             </w:r>
             <w:r>
               <w:rPr>
@@ -3120,7 +2597,6 @@
               </w:rPr>
               <w:t>le_prosync</w:t>
             </w:r>
-            <w:proofErr w:type="spellEnd"/>
             <w:r>
               <w:rPr>
                 <w:rFonts w:ascii="Calibri" w:eastAsia="Calibri" w:hAnsi="Calibri" w:cs="Calibri"/>
@@ -3136,7 +2612,7 @@
         </w:trPr>
         <w:tc>
           <w:tcPr>
-            <w:tcW w:w="3222" w:type="dxa"/>
+            <w:tcW w:w="9459" w:type="dxa"/>
           </w:tcPr>
           <w:p>
             <w:pPr>
@@ -3148,55 +2624,28 @@
             <w:r>
               <w:rPr>
                 <w:rFonts w:ascii="Calibri" w:eastAsia="Calibri" w:hAnsi="Calibri" w:cs="Calibri"/>
-              </w:rPr>
-              <w:t>{{</w:t>
+                <w:b/>
+                <w:bCs/>
+              </w:rPr>
+              <w:t>{{item.nome}}</w:t>
             </w:r>
-            <w:proofErr w:type="spellStart"/>
             <w:r>
               <w:rPr>
                 <w:rFonts w:ascii="Calibri" w:eastAsia="Calibri" w:hAnsi="Calibri" w:cs="Calibri"/>
               </w:rPr>
-              <w:t>item.nome</w:t>
+              <w:t xml:space="preserve"> – {{item.tipo}} </w:t>
             </w:r>
-            <w:proofErr w:type="spellEnd"/>
             <w:r>
               <w:rPr>
                 <w:rFonts w:ascii="Calibri" w:eastAsia="Calibri" w:hAnsi="Calibri" w:cs="Calibri"/>
               </w:rPr>
-              <w:t>}}</w:t>
+              <w:t>–</w:t>
             </w:r>
-          </w:p>
-        </w:tc>
-        <w:tc>
-          <w:tcPr>
-            <w:tcW w:w="6237" w:type="dxa"/>
-          </w:tcPr>
-          <w:p>
-            <w:pPr>
-              <w:spacing w:after="0" w:line="240" w:lineRule="auto"/>
-              <w:rPr>
-                <w:rFonts w:ascii="Calibri" w:eastAsia="Calibri" w:hAnsi="Calibri" w:cs="Calibri"/>
-              </w:rPr>
-            </w:pPr>
             <w:r>
               <w:rPr>
                 <w:rFonts w:ascii="Calibri" w:eastAsia="Calibri" w:hAnsi="Calibri" w:cs="Calibri"/>
               </w:rPr>
-              <w:t>{{</w:t>
-            </w:r>
-            <w:proofErr w:type="spellStart"/>
-            <w:r>
-              <w:rPr>
-                <w:rFonts w:ascii="Calibri" w:eastAsia="Calibri" w:hAnsi="Calibri" w:cs="Calibri"/>
-              </w:rPr>
-              <w:t>item.sintomas</w:t>
-            </w:r>
-            <w:proofErr w:type="spellEnd"/>
-            <w:r>
-              <w:rPr>
-                <w:rFonts w:ascii="Calibri" w:eastAsia="Calibri" w:hAnsi="Calibri" w:cs="Calibri"/>
-              </w:rPr>
-              <w:t>}}</w:t>
+              <w:t xml:space="preserve"> {{item.sintomas}}</w:t>
             </w:r>
           </w:p>
         </w:tc>
@@ -3216,21 +2665,7 @@
               <w:rPr>
                 <w:rFonts w:ascii="Calibri" w:eastAsia="Calibri" w:hAnsi="Calibri" w:cs="Calibri"/>
               </w:rPr>
-              <w:t>{{</w:t>
-            </w:r>
-            <w:proofErr w:type="spellStart"/>
-            <w:r>
-              <w:rPr>
-                <w:rFonts w:ascii="Calibri" w:eastAsia="Calibri" w:hAnsi="Calibri" w:cs="Calibri"/>
-              </w:rPr>
-              <w:t>item.D</w:t>
-            </w:r>
-            <w:proofErr w:type="spellEnd"/>
-            <w:r>
-              <w:rPr>
-                <w:rFonts w:ascii="Calibri" w:eastAsia="Calibri" w:hAnsi="Calibri" w:cs="Calibri"/>
-              </w:rPr>
-              <w:t>}}</w:t>
+              <w:t>{{item.D}}</w:t>
             </w:r>
           </w:p>
         </w:tc>
@@ -3242,7 +2677,7 @@
         <w:tc>
           <w:tcPr>
             <w:tcW w:w="10593" w:type="dxa"/>
-            <w:gridSpan w:val="3"/>
+            <w:gridSpan w:val="2"/>
           </w:tcPr>
           <w:p>
             <w:pPr>
@@ -3256,21 +2691,7 @@
               <w:rPr>
                 <w:rFonts w:ascii="Calibri" w:eastAsia="Calibri" w:hAnsi="Calibri" w:cs="Calibri"/>
               </w:rPr>
-              <w:t xml:space="preserve">{%tr </w:t>
-            </w:r>
-            <w:proofErr w:type="spellStart"/>
-            <w:r>
-              <w:rPr>
-                <w:rFonts w:ascii="Calibri" w:eastAsia="Calibri" w:hAnsi="Calibri" w:cs="Calibri"/>
-              </w:rPr>
-              <w:t>endfor</w:t>
-            </w:r>
-            <w:proofErr w:type="spellEnd"/>
-            <w:r>
-              <w:rPr>
-                <w:rFonts w:ascii="Calibri" w:eastAsia="Calibri" w:hAnsi="Calibri" w:cs="Calibri"/>
-              </w:rPr>
-              <w:t xml:space="preserve"> %}</w:t>
+              <w:t>{%tr endfor %}</w:t>
             </w:r>
           </w:p>
         </w:tc>
@@ -3304,14 +2725,13 @@
         <w:tblLook w:val="0400" w:firstRow="0" w:lastRow="0" w:firstColumn="0" w:lastColumn="0" w:noHBand="0" w:noVBand="1"/>
       </w:tblPr>
       <w:tblGrid>
-        <w:gridCol w:w="3261"/>
-        <w:gridCol w:w="5817"/>
-        <w:gridCol w:w="1559"/>
+        <w:gridCol w:w="9498"/>
+        <w:gridCol w:w="1139"/>
       </w:tblGrid>
       <w:tr>
         <w:tc>
           <w:tcPr>
-            <w:tcW w:w="3261" w:type="dxa"/>
+            <w:tcW w:w="9498" w:type="dxa"/>
             <w:shd w:val="clear" w:color="auto" w:fill="D9D9D9"/>
           </w:tcPr>
           <w:p>
@@ -3322,6 +2742,7 @@
                 <w:rFonts w:ascii="Calibri" w:eastAsia="Calibri" w:hAnsi="Calibri" w:cs="Calibri"/>
                 <w:b/>
                 <w:bCs/>
+                <w:lang w:val="pt-BR"/>
               </w:rPr>
             </w:pPr>
             <w:r>
@@ -3329,39 +2750,15 @@
                 <w:rFonts w:ascii="Calibri" w:eastAsia="Calibri" w:hAnsi="Calibri" w:cs="Calibri"/>
                 <w:b/>
                 <w:bCs/>
-              </w:rPr>
-              <w:t>TOXINAS DETECTADAS</w:t>
+                <w:lang w:val="pt-BR"/>
+              </w:rPr>
+              <w:t>TOXINAS E POSSÍVEIS SINTOMAS NO ORGANISMO</w:t>
             </w:r>
           </w:p>
         </w:tc>
         <w:tc>
           <w:tcPr>
-            <w:tcW w:w="5817" w:type="dxa"/>
-            <w:shd w:val="clear" w:color="auto" w:fill="D9D9D9"/>
-          </w:tcPr>
-          <w:p>
-            <w:pPr>
-              <w:spacing w:after="0" w:line="240" w:lineRule="auto"/>
-              <w:jc w:val="center"/>
-              <w:rPr>
-                <w:rFonts w:ascii="Calibri" w:eastAsia="Calibri" w:hAnsi="Calibri" w:cs="Calibri"/>
-                <w:b/>
-                <w:bCs/>
-              </w:rPr>
-            </w:pPr>
-            <w:r>
-              <w:rPr>
-                <w:rFonts w:ascii="Calibri" w:eastAsia="Calibri" w:hAnsi="Calibri" w:cs="Calibri"/>
-                <w:b/>
-                <w:bCs/>
-              </w:rPr>
-              <w:t>SINTOMAS COMUNS DA INTOXICAÇÃO</w:t>
-            </w:r>
-          </w:p>
-        </w:tc>
-        <w:tc>
-          <w:tcPr>
-            <w:tcW w:w="1559" w:type="dxa"/>
+            <w:tcW w:w="1139" w:type="dxa"/>
             <w:shd w:val="clear" w:color="auto" w:fill="D9D9D9"/>
           </w:tcPr>
           <w:p>
@@ -3389,7 +2786,7 @@
         <w:tc>
           <w:tcPr>
             <w:tcW w:w="10637" w:type="dxa"/>
-            <w:gridSpan w:val="3"/>
+            <w:gridSpan w:val="2"/>
           </w:tcPr>
           <w:p>
             <w:pPr>
@@ -3402,28 +2799,8 @@
             <w:r>
               <w:rPr>
                 <w:rFonts w:ascii="Calibri" w:eastAsia="Calibri" w:hAnsi="Calibri" w:cs="Calibri"/>
-                <w:b/>
-                <w:bCs/>
-              </w:rPr>
-              <w:t xml:space="preserve">{%tr for item in </w:t>
-            </w:r>
-            <w:proofErr w:type="spellStart"/>
-            <w:r>
-              <w:rPr>
-                <w:rFonts w:ascii="Calibri" w:eastAsia="Calibri" w:hAnsi="Calibri" w:cs="Calibri"/>
-                <w:b/>
-                <w:bCs/>
-              </w:rPr>
-              <w:t>table_toxins</w:t>
-            </w:r>
-            <w:proofErr w:type="spellEnd"/>
-            <w:r>
-              <w:rPr>
-                <w:rFonts w:ascii="Calibri" w:eastAsia="Calibri" w:hAnsi="Calibri" w:cs="Calibri"/>
-                <w:b/>
-                <w:bCs/>
-              </w:rPr>
-              <w:t>%}</w:t>
+              </w:rPr>
+              <w:t>{%tr for item in table_toxins%}</w:t>
             </w:r>
           </w:p>
         </w:tc>
@@ -3431,79 +2808,58 @@
       <w:tr>
         <w:tc>
           <w:tcPr>
-            <w:tcW w:w="3261" w:type="dxa"/>
+            <w:tcW w:w="9498" w:type="dxa"/>
           </w:tcPr>
           <w:p>
             <w:pPr>
               <w:spacing w:after="0" w:line="240" w:lineRule="auto"/>
               <w:rPr>
                 <w:rFonts w:ascii="Calibri" w:eastAsia="Calibri" w:hAnsi="Calibri" w:cs="Calibri"/>
+                <w:b/>
+                <w:bCs/>
               </w:rPr>
             </w:pPr>
             <w:r>
               <w:rPr>
                 <w:rFonts w:ascii="Calibri" w:eastAsia="Calibri" w:hAnsi="Calibri" w:cs="Calibri"/>
-              </w:rPr>
-              <w:t>{{</w:t>
-            </w:r>
-            <w:proofErr w:type="spellStart"/>
-            <w:r>
-              <w:rPr>
-                <w:rFonts w:ascii="Calibri" w:eastAsia="Calibri" w:hAnsi="Calibri" w:cs="Calibri"/>
-              </w:rPr>
-              <w:t>item</w:t>
+                <w:b/>
+                <w:bCs/>
+              </w:rPr>
+              <w:t>{{item.nome}}</w:t>
             </w:r>
             <w:r>
               <w:rPr>
                 <w:rFonts w:ascii="Calibri" w:eastAsia="Calibri" w:hAnsi="Calibri" w:cs="Calibri"/>
-              </w:rPr>
-              <w:t>.nome</w:t>
+                <w:b/>
+                <w:bCs/>
+              </w:rPr>
+              <w:t xml:space="preserve"> </w:t>
             </w:r>
-            <w:proofErr w:type="spellEnd"/>
             <w:r>
               <w:rPr>
                 <w:rFonts w:ascii="Calibri" w:eastAsia="Calibri" w:hAnsi="Calibri" w:cs="Calibri"/>
-              </w:rPr>
-              <w:t>}}</w:t>
+                <w:lang w:val="pt-BR"/>
+              </w:rPr>
+              <w:t>–</w:t>
+            </w:r>
+            <w:r>
+              <w:rPr>
+                <w:rFonts w:ascii="Calibri" w:eastAsia="Calibri" w:hAnsi="Calibri" w:cs="Calibri"/>
+                <w:lang w:val="pt-BR"/>
+              </w:rPr>
+              <w:t xml:space="preserve"> </w:t>
+            </w:r>
+            <w:r>
+              <w:rPr>
+                <w:rFonts w:ascii="Calibri" w:eastAsia="Calibri" w:hAnsi="Calibri" w:cs="Calibri"/>
+              </w:rPr>
+              <w:t>{{item.efeitos}}</w:t>
             </w:r>
           </w:p>
         </w:tc>
         <w:tc>
           <w:tcPr>
-            <w:tcW w:w="5817" w:type="dxa"/>
-          </w:tcPr>
-          <w:p>
-            <w:pPr>
-              <w:spacing w:after="0" w:line="240" w:lineRule="auto"/>
-              <w:rPr>
-                <w:rFonts w:ascii="Calibri" w:eastAsia="Calibri" w:hAnsi="Calibri" w:cs="Calibri"/>
-              </w:rPr>
-            </w:pPr>
-            <w:r>
-              <w:rPr>
-                <w:rFonts w:ascii="Calibri" w:eastAsia="Calibri" w:hAnsi="Calibri" w:cs="Calibri"/>
-              </w:rPr>
-              <w:t>{{</w:t>
-            </w:r>
-            <w:proofErr w:type="spellStart"/>
-            <w:r>
-              <w:rPr>
-                <w:rFonts w:ascii="Calibri" w:eastAsia="Calibri" w:hAnsi="Calibri" w:cs="Calibri"/>
-              </w:rPr>
-              <w:t>item.efeitos</w:t>
-            </w:r>
-            <w:proofErr w:type="spellEnd"/>
-            <w:r>
-              <w:rPr>
-                <w:rFonts w:ascii="Calibri" w:eastAsia="Calibri" w:hAnsi="Calibri" w:cs="Calibri"/>
-              </w:rPr>
-              <w:t>}}</w:t>
-            </w:r>
-          </w:p>
-        </w:tc>
-        <w:tc>
-          <w:tcPr>
-            <w:tcW w:w="1559" w:type="dxa"/>
+            <w:tcW w:w="1139" w:type="dxa"/>
           </w:tcPr>
           <w:p>
             <w:pPr>
@@ -3517,21 +2873,7 @@
               <w:rPr>
                 <w:rFonts w:ascii="Calibri" w:eastAsia="Calibri" w:hAnsi="Calibri" w:cs="Calibri"/>
               </w:rPr>
-              <w:t>{{</w:t>
-            </w:r>
-            <w:proofErr w:type="spellStart"/>
-            <w:r>
-              <w:rPr>
-                <w:rFonts w:ascii="Calibri" w:eastAsia="Calibri" w:hAnsi="Calibri" w:cs="Calibri"/>
-              </w:rPr>
-              <w:t>item.D</w:t>
-            </w:r>
-            <w:proofErr w:type="spellEnd"/>
-            <w:r>
-              <w:rPr>
-                <w:rFonts w:ascii="Calibri" w:eastAsia="Calibri" w:hAnsi="Calibri" w:cs="Calibri"/>
-              </w:rPr>
-              <w:t>}}</w:t>
+              <w:t>{{item.D}}</w:t>
             </w:r>
           </w:p>
         </w:tc>
@@ -3540,7 +2882,7 @@
         <w:tc>
           <w:tcPr>
             <w:tcW w:w="10637" w:type="dxa"/>
-            <w:gridSpan w:val="3"/>
+            <w:gridSpan w:val="2"/>
           </w:tcPr>
           <w:p>
             <w:pPr>
@@ -3553,21 +2895,7 @@
               <w:rPr>
                 <w:rFonts w:ascii="Calibri" w:eastAsia="Calibri" w:hAnsi="Calibri" w:cs="Calibri"/>
               </w:rPr>
-              <w:t xml:space="preserve">{%tr </w:t>
-            </w:r>
-            <w:proofErr w:type="spellStart"/>
-            <w:r>
-              <w:rPr>
-                <w:rFonts w:ascii="Calibri" w:eastAsia="Calibri" w:hAnsi="Calibri" w:cs="Calibri"/>
-              </w:rPr>
-              <w:t>endfor</w:t>
-            </w:r>
-            <w:proofErr w:type="spellEnd"/>
-            <w:r>
-              <w:rPr>
-                <w:rFonts w:ascii="Calibri" w:eastAsia="Calibri" w:hAnsi="Calibri" w:cs="Calibri"/>
-              </w:rPr>
-              <w:t xml:space="preserve"> %}</w:t>
+              <w:t>{%tr endfor %}</w:t>
             </w:r>
           </w:p>
         </w:tc>
@@ -3697,21 +3025,7 @@
               <w:rPr>
                 <w:rFonts w:ascii="Calibri" w:eastAsia="Calibri" w:hAnsi="Calibri" w:cs="Calibri"/>
               </w:rPr>
-              <w:t xml:space="preserve">{%tr for k, v in </w:t>
-            </w:r>
-            <w:proofErr w:type="spellStart"/>
-            <w:r>
-              <w:rPr>
-                <w:rFonts w:ascii="Calibri" w:eastAsia="Calibri" w:hAnsi="Calibri" w:cs="Calibri"/>
-              </w:rPr>
-              <w:t>table_food.items</w:t>
-            </w:r>
-            <w:proofErr w:type="spellEnd"/>
-            <w:r>
-              <w:rPr>
-                <w:rFonts w:ascii="Calibri" w:eastAsia="Calibri" w:hAnsi="Calibri" w:cs="Calibri"/>
-              </w:rPr>
-              <w:t>()%}</w:t>
+              <w:t>{%tr for k, v in table_food.items()%}</w:t>
             </w:r>
           </w:p>
         </w:tc>
@@ -3813,14 +3127,7 @@
               <w:rPr>
                 <w:rFonts w:ascii="Calibri" w:eastAsia="Calibri" w:hAnsi="Calibri" w:cs="Calibri"/>
               </w:rPr>
-              <w:t xml:space="preserve"> </w:t>
-            </w:r>
-            <w:proofErr w:type="spellStart"/>
-            <w:r>
-              <w:rPr>
-                <w:rFonts w:ascii="Calibri" w:eastAsia="Calibri" w:hAnsi="Calibri" w:cs="Calibri"/>
-              </w:rPr>
-              <w:t>end</w:t>
+              <w:t xml:space="preserve"> end</w:t>
             </w:r>
             <w:r>
               <w:rPr>
@@ -3832,14 +3139,7 @@
               <w:rPr>
                 <w:rFonts w:ascii="Calibri" w:eastAsia="Calibri" w:hAnsi="Calibri" w:cs="Calibri"/>
               </w:rPr>
-              <w:t>or</w:t>
-            </w:r>
-            <w:proofErr w:type="spellEnd"/>
-            <w:r>
-              <w:rPr>
-                <w:rFonts w:ascii="Calibri" w:eastAsia="Calibri" w:hAnsi="Calibri" w:cs="Calibri"/>
-              </w:rPr>
-              <w:t xml:space="preserve"> %}</w:t>
+              <w:t>or %}</w:t>
             </w:r>
           </w:p>
         </w:tc>
@@ -3856,6 +3156,98 @@
         </w:rPr>
       </w:pPr>
     </w:p>
+    <w:tbl>
+      <w:tblPr>
+        <w:tblStyle w:val="affffffff6"/>
+        <w:tblpPr w:leftFromText="141" w:rightFromText="141" w:vertAnchor="text" w:horzAnchor="margin" w:tblpX="-147" w:tblpY="-34"/>
+        <w:tblW w:w="10632" w:type="dxa"/>
+        <w:tblInd w:w="0" w:type="dxa"/>
+        <w:tblBorders>
+          <w:top w:val="single" w:sz="4" w:space="0" w:color="000000"/>
+          <w:left w:val="single" w:sz="4" w:space="0" w:color="000000"/>
+          <w:bottom w:val="single" w:sz="4" w:space="0" w:color="000000"/>
+          <w:right w:val="single" w:sz="4" w:space="0" w:color="000000"/>
+          <w:insideH w:val="single" w:sz="4" w:space="0" w:color="000000"/>
+          <w:insideV w:val="single" w:sz="4" w:space="0" w:color="000000"/>
+        </w:tblBorders>
+        <w:tblLayout w:type="fixed"/>
+        <w:tblLook w:val="0400" w:firstRow="0" w:lastRow="0" w:firstColumn="0" w:lastColumn="0" w:noHBand="0" w:noVBand="1"/>
+      </w:tblPr>
+      <w:tblGrid>
+        <w:gridCol w:w="10632"/>
+      </w:tblGrid>
+      <w:tr>
+        <w:trPr>
+          <w:trHeight w:val="170"/>
+        </w:trPr>
+        <w:tc>
+          <w:tcPr>
+            <w:tcW w:w="10632" w:type="dxa"/>
+            <w:shd w:val="clear" w:color="auto" w:fill="D9D9D9"/>
+            <w:vAlign w:val="center"/>
+          </w:tcPr>
+          <w:p>
+            <w:pPr>
+              <w:jc w:val="center"/>
+              <w:rPr>
+                <w:rFonts w:ascii="Calibri" w:eastAsia="Calibri" w:hAnsi="Calibri" w:cs="Calibri"/>
+                <w:b/>
+                <w:bCs/>
+                <w:color w:val="505050"/>
+                <w:lang w:val="pt-BR"/>
+              </w:rPr>
+            </w:pPr>
+            <w:r>
+              <w:rPr>
+                <w:rFonts w:ascii="Calibri" w:eastAsia="Calibri" w:hAnsi="Calibri" w:cs="Calibri"/>
+                <w:b/>
+                <w:bCs/>
+                <w:color w:val="505050"/>
+                <w:lang w:val="pt-BR"/>
+              </w:rPr>
+              <w:lastRenderedPageBreak/>
+              <w:t>OUTROS PRODUTOS QUE RECOMENDAMOS NÃO CONSUMIR</w:t>
+            </w:r>
+          </w:p>
+        </w:tc>
+      </w:tr>
+      <w:tr>
+        <w:tc>
+          <w:tcPr>
+            <w:tcW w:w="10632" w:type="dxa"/>
+          </w:tcPr>
+          <w:p>
+            <w:pPr>
+              <w:rPr>
+                <w:rFonts w:ascii="Calibri" w:eastAsia="Calibri" w:hAnsi="Calibri" w:cs="Calibri"/>
+                <w:lang w:val="pt-BR"/>
+              </w:rPr>
+            </w:pPr>
+            <w:r>
+              <w:rPr>
+                <w:rFonts w:ascii="Calibri" w:eastAsia="Calibri" w:hAnsi="Calibri" w:cs="Calibri"/>
+                <w:lang w:val="pt-BR"/>
+              </w:rPr>
+              <w:t>Açúcar, adoçantes, leite de vaca, creme de leite, queijo do tipo frescal, alimentos ultraprocessados, salgadinhos, embutidos, frituras, corantes artificiais, espinafre,</w:t>
+            </w:r>
+            <w:r>
+              <w:rPr>
+                <w:rFonts w:ascii="Calibri" w:eastAsia="Calibri" w:hAnsi="Calibri" w:cs="Calibri"/>
+                <w:lang w:val="pt-BR"/>
+              </w:rPr>
+              <w:t xml:space="preserve"> bebidas destiladas,</w:t>
+            </w:r>
+            <w:r>
+              <w:rPr>
+                <w:rFonts w:ascii="Calibri" w:eastAsia="Calibri" w:hAnsi="Calibri" w:cs="Calibri"/>
+                <w:lang w:val="pt-BR"/>
+              </w:rPr>
+              <w:t xml:space="preserve"> óleos vegetais (com exceção de azeite de oliva e óleo de coco), farinhas refinadas, sal refinado (trocar por sal marinho).</w:t>
+            </w:r>
+          </w:p>
+        </w:tc>
+      </w:tr>
+    </w:tbl>
     <w:p>
       <w:pPr>
         <w:widowControl w:val="0"/>
@@ -3864,6 +3256,7 @@
           <w:rFonts w:ascii="Calibri" w:eastAsia="Calibri" w:hAnsi="Calibri" w:cs="Calibri"/>
           <w:sz w:val="12"/>
           <w:szCs w:val="12"/>
+          <w:lang w:val="pt-BR"/>
         </w:rPr>
       </w:pPr>
     </w:p>
@@ -3988,27 +3381,7 @@
               <w:rPr>
                 <w:rFonts w:ascii="Calibri" w:eastAsia="Calibri" w:hAnsi="Calibri" w:cs="Calibri"/>
               </w:rPr>
-              <w:t xml:space="preserve">{%tr for k, v in </w:t>
-            </w:r>
-            <w:proofErr w:type="spellStart"/>
-            <w:r>
-              <w:rPr>
-                <w:rFonts w:ascii="Calibri" w:eastAsia="Calibri" w:hAnsi="Calibri" w:cs="Calibri"/>
-              </w:rPr>
-              <w:t>table_emotions</w:t>
-            </w:r>
-            <w:r>
-              <w:rPr>
-                <w:rFonts w:ascii="Calibri" w:eastAsia="Calibri" w:hAnsi="Calibri" w:cs="Calibri"/>
-              </w:rPr>
-              <w:t>.items</w:t>
-            </w:r>
-            <w:proofErr w:type="spellEnd"/>
-            <w:r>
-              <w:rPr>
-                <w:rFonts w:ascii="Calibri" w:eastAsia="Calibri" w:hAnsi="Calibri" w:cs="Calibri"/>
-              </w:rPr>
-              <w:t>()%}</w:t>
+              <w:t>{%tr for k, v in table_emotions.items()%}</w:t>
             </w:r>
           </w:p>
         </w:tc>
@@ -4092,21 +3465,7 @@
               <w:rPr>
                 <w:rFonts w:ascii="Calibri" w:eastAsia="Calibri" w:hAnsi="Calibri" w:cs="Calibri"/>
               </w:rPr>
-              <w:t xml:space="preserve">{%tr </w:t>
-            </w:r>
-            <w:proofErr w:type="spellStart"/>
-            <w:r>
-              <w:rPr>
-                <w:rFonts w:ascii="Calibri" w:eastAsia="Calibri" w:hAnsi="Calibri" w:cs="Calibri"/>
-              </w:rPr>
-              <w:t>endfor</w:t>
-            </w:r>
-            <w:proofErr w:type="spellEnd"/>
-            <w:r>
-              <w:rPr>
-                <w:rFonts w:ascii="Calibri" w:eastAsia="Calibri" w:hAnsi="Calibri" w:cs="Calibri"/>
-              </w:rPr>
-              <w:t xml:space="preserve"> %}</w:t>
+              <w:t>{%tr endfor %}</w:t>
             </w:r>
           </w:p>
         </w:tc>
@@ -4202,96 +3561,6 @@
         </w:rPr>
       </w:pPr>
     </w:p>
-    <w:tbl>
-      <w:tblPr>
-        <w:tblStyle w:val="affffffff6"/>
-        <w:tblW w:w="10632" w:type="dxa"/>
-        <w:tblInd w:w="-572" w:type="dxa"/>
-        <w:tblBorders>
-          <w:top w:val="single" w:sz="4" w:space="0" w:color="000000"/>
-          <w:left w:val="single" w:sz="4" w:space="0" w:color="000000"/>
-          <w:bottom w:val="single" w:sz="4" w:space="0" w:color="000000"/>
-          <w:right w:val="single" w:sz="4" w:space="0" w:color="000000"/>
-          <w:insideH w:val="single" w:sz="4" w:space="0" w:color="000000"/>
-          <w:insideV w:val="single" w:sz="4" w:space="0" w:color="000000"/>
-        </w:tblBorders>
-        <w:tblLayout w:type="fixed"/>
-        <w:tblLook w:val="0400" w:firstRow="0" w:lastRow="0" w:firstColumn="0" w:lastColumn="0" w:noHBand="0" w:noVBand="1"/>
-      </w:tblPr>
-      <w:tblGrid>
-        <w:gridCol w:w="10632"/>
-      </w:tblGrid>
-      <w:tr>
-        <w:trPr>
-          <w:trHeight w:val="170"/>
-        </w:trPr>
-        <w:tc>
-          <w:tcPr>
-            <w:tcW w:w="10632" w:type="dxa"/>
-            <w:shd w:val="clear" w:color="auto" w:fill="D9D9D9"/>
-            <w:vAlign w:val="center"/>
-          </w:tcPr>
-          <w:p>
-            <w:pPr>
-              <w:jc w:val="center"/>
-              <w:rPr>
-                <w:rFonts w:ascii="Calibri" w:eastAsia="Calibri" w:hAnsi="Calibri" w:cs="Calibri"/>
-                <w:b/>
-                <w:bCs/>
-                <w:color w:val="505050"/>
-                <w:lang w:val="pt-BR"/>
-              </w:rPr>
-            </w:pPr>
-            <w:r>
-              <w:rPr>
-                <w:rFonts w:ascii="Calibri" w:eastAsia="Calibri" w:hAnsi="Calibri" w:cs="Calibri"/>
-                <w:b/>
-                <w:bCs/>
-                <w:color w:val="505050"/>
-                <w:lang w:val="pt-BR"/>
-              </w:rPr>
-              <w:t>OUTROS PRODUTOS QUE RECOMENDAMOS NÃO CONSUMIR</w:t>
-            </w:r>
-          </w:p>
-        </w:tc>
-      </w:tr>
-      <w:tr>
-        <w:tc>
-          <w:tcPr>
-            <w:tcW w:w="10632" w:type="dxa"/>
-          </w:tcPr>
-          <w:p>
-            <w:pPr>
-              <w:rPr>
-                <w:rFonts w:ascii="Calibri" w:eastAsia="Calibri" w:hAnsi="Calibri" w:cs="Calibri"/>
-                <w:lang w:val="pt-BR"/>
-              </w:rPr>
-            </w:pPr>
-            <w:r>
-              <w:rPr>
-                <w:rFonts w:ascii="Calibri" w:eastAsia="Calibri" w:hAnsi="Calibri" w:cs="Calibri"/>
-                <w:lang w:val="pt-BR"/>
-              </w:rPr>
-              <w:t>Açúcar, adoçantes, leite de vaca, creme de leite, queijo do tipo frescal, alimentos ultraprocessados, salgadinhos, embutidos, frituras, corantes artificiais, espinafre,</w:t>
-            </w:r>
-            <w:r>
-              <w:rPr>
-                <w:rFonts w:ascii="Calibri" w:eastAsia="Calibri" w:hAnsi="Calibri" w:cs="Calibri"/>
-                <w:lang w:val="pt-BR"/>
-              </w:rPr>
-              <w:t xml:space="preserve"> bebidas destiladas,</w:t>
-            </w:r>
-            <w:r>
-              <w:rPr>
-                <w:rFonts w:ascii="Calibri" w:eastAsia="Calibri" w:hAnsi="Calibri" w:cs="Calibri"/>
-                <w:lang w:val="pt-BR"/>
-              </w:rPr>
-              <w:t xml:space="preserve"> óleos vegetais (com exceção de azeite de oliva e óleo de coco), farinhas refinadas, sal refinado (trocar por sal marinho).</w:t>
-            </w:r>
-          </w:p>
-        </w:tc>
-      </w:tr>
-    </w:tbl>
     <w:p>
       <w:pPr>
         <w:widowControl w:val="0"/>
@@ -4477,21 +3746,7 @@
               <w:rPr>
                 <w:rFonts w:ascii="Calibri" w:eastAsia="Calibri" w:hAnsi="Calibri" w:cs="Calibri"/>
               </w:rPr>
-              <w:t xml:space="preserve">{%tr for item in </w:t>
-            </w:r>
-            <w:proofErr w:type="spellStart"/>
-            <w:r>
-              <w:rPr>
-                <w:rFonts w:ascii="Calibri" w:eastAsia="Calibri" w:hAnsi="Calibri" w:cs="Calibri"/>
-              </w:rPr>
-              <w:t>table_crystals</w:t>
-            </w:r>
-            <w:proofErr w:type="spellEnd"/>
-            <w:r>
-              <w:rPr>
-                <w:rFonts w:ascii="Calibri" w:eastAsia="Calibri" w:hAnsi="Calibri" w:cs="Calibri"/>
-              </w:rPr>
-              <w:t>%}</w:t>
+              <w:t>{%tr for item in table_crystals%}</w:t>
             </w:r>
           </w:p>
         </w:tc>
@@ -4517,21 +3772,7 @@
               <w:rPr>
                 <w:rFonts w:ascii="Calibri" w:eastAsia="Calibri" w:hAnsi="Calibri" w:cs="Calibri"/>
               </w:rPr>
-              <w:t>{{</w:t>
-            </w:r>
-            <w:proofErr w:type="spellStart"/>
-            <w:r>
-              <w:rPr>
-                <w:rFonts w:ascii="Calibri" w:eastAsia="Calibri" w:hAnsi="Calibri" w:cs="Calibri"/>
-              </w:rPr>
-              <w:t>item.cristal</w:t>
-            </w:r>
-            <w:proofErr w:type="spellEnd"/>
-            <w:r>
-              <w:rPr>
-                <w:rFonts w:ascii="Calibri" w:eastAsia="Calibri" w:hAnsi="Calibri" w:cs="Calibri"/>
-              </w:rPr>
-              <w:t>}}</w:t>
+              <w:t>{{item.cristal}}</w:t>
             </w:r>
           </w:p>
         </w:tc>
@@ -4557,23 +3798,7 @@
                 <w:rFonts w:ascii="Calibri" w:eastAsia="Calibri" w:hAnsi="Calibri" w:cs="Calibri"/>
                 <w:lang w:val="pt-BR"/>
               </w:rPr>
-              <w:t>{{</w:t>
-            </w:r>
-            <w:proofErr w:type="spellStart"/>
-            <w:r>
-              <w:rPr>
-                <w:rFonts w:ascii="Calibri" w:eastAsia="Calibri" w:hAnsi="Calibri" w:cs="Calibri"/>
-                <w:lang w:val="pt-BR"/>
-              </w:rPr>
-              <w:t>item.beneficios_fisicos</w:t>
-            </w:r>
-            <w:proofErr w:type="spellEnd"/>
-            <w:r>
-              <w:rPr>
-                <w:rFonts w:ascii="Calibri" w:eastAsia="Calibri" w:hAnsi="Calibri" w:cs="Calibri"/>
-                <w:lang w:val="pt-BR"/>
-              </w:rPr>
-              <w:t>}}</w:t>
+              <w:t>{{item.beneficios_fisicos}}</w:t>
             </w:r>
           </w:p>
         </w:tc>
@@ -4599,23 +3824,7 @@
                 <w:rFonts w:ascii="Calibri" w:eastAsia="Calibri" w:hAnsi="Calibri" w:cs="Calibri"/>
                 <w:lang w:val="pt-BR"/>
               </w:rPr>
-              <w:t>{{</w:t>
-            </w:r>
-            <w:proofErr w:type="spellStart"/>
-            <w:r>
-              <w:rPr>
-                <w:rFonts w:ascii="Calibri" w:eastAsia="Calibri" w:hAnsi="Calibri" w:cs="Calibri"/>
-                <w:lang w:val="pt-BR"/>
-              </w:rPr>
-              <w:t>item.beneficios_emocionais</w:t>
-            </w:r>
-            <w:proofErr w:type="spellEnd"/>
-            <w:r>
-              <w:rPr>
-                <w:rFonts w:ascii="Calibri" w:eastAsia="Calibri" w:hAnsi="Calibri" w:cs="Calibri"/>
-                <w:lang w:val="pt-BR"/>
-              </w:rPr>
-              <w:t>}}</w:t>
+              <w:t>{{item.beneficios_emocionais}}</w:t>
             </w:r>
           </w:p>
         </w:tc>
@@ -4640,21 +3849,7 @@
               <w:rPr>
                 <w:rFonts w:ascii="Calibri" w:eastAsia="Calibri" w:hAnsi="Calibri" w:cs="Calibri"/>
               </w:rPr>
-              <w:t>{{</w:t>
-            </w:r>
-            <w:proofErr w:type="spellStart"/>
-            <w:r>
-              <w:rPr>
-                <w:rFonts w:ascii="Calibri" w:eastAsia="Calibri" w:hAnsi="Calibri" w:cs="Calibri"/>
-              </w:rPr>
-              <w:t>item.D</w:t>
-            </w:r>
-            <w:proofErr w:type="spellEnd"/>
-            <w:r>
-              <w:rPr>
-                <w:rFonts w:ascii="Calibri" w:eastAsia="Calibri" w:hAnsi="Calibri" w:cs="Calibri"/>
-              </w:rPr>
-              <w:t>}}</w:t>
+              <w:t>{{item.D}}</w:t>
             </w:r>
           </w:p>
         </w:tc>
@@ -4681,21 +3876,7 @@
               <w:rPr>
                 <w:rFonts w:ascii="Calibri" w:eastAsia="Calibri" w:hAnsi="Calibri" w:cs="Calibri"/>
               </w:rPr>
-              <w:t xml:space="preserve">{%tr </w:t>
-            </w:r>
-            <w:proofErr w:type="spellStart"/>
-            <w:r>
-              <w:rPr>
-                <w:rFonts w:ascii="Calibri" w:eastAsia="Calibri" w:hAnsi="Calibri" w:cs="Calibri"/>
-              </w:rPr>
-              <w:t>endfor</w:t>
-            </w:r>
-            <w:proofErr w:type="spellEnd"/>
-            <w:r>
-              <w:rPr>
-                <w:rFonts w:ascii="Calibri" w:eastAsia="Calibri" w:hAnsi="Calibri" w:cs="Calibri"/>
-              </w:rPr>
-              <w:t>%}</w:t>
+              <w:t>{%tr endfor%}</w:t>
             </w:r>
           </w:p>
         </w:tc>
@@ -4780,7 +3961,6 @@
         </w:rPr>
         <w:br/>
       </w:r>
-      <w:proofErr w:type="spellStart"/>
       <w:r>
         <w:rPr>
           <w:rFonts w:ascii="Calibri" w:eastAsia="Calibri" w:hAnsi="Calibri" w:cs="Calibri"/>
@@ -4788,17 +3968,7 @@
           <w:bCs/>
           <w:lang w:val="pt-BR"/>
         </w:rPr>
-        <w:t>Bienestar</w:t>
-      </w:r>
-      <w:proofErr w:type="spellEnd"/>
-      <w:r>
-        <w:rPr>
-          <w:rFonts w:ascii="Calibri" w:eastAsia="Calibri" w:hAnsi="Calibri" w:cs="Calibri"/>
-          <w:b/>
-          <w:bCs/>
-          <w:lang w:val="pt-BR"/>
-        </w:rPr>
-        <w:t xml:space="preserve"> - Terapias Biofísicas</w:t>
+        <w:t>Bienestar - Terapias Biofísicas</w:t>
       </w:r>
       <w:r>
         <w:rPr>
@@ -6072,7 +5242,6 @@
   <w:style w:type="character" w:default="1" w:styleId="Fontepargpadro">
     <w:name w:val="Default Paragraph Font"/>
     <w:uiPriority w:val="1"/>
-    <w:semiHidden/>
     <w:unhideWhenUsed/>
   </w:style>
   <w:style w:type="table" w:default="1" w:styleId="Tabelanormal">

</xml_diff>

<commit_message>
Inserção de patologias e ajuste nas tabelas anteriores
</commit_message>
<xml_diff>
--- a/src/assets/report/template_provisorio.docx
+++ b/src/assets/report/template_provisorio.docx
@@ -2170,6 +2170,15 @@
           <w:bCs/>
         </w:rPr>
       </w:pPr>
+    </w:p>
+    <w:p>
+      <w:pPr>
+        <w:rPr>
+          <w:rFonts w:ascii="Calibri" w:eastAsia="Calibri" w:hAnsi="Calibri" w:cs="Calibri"/>
+          <w:b/>
+          <w:bCs/>
+        </w:rPr>
+      </w:pPr>
       <w:r>
         <w:rPr>
           <w:rFonts w:ascii="Calibri" w:eastAsia="Calibri" w:hAnsi="Calibri" w:cs="Calibri"/>
@@ -2178,6 +2187,247 @@
         </w:rPr>
         <w:t>4. RESULTADOS DAS ANÁLISES</w:t>
       </w:r>
+    </w:p>
+    <w:tbl>
+      <w:tblPr>
+        <w:tblStyle w:val="affffffff5"/>
+        <w:tblpPr w:leftFromText="141" w:rightFromText="141" w:vertAnchor="text" w:horzAnchor="margin" w:tblpX="-147" w:tblpY="195"/>
+        <w:tblW w:w="10627" w:type="dxa"/>
+        <w:tblInd w:w="0" w:type="dxa"/>
+        <w:tblBorders>
+          <w:top w:val="single" w:sz="4" w:space="0" w:color="000000"/>
+          <w:left w:val="single" w:sz="4" w:space="0" w:color="000000"/>
+          <w:bottom w:val="single" w:sz="4" w:space="0" w:color="000000"/>
+          <w:right w:val="single" w:sz="4" w:space="0" w:color="000000"/>
+          <w:insideH w:val="single" w:sz="4" w:space="0" w:color="000000"/>
+          <w:insideV w:val="single" w:sz="4" w:space="0" w:color="000000"/>
+        </w:tblBorders>
+        <w:tblLayout w:type="fixed"/>
+        <w:tblLook w:val="0400" w:firstRow="0" w:lastRow="0" w:firstColumn="0" w:lastColumn="0" w:noHBand="0" w:noVBand="1"/>
+      </w:tblPr>
+      <w:tblGrid>
+        <w:gridCol w:w="9220"/>
+        <w:gridCol w:w="1407"/>
+      </w:tblGrid>
+      <w:tr>
+        <w:trPr>
+          <w:tblHeader/>
+        </w:trPr>
+        <w:tc>
+          <w:tcPr>
+            <w:tcW w:w="9220" w:type="dxa"/>
+            <w:tcBorders>
+              <w:top w:val="single" w:sz="4" w:space="0" w:color="000000"/>
+              <w:left w:val="single" w:sz="4" w:space="0" w:color="000000"/>
+              <w:bottom w:val="single" w:sz="4" w:space="0" w:color="000000"/>
+              <w:right w:val="single" w:sz="4" w:space="0" w:color="000000"/>
+            </w:tcBorders>
+            <w:shd w:val="clear" w:color="auto" w:fill="D9D9D9"/>
+          </w:tcPr>
+          <w:p>
+            <w:pPr>
+              <w:widowControl w:val="0"/>
+              <w:spacing w:line="276" w:lineRule="auto"/>
+              <w:jc w:val="center"/>
+              <w:rPr>
+                <w:rFonts w:ascii="Calibri" w:eastAsia="Calibri" w:hAnsi="Calibri" w:cs="Calibri"/>
+                <w:b/>
+                <w:bCs/>
+              </w:rPr>
+            </w:pPr>
+            <w:r>
+              <w:rPr>
+                <w:rFonts w:ascii="Calibri" w:eastAsia="Calibri" w:hAnsi="Calibri" w:cs="Calibri"/>
+                <w:b/>
+                <w:bCs/>
+              </w:rPr>
+              <w:t>PATOLOGIAS</w:t>
+            </w:r>
+          </w:p>
+        </w:tc>
+        <w:tc>
+          <w:tcPr>
+            <w:tcW w:w="1407" w:type="dxa"/>
+            <w:tcBorders>
+              <w:top w:val="single" w:sz="4" w:space="0" w:color="000000"/>
+              <w:left w:val="single" w:sz="4" w:space="0" w:color="000000"/>
+              <w:bottom w:val="single" w:sz="4" w:space="0" w:color="000000"/>
+              <w:right w:val="single" w:sz="4" w:space="0" w:color="000000"/>
+            </w:tcBorders>
+            <w:shd w:val="clear" w:color="auto" w:fill="D9D9D9"/>
+          </w:tcPr>
+          <w:p>
+            <w:pPr>
+              <w:widowControl w:val="0"/>
+              <w:spacing w:line="276" w:lineRule="auto"/>
+              <w:jc w:val="center"/>
+              <w:rPr>
+                <w:rFonts w:ascii="Calibri" w:eastAsia="Calibri" w:hAnsi="Calibri" w:cs="Calibri"/>
+                <w:b/>
+                <w:bCs/>
+              </w:rPr>
+            </w:pPr>
+            <w:r>
+              <w:rPr>
+                <w:rFonts w:ascii="Calibri" w:eastAsia="Calibri" w:hAnsi="Calibri" w:cs="Calibri"/>
+                <w:b/>
+                <w:bCs/>
+              </w:rPr>
+              <w:t>D</w:t>
+            </w:r>
+          </w:p>
+        </w:tc>
+      </w:tr>
+      <w:tr>
+        <w:tc>
+          <w:tcPr>
+            <w:tcW w:w="10627" w:type="dxa"/>
+            <w:gridSpan w:val="2"/>
+            <w:tcBorders>
+              <w:top w:val="single" w:sz="4" w:space="0" w:color="000000"/>
+              <w:left w:val="single" w:sz="4" w:space="0" w:color="000000"/>
+              <w:bottom w:val="single" w:sz="4" w:space="0" w:color="000000"/>
+              <w:right w:val="single" w:sz="4" w:space="0" w:color="000000"/>
+            </w:tcBorders>
+          </w:tcPr>
+          <w:p>
+            <w:pPr>
+              <w:widowControl w:val="0"/>
+              <w:spacing w:line="276" w:lineRule="auto"/>
+              <w:rPr>
+                <w:rFonts w:ascii="Calibri" w:eastAsia="Calibri" w:hAnsi="Calibri" w:cs="Calibri"/>
+                <w:lang w:val="en-US"/>
+              </w:rPr>
+            </w:pPr>
+            <w:r>
+              <w:rPr>
+                <w:rFonts w:ascii="Calibri" w:eastAsia="Calibri" w:hAnsi="Calibri" w:cs="Calibri"/>
+              </w:rPr>
+              <w:t xml:space="preserve">{%tr for k, v in </w:t>
+            </w:r>
+            <w:r>
+              <w:rPr>
+                <w:rFonts w:ascii="Calibri" w:eastAsia="Calibri" w:hAnsi="Calibri" w:cs="Calibri"/>
+                <w:lang w:val="en-US"/>
+              </w:rPr>
+              <w:t>tabl</w:t>
+            </w:r>
+            <w:r>
+              <w:rPr>
+                <w:rFonts w:ascii="Calibri" w:eastAsia="Calibri" w:hAnsi="Calibri" w:cs="Calibri"/>
+                <w:lang w:val="en-US"/>
+              </w:rPr>
+              <w:t>e</w:t>
+            </w:r>
+            <w:r>
+              <w:rPr>
+                <w:rFonts w:ascii="Calibri" w:eastAsia="Calibri" w:hAnsi="Calibri" w:cs="Calibri"/>
+                <w:lang w:val="en-US"/>
+              </w:rPr>
+              <w:t>_patologies</w:t>
+            </w:r>
+            <w:r>
+              <w:rPr>
+                <w:rFonts w:ascii="Calibri" w:eastAsia="Calibri" w:hAnsi="Calibri" w:cs="Calibri"/>
+              </w:rPr>
+              <w:t>.items()%}</w:t>
+            </w:r>
+          </w:p>
+        </w:tc>
+      </w:tr>
+      <w:tr>
+        <w:tc>
+          <w:tcPr>
+            <w:tcW w:w="9220" w:type="dxa"/>
+            <w:tcBorders>
+              <w:top w:val="single" w:sz="4" w:space="0" w:color="000000"/>
+              <w:left w:val="single" w:sz="4" w:space="0" w:color="000000"/>
+              <w:bottom w:val="single" w:sz="4" w:space="0" w:color="000000"/>
+              <w:right w:val="single" w:sz="4" w:space="0" w:color="000000"/>
+            </w:tcBorders>
+          </w:tcPr>
+          <w:p>
+            <w:pPr>
+              <w:widowControl w:val="0"/>
+              <w:spacing w:line="276" w:lineRule="auto"/>
+              <w:rPr>
+                <w:rFonts w:ascii="Calibri" w:eastAsia="Calibri" w:hAnsi="Calibri" w:cs="Calibri"/>
+              </w:rPr>
+            </w:pPr>
+            <w:r>
+              <w:rPr>
+                <w:rFonts w:ascii="Calibri" w:eastAsia="Calibri" w:hAnsi="Calibri" w:cs="Calibri"/>
+              </w:rPr>
+              <w:t>{{k}}</w:t>
+            </w:r>
+          </w:p>
+        </w:tc>
+        <w:tc>
+          <w:tcPr>
+            <w:tcW w:w="1407" w:type="dxa"/>
+            <w:tcBorders>
+              <w:top w:val="single" w:sz="4" w:space="0" w:color="000000"/>
+              <w:left w:val="single" w:sz="4" w:space="0" w:color="000000"/>
+              <w:bottom w:val="single" w:sz="4" w:space="0" w:color="000000"/>
+              <w:right w:val="single" w:sz="4" w:space="0" w:color="000000"/>
+            </w:tcBorders>
+          </w:tcPr>
+          <w:p>
+            <w:pPr>
+              <w:widowControl w:val="0"/>
+              <w:spacing w:line="276" w:lineRule="auto"/>
+              <w:jc w:val="center"/>
+              <w:rPr>
+                <w:rFonts w:ascii="Calibri" w:eastAsia="Calibri" w:hAnsi="Calibri" w:cs="Calibri"/>
+              </w:rPr>
+            </w:pPr>
+            <w:r>
+              <w:rPr>
+                <w:rFonts w:ascii="Calibri" w:eastAsia="Calibri" w:hAnsi="Calibri" w:cs="Calibri"/>
+              </w:rPr>
+              <w:t>{{v}}</w:t>
+            </w:r>
+          </w:p>
+        </w:tc>
+      </w:tr>
+      <w:tr>
+        <w:tc>
+          <w:tcPr>
+            <w:tcW w:w="10627" w:type="dxa"/>
+            <w:gridSpan w:val="2"/>
+            <w:tcBorders>
+              <w:top w:val="single" w:sz="4" w:space="0" w:color="000000"/>
+              <w:left w:val="single" w:sz="4" w:space="0" w:color="000000"/>
+              <w:bottom w:val="single" w:sz="4" w:space="0" w:color="000000"/>
+              <w:right w:val="single" w:sz="4" w:space="0" w:color="000000"/>
+            </w:tcBorders>
+          </w:tcPr>
+          <w:p>
+            <w:pPr>
+              <w:widowControl w:val="0"/>
+              <w:spacing w:line="276" w:lineRule="auto"/>
+              <w:rPr>
+                <w:rFonts w:ascii="Calibri" w:eastAsia="Calibri" w:hAnsi="Calibri" w:cs="Calibri"/>
+              </w:rPr>
+            </w:pPr>
+            <w:r>
+              <w:rPr>
+                <w:rFonts w:ascii="Calibri" w:eastAsia="Calibri" w:hAnsi="Calibri" w:cs="Calibri"/>
+              </w:rPr>
+              <w:t>{%tr endfor %}</w:t>
+            </w:r>
+          </w:p>
+        </w:tc>
+      </w:tr>
+    </w:tbl>
+    <w:p>
+      <w:pPr>
+        <w:rPr>
+          <w:rFonts w:ascii="Calibri" w:eastAsia="Calibri" w:hAnsi="Calibri" w:cs="Calibri"/>
+          <w:b/>
+          <w:bCs/>
+        </w:rPr>
+      </w:pPr>
     </w:p>
     <w:tbl>
       <w:tblPr>
@@ -2520,16 +2770,7 @@
                 <w:bCs/>
                 <w:lang w:val="pt-BR"/>
               </w:rPr>
-              <w:t>–</w:t>
-            </w:r>
-            <w:r>
-              <w:rPr>
-                <w:rFonts w:ascii="Calibri" w:eastAsia="Calibri" w:hAnsi="Calibri" w:cs="Calibri"/>
-                <w:b/>
-                <w:bCs/>
-                <w:lang w:val="pt-BR"/>
-              </w:rPr>
-              <w:t xml:space="preserve"> </w:t>
+              <w:t xml:space="preserve">– </w:t>
             </w:r>
             <w:r>
               <w:rPr>
@@ -2697,6 +2938,39 @@
         </w:tc>
       </w:tr>
     </w:tbl>
+    <w:p>
+      <w:pPr>
+        <w:widowControl w:val="0"/>
+        <w:spacing w:after="0"/>
+        <w:rPr>
+          <w:rFonts w:ascii="Calibri" w:eastAsia="Calibri" w:hAnsi="Calibri" w:cs="Calibri"/>
+          <w:sz w:val="12"/>
+          <w:szCs w:val="12"/>
+        </w:rPr>
+      </w:pPr>
+    </w:p>
+    <w:p>
+      <w:pPr>
+        <w:widowControl w:val="0"/>
+        <w:spacing w:after="0"/>
+        <w:rPr>
+          <w:rFonts w:ascii="Calibri" w:eastAsia="Calibri" w:hAnsi="Calibri" w:cs="Calibri"/>
+          <w:sz w:val="12"/>
+          <w:szCs w:val="12"/>
+        </w:rPr>
+      </w:pPr>
+    </w:p>
+    <w:p>
+      <w:pPr>
+        <w:widowControl w:val="0"/>
+        <w:spacing w:after="0"/>
+        <w:rPr>
+          <w:rFonts w:ascii="Calibri" w:eastAsia="Calibri" w:hAnsi="Calibri" w:cs="Calibri"/>
+          <w:sz w:val="12"/>
+          <w:szCs w:val="12"/>
+        </w:rPr>
+      </w:pPr>
+    </w:p>
     <w:p>
       <w:pPr>
         <w:widowControl w:val="0"/>
@@ -2752,6 +3026,7 @@
                 <w:bCs/>
                 <w:lang w:val="pt-BR"/>
               </w:rPr>
+              <w:lastRenderedPageBreak/>
               <w:t>TOXINAS E POSSÍVEIS SINTOMAS NO ORGANISMO</w:t>
             </w:r>
           </w:p>
@@ -3205,7 +3480,6 @@
                 <w:color w:val="505050"/>
                 <w:lang w:val="pt-BR"/>
               </w:rPr>
-              <w:lastRenderedPageBreak/>
               <w:t>OUTROS PRODUTOS QUE RECOMENDAMOS NÃO CONSUMIR</w:t>
             </w:r>
           </w:p>
@@ -3256,7 +3530,6 @@
           <w:rFonts w:ascii="Calibri" w:eastAsia="Calibri" w:hAnsi="Calibri" w:cs="Calibri"/>
           <w:sz w:val="12"/>
           <w:szCs w:val="12"/>
-          <w:lang w:val="pt-BR"/>
         </w:rPr>
       </w:pPr>
     </w:p>
@@ -3487,60 +3760,6 @@
           <w:pgNumType w:start="1"/>
           <w:cols w:space="720"/>
         </w:sectPr>
-      </w:pPr>
-    </w:p>
-    <w:p>
-      <w:pPr>
-        <w:widowControl w:val="0"/>
-        <w:pBdr>
-          <w:top w:val="nil"/>
-          <w:left w:val="nil"/>
-          <w:bottom w:val="nil"/>
-          <w:right w:val="nil"/>
-          <w:between w:val="nil"/>
-        </w:pBdr>
-        <w:spacing w:after="0"/>
-        <w:rPr>
-          <w:rFonts w:ascii="Calibri" w:eastAsia="Calibri" w:hAnsi="Calibri" w:cs="Calibri"/>
-          <w:sz w:val="4"/>
-          <w:szCs w:val="4"/>
-        </w:rPr>
-      </w:pPr>
-    </w:p>
-    <w:p>
-      <w:pPr>
-        <w:widowControl w:val="0"/>
-        <w:pBdr>
-          <w:top w:val="nil"/>
-          <w:left w:val="nil"/>
-          <w:bottom w:val="nil"/>
-          <w:right w:val="nil"/>
-          <w:between w:val="nil"/>
-        </w:pBdr>
-        <w:spacing w:after="0"/>
-        <w:rPr>
-          <w:rFonts w:ascii="Calibri" w:eastAsia="Calibri" w:hAnsi="Calibri" w:cs="Calibri"/>
-          <w:sz w:val="4"/>
-          <w:szCs w:val="4"/>
-        </w:rPr>
-      </w:pPr>
-    </w:p>
-    <w:p>
-      <w:pPr>
-        <w:widowControl w:val="0"/>
-        <w:pBdr>
-          <w:top w:val="nil"/>
-          <w:left w:val="nil"/>
-          <w:bottom w:val="nil"/>
-          <w:right w:val="nil"/>
-          <w:between w:val="nil"/>
-        </w:pBdr>
-        <w:spacing w:after="0"/>
-        <w:rPr>
-          <w:rFonts w:ascii="Calibri" w:eastAsia="Calibri" w:hAnsi="Calibri" w:cs="Calibri"/>
-          <w:sz w:val="4"/>
-          <w:szCs w:val="4"/>
-        </w:rPr>
       </w:pPr>
     </w:p>
     <w:p>

</xml_diff>

<commit_message>
Ajuste na disposição de informações da tabela ´table_foods´
</commit_message>
<xml_diff>
--- a/src/assets/report/template_provisorio.docx
+++ b/src/assets/report/template_provisorio.docx
@@ -2168,6 +2168,7 @@
           <w:rFonts w:ascii="Calibri" w:eastAsia="Calibri" w:hAnsi="Calibri" w:cs="Calibri"/>
           <w:b/>
           <w:bCs/>
+          <w:lang w:val="pt-BR"/>
         </w:rPr>
       </w:pPr>
     </w:p>
@@ -3189,7 +3190,6 @@
     </w:p>
     <w:tbl>
       <w:tblPr>
-        <w:tblStyle w:val="affffffff5"/>
         <w:tblW w:w="10632" w:type="dxa"/>
         <w:tblInd w:w="-147" w:type="dxa"/>
         <w:tblBorders>
@@ -3204,8 +3204,12 @@
         <w:tblLook w:val="0400" w:firstRow="0" w:lastRow="0" w:firstColumn="0" w:lastColumn="0" w:noHBand="0" w:noVBand="1"/>
       </w:tblPr>
       <w:tblGrid>
-        <w:gridCol w:w="9073"/>
-        <w:gridCol w:w="1559"/>
+        <w:gridCol w:w="2837"/>
+        <w:gridCol w:w="850"/>
+        <w:gridCol w:w="2553"/>
+        <w:gridCol w:w="850"/>
+        <w:gridCol w:w="2694"/>
+        <w:gridCol w:w="848"/>
       </w:tblGrid>
       <w:tr>
         <w:trPr>
@@ -3213,7 +3217,8 @@
         </w:trPr>
         <w:tc>
           <w:tcPr>
-            <w:tcW w:w="9073" w:type="dxa"/>
+            <w:tcW w:w="10632" w:type="dxa"/>
+            <w:gridSpan w:val="6"/>
             <w:tcBorders>
               <w:top w:val="single" w:sz="4" w:space="0" w:color="000000"/>
               <w:left w:val="single" w:sz="4" w:space="0" w:color="000000"/>
@@ -3221,12 +3226,12 @@
               <w:right w:val="single" w:sz="4" w:space="0" w:color="000000"/>
             </w:tcBorders>
             <w:shd w:val="clear" w:color="auto" w:fill="D9D9D9"/>
+            <w:hideMark/>
           </w:tcPr>
           <w:p>
             <w:pPr>
               <w:widowControl w:val="0"/>
-              <w:spacing w:line="276" w:lineRule="auto"/>
-              <w:jc w:val="center"/>
+              <w:spacing w:after="0"/>
               <w:rPr>
                 <w:rFonts w:ascii="Calibri" w:eastAsia="Calibri" w:hAnsi="Calibri" w:cs="Calibri"/>
                 <w:b/>
@@ -3243,22 +3248,27 @@
             </w:r>
           </w:p>
         </w:tc>
+      </w:tr>
+      <w:tr>
+        <w:trPr>
+          <w:tblHeader/>
+        </w:trPr>
         <w:tc>
           <w:tcPr>
-            <w:tcW w:w="1559" w:type="dxa"/>
+            <w:tcW w:w="2837" w:type="dxa"/>
             <w:tcBorders>
               <w:top w:val="single" w:sz="4" w:space="0" w:color="000000"/>
               <w:left w:val="single" w:sz="4" w:space="0" w:color="000000"/>
               <w:bottom w:val="single" w:sz="4" w:space="0" w:color="000000"/>
               <w:right w:val="single" w:sz="4" w:space="0" w:color="000000"/>
             </w:tcBorders>
-            <w:shd w:val="clear" w:color="auto" w:fill="D9D9D9"/>
+            <w:shd w:val="clear" w:color="auto" w:fill="F2F2F2" w:themeFill="background1" w:themeFillShade="F2"/>
+            <w:hideMark/>
           </w:tcPr>
           <w:p>
             <w:pPr>
               <w:widowControl w:val="0"/>
-              <w:spacing w:line="276" w:lineRule="auto"/>
-              <w:jc w:val="center"/>
+              <w:spacing w:after="0"/>
               <w:rPr>
                 <w:rFonts w:ascii="Calibri" w:eastAsia="Calibri" w:hAnsi="Calibri" w:cs="Calibri"/>
                 <w:b/>
@@ -3271,7 +3281,226 @@
                 <w:b/>
                 <w:bCs/>
               </w:rPr>
+              <w:t>ALTAMENTE COMPATÍVEIS</w:t>
+            </w:r>
+          </w:p>
+        </w:tc>
+        <w:tc>
+          <w:tcPr>
+            <w:tcW w:w="850" w:type="dxa"/>
+            <w:tcBorders>
+              <w:top w:val="single" w:sz="4" w:space="0" w:color="000000"/>
+              <w:left w:val="single" w:sz="4" w:space="0" w:color="000000"/>
+              <w:bottom w:val="single" w:sz="4" w:space="0" w:color="000000"/>
+              <w:right w:val="single" w:sz="4" w:space="0" w:color="000000"/>
+            </w:tcBorders>
+            <w:shd w:val="clear" w:color="auto" w:fill="F2F2F2" w:themeFill="background1" w:themeFillShade="F2"/>
+            <w:hideMark/>
+          </w:tcPr>
+          <w:p>
+            <w:pPr>
+              <w:widowControl w:val="0"/>
+              <w:spacing w:after="0"/>
+              <w:rPr>
+                <w:rFonts w:ascii="Calibri" w:eastAsia="Calibri" w:hAnsi="Calibri" w:cs="Calibri"/>
+                <w:b/>
+                <w:bCs/>
+              </w:rPr>
+            </w:pPr>
+            <w:r>
+              <w:rPr>
+                <w:rFonts w:ascii="Calibri" w:eastAsia="Calibri" w:hAnsi="Calibri" w:cs="Calibri"/>
+                <w:b/>
+                <w:bCs/>
+              </w:rPr>
               <w:t>D</w:t>
+            </w:r>
+          </w:p>
+        </w:tc>
+        <w:tc>
+          <w:tcPr>
+            <w:tcW w:w="2553" w:type="dxa"/>
+            <w:tcBorders>
+              <w:top w:val="single" w:sz="4" w:space="0" w:color="000000"/>
+              <w:left w:val="single" w:sz="4" w:space="0" w:color="000000"/>
+              <w:bottom w:val="single" w:sz="4" w:space="0" w:color="000000"/>
+              <w:right w:val="single" w:sz="4" w:space="0" w:color="000000"/>
+            </w:tcBorders>
+            <w:shd w:val="clear" w:color="auto" w:fill="F2F2F2" w:themeFill="background1" w:themeFillShade="F2"/>
+            <w:hideMark/>
+          </w:tcPr>
+          <w:p>
+            <w:pPr>
+              <w:widowControl w:val="0"/>
+              <w:spacing w:after="0"/>
+              <w:rPr>
+                <w:rFonts w:ascii="Calibri" w:eastAsia="Calibri" w:hAnsi="Calibri" w:cs="Calibri"/>
+                <w:b/>
+                <w:bCs/>
+              </w:rPr>
+            </w:pPr>
+            <w:r>
+              <w:rPr>
+                <w:rFonts w:ascii="Calibri" w:eastAsia="Calibri" w:hAnsi="Calibri" w:cs="Calibri"/>
+                <w:b/>
+                <w:bCs/>
+              </w:rPr>
+              <w:t>COMPATÍVEIS</w:t>
+            </w:r>
+          </w:p>
+        </w:tc>
+        <w:tc>
+          <w:tcPr>
+            <w:tcW w:w="850" w:type="dxa"/>
+            <w:tcBorders>
+              <w:top w:val="single" w:sz="4" w:space="0" w:color="000000"/>
+              <w:left w:val="single" w:sz="4" w:space="0" w:color="000000"/>
+              <w:bottom w:val="single" w:sz="4" w:space="0" w:color="000000"/>
+              <w:right w:val="single" w:sz="4" w:space="0" w:color="000000"/>
+            </w:tcBorders>
+            <w:shd w:val="clear" w:color="auto" w:fill="F2F2F2" w:themeFill="background1" w:themeFillShade="F2"/>
+            <w:hideMark/>
+          </w:tcPr>
+          <w:p>
+            <w:pPr>
+              <w:widowControl w:val="0"/>
+              <w:spacing w:after="0"/>
+              <w:rPr>
+                <w:rFonts w:ascii="Calibri" w:eastAsia="Calibri" w:hAnsi="Calibri" w:cs="Calibri"/>
+                <w:b/>
+                <w:bCs/>
+              </w:rPr>
+            </w:pPr>
+            <w:r>
+              <w:rPr>
+                <w:rFonts w:ascii="Calibri" w:eastAsia="Calibri" w:hAnsi="Calibri" w:cs="Calibri"/>
+                <w:b/>
+                <w:bCs/>
+              </w:rPr>
+              <w:t>D</w:t>
+            </w:r>
+          </w:p>
+        </w:tc>
+        <w:tc>
+          <w:tcPr>
+            <w:tcW w:w="2694" w:type="dxa"/>
+            <w:tcBorders>
+              <w:top w:val="single" w:sz="4" w:space="0" w:color="000000"/>
+              <w:left w:val="single" w:sz="4" w:space="0" w:color="000000"/>
+              <w:bottom w:val="single" w:sz="4" w:space="0" w:color="000000"/>
+              <w:right w:val="single" w:sz="4" w:space="0" w:color="000000"/>
+            </w:tcBorders>
+            <w:shd w:val="clear" w:color="auto" w:fill="F2F2F2" w:themeFill="background1" w:themeFillShade="F2"/>
+            <w:hideMark/>
+          </w:tcPr>
+          <w:p>
+            <w:pPr>
+              <w:widowControl w:val="0"/>
+              <w:spacing w:after="0"/>
+              <w:rPr>
+                <w:rFonts w:ascii="Calibri" w:eastAsia="Calibri" w:hAnsi="Calibri" w:cs="Calibri"/>
+                <w:b/>
+                <w:bCs/>
+              </w:rPr>
+            </w:pPr>
+            <w:r>
+              <w:rPr>
+                <w:rFonts w:ascii="Calibri" w:eastAsia="Calibri" w:hAnsi="Calibri" w:cs="Calibri"/>
+                <w:b/>
+                <w:bCs/>
+              </w:rPr>
+              <w:t>A EVITAR</w:t>
+            </w:r>
+          </w:p>
+        </w:tc>
+        <w:tc>
+          <w:tcPr>
+            <w:tcW w:w="848" w:type="dxa"/>
+            <w:tcBorders>
+              <w:top w:val="single" w:sz="4" w:space="0" w:color="000000"/>
+              <w:left w:val="single" w:sz="4" w:space="0" w:color="000000"/>
+              <w:bottom w:val="single" w:sz="4" w:space="0" w:color="000000"/>
+              <w:right w:val="single" w:sz="4" w:space="0" w:color="000000"/>
+            </w:tcBorders>
+            <w:shd w:val="clear" w:color="auto" w:fill="F2F2F2" w:themeFill="background1" w:themeFillShade="F2"/>
+            <w:hideMark/>
+          </w:tcPr>
+          <w:p>
+            <w:pPr>
+              <w:widowControl w:val="0"/>
+              <w:spacing w:after="0"/>
+              <w:rPr>
+                <w:rFonts w:ascii="Calibri" w:eastAsia="Calibri" w:hAnsi="Calibri" w:cs="Calibri"/>
+                <w:b/>
+                <w:bCs/>
+              </w:rPr>
+            </w:pPr>
+            <w:r>
+              <w:rPr>
+                <w:rFonts w:ascii="Calibri" w:eastAsia="Calibri" w:hAnsi="Calibri" w:cs="Calibri"/>
+                <w:b/>
+                <w:bCs/>
+              </w:rPr>
+              <w:t>D</w:t>
+            </w:r>
+          </w:p>
+        </w:tc>
+      </w:tr>
+      <w:tr>
+        <w:trPr>
+          <w:tblHeader/>
+        </w:trPr>
+        <w:tc>
+          <w:tcPr>
+            <w:tcW w:w="10632" w:type="dxa"/>
+            <w:gridSpan w:val="6"/>
+            <w:tcBorders>
+              <w:top w:val="single" w:sz="4" w:space="0" w:color="000000"/>
+              <w:left w:val="single" w:sz="4" w:space="0" w:color="000000"/>
+              <w:bottom w:val="single" w:sz="4" w:space="0" w:color="000000"/>
+              <w:right w:val="single" w:sz="4" w:space="0" w:color="000000"/>
+            </w:tcBorders>
+            <w:shd w:val="clear" w:color="auto" w:fill="F2F2F2" w:themeFill="background1" w:themeFillShade="F2"/>
+          </w:tcPr>
+          <w:p>
+            <w:pPr>
+              <w:widowControl w:val="0"/>
+              <w:spacing w:after="0"/>
+              <w:rPr>
+                <w:rFonts w:ascii="Calibri" w:eastAsia="Calibri" w:hAnsi="Calibri" w:cs="Calibri"/>
+                <w:b/>
+                <w:bCs/>
+              </w:rPr>
+            </w:pPr>
+            <w:r>
+              <w:rPr>
+                <w:rFonts w:ascii="Calibri" w:eastAsia="Calibri" w:hAnsi="Calibri" w:cs="Calibri"/>
+              </w:rPr>
+              <w:t xml:space="preserve">{%tr for </w:t>
+            </w:r>
+            <w:r>
+              <w:rPr>
+                <w:rFonts w:ascii="Calibri" w:eastAsia="Calibri" w:hAnsi="Calibri" w:cs="Calibri"/>
+              </w:rPr>
+              <w:t xml:space="preserve">row </w:t>
+            </w:r>
+            <w:r>
+              <w:rPr>
+                <w:rFonts w:ascii="Calibri" w:eastAsia="Calibri" w:hAnsi="Calibri" w:cs="Calibri"/>
+              </w:rPr>
+              <w:t>in table_</w:t>
+            </w:r>
+            <w:r>
+              <w:rPr>
+                <w:rFonts w:ascii="Calibri" w:eastAsia="Calibri" w:hAnsi="Calibri" w:cs="Calibri"/>
+              </w:rPr>
+              <w:t>food</w:t>
+            </w:r>
+            <w:r>
+              <w:rPr>
+                <w:rFonts w:ascii="Calibri" w:eastAsia="Calibri" w:hAnsi="Calibri" w:cs="Calibri"/>
+              </w:rPr>
+              <w:t>%}</w:t>
             </w:r>
           </w:p>
         </w:tc>
@@ -3279,8 +3508,7 @@
       <w:tr>
         <w:tc>
           <w:tcPr>
-            <w:tcW w:w="10632" w:type="dxa"/>
-            <w:gridSpan w:val="2"/>
+            <w:tcW w:w="2837" w:type="dxa"/>
             <w:tcBorders>
               <w:top w:val="single" w:sz="4" w:space="0" w:color="000000"/>
               <w:left w:val="single" w:sz="4" w:space="0" w:color="000000"/>
@@ -3291,7 +3519,7 @@
           <w:p>
             <w:pPr>
               <w:widowControl w:val="0"/>
-              <w:spacing w:line="276" w:lineRule="auto"/>
+              <w:spacing w:after="0"/>
               <w:rPr>
                 <w:rFonts w:ascii="Calibri" w:eastAsia="Calibri" w:hAnsi="Calibri" w:cs="Calibri"/>
               </w:rPr>
@@ -3300,15 +3528,31 @@
               <w:rPr>
                 <w:rFonts w:ascii="Calibri" w:eastAsia="Calibri" w:hAnsi="Calibri" w:cs="Calibri"/>
               </w:rPr>
-              <w:t>{%tr for k, v in table_food.items()%}</w:t>
+              <w:t>{{</w:t>
+            </w:r>
+            <w:r>
+              <w:rPr>
+                <w:rFonts w:ascii="Calibri" w:eastAsia="Calibri" w:hAnsi="Calibri" w:cs="Calibri"/>
+              </w:rPr>
+              <w:t>row</w:t>
+            </w:r>
+            <w:r>
+              <w:rPr>
+                <w:rFonts w:ascii="Calibri" w:eastAsia="Calibri" w:hAnsi="Calibri" w:cs="Calibri"/>
+              </w:rPr>
+              <w:t>[0]</w:t>
+            </w:r>
+            <w:r>
+              <w:rPr>
+                <w:rFonts w:ascii="Calibri" w:eastAsia="Calibri" w:hAnsi="Calibri" w:cs="Calibri"/>
+              </w:rPr>
+              <w:t>}}</w:t>
             </w:r>
           </w:p>
         </w:tc>
-      </w:tr>
-      <w:tr>
         <w:tc>
           <w:tcPr>
-            <w:tcW w:w="9073" w:type="dxa"/>
+            <w:tcW w:w="850" w:type="dxa"/>
             <w:tcBorders>
               <w:top w:val="single" w:sz="4" w:space="0" w:color="000000"/>
               <w:left w:val="single" w:sz="4" w:space="0" w:color="000000"/>
@@ -3319,7 +3563,7 @@
           <w:p>
             <w:pPr>
               <w:widowControl w:val="0"/>
-              <w:spacing w:line="276" w:lineRule="auto"/>
+              <w:spacing w:after="0"/>
               <w:rPr>
                 <w:rFonts w:ascii="Calibri" w:eastAsia="Calibri" w:hAnsi="Calibri" w:cs="Calibri"/>
               </w:rPr>
@@ -3334,13 +3578,37 @@
               <w:rPr>
                 <w:rFonts w:ascii="Calibri" w:eastAsia="Calibri" w:hAnsi="Calibri" w:cs="Calibri"/>
               </w:rPr>
-              <w:t>k}}</w:t>
+              <w:t xml:space="preserve"> </w:t>
+            </w:r>
+            <w:r>
+              <w:rPr>
+                <w:rFonts w:ascii="Calibri" w:eastAsia="Calibri" w:hAnsi="Calibri" w:cs="Calibri"/>
+              </w:rPr>
+              <w:t>row[</w:t>
+            </w:r>
+            <w:r>
+              <w:rPr>
+                <w:rFonts w:ascii="Calibri" w:eastAsia="Calibri" w:hAnsi="Calibri" w:cs="Calibri"/>
+              </w:rPr>
+              <w:t>1</w:t>
+            </w:r>
+            <w:r>
+              <w:rPr>
+                <w:rFonts w:ascii="Calibri" w:eastAsia="Calibri" w:hAnsi="Calibri" w:cs="Calibri"/>
+              </w:rPr>
+              <w:t>]</w:t>
+            </w:r>
+            <w:r>
+              <w:rPr>
+                <w:rFonts w:ascii="Calibri" w:eastAsia="Calibri" w:hAnsi="Calibri" w:cs="Calibri"/>
+              </w:rPr>
+              <w:t>}}</w:t>
             </w:r>
           </w:p>
         </w:tc>
         <w:tc>
           <w:tcPr>
-            <w:tcW w:w="1559" w:type="dxa"/>
+            <w:tcW w:w="2553" w:type="dxa"/>
             <w:tcBorders>
               <w:top w:val="single" w:sz="4" w:space="0" w:color="000000"/>
               <w:left w:val="single" w:sz="4" w:space="0" w:color="000000"/>
@@ -3351,8 +3619,7 @@
           <w:p>
             <w:pPr>
               <w:widowControl w:val="0"/>
-              <w:spacing w:line="276" w:lineRule="auto"/>
-              <w:jc w:val="center"/>
+              <w:spacing w:after="0"/>
               <w:rPr>
                 <w:rFonts w:ascii="Calibri" w:eastAsia="Calibri" w:hAnsi="Calibri" w:cs="Calibri"/>
               </w:rPr>
@@ -3361,16 +3628,25 @@
               <w:rPr>
                 <w:rFonts w:ascii="Calibri" w:eastAsia="Calibri" w:hAnsi="Calibri" w:cs="Calibri"/>
               </w:rPr>
-              <w:t>{{v}}</w:t>
+              <w:t>{{</w:t>
+            </w:r>
+            <w:r>
+              <w:rPr>
+                <w:rFonts w:ascii="Calibri" w:eastAsia="Calibri" w:hAnsi="Calibri" w:cs="Calibri"/>
+              </w:rPr>
+              <w:t>row[2]</w:t>
+            </w:r>
+            <w:r>
+              <w:rPr>
+                <w:rFonts w:ascii="Calibri" w:eastAsia="Calibri" w:hAnsi="Calibri" w:cs="Calibri"/>
+              </w:rPr>
+              <w:t>}}</w:t>
             </w:r>
           </w:p>
         </w:tc>
-      </w:tr>
-      <w:tr>
         <w:tc>
           <w:tcPr>
-            <w:tcW w:w="10632" w:type="dxa"/>
-            <w:gridSpan w:val="2"/>
+            <w:tcW w:w="850" w:type="dxa"/>
             <w:tcBorders>
               <w:top w:val="single" w:sz="4" w:space="0" w:color="000000"/>
               <w:left w:val="single" w:sz="4" w:space="0" w:color="000000"/>
@@ -3381,7 +3657,7 @@
           <w:p>
             <w:pPr>
               <w:widowControl w:val="0"/>
-              <w:spacing w:line="276" w:lineRule="auto"/>
+              <w:spacing w:after="0"/>
               <w:rPr>
                 <w:rFonts w:ascii="Calibri" w:eastAsia="Calibri" w:hAnsi="Calibri" w:cs="Calibri"/>
               </w:rPr>
@@ -3390,31 +3666,180 @@
               <w:rPr>
                 <w:rFonts w:ascii="Calibri" w:eastAsia="Calibri" w:hAnsi="Calibri" w:cs="Calibri"/>
               </w:rPr>
-              <w:t>{%</w:t>
+              <w:t>{{</w:t>
             </w:r>
             <w:r>
               <w:rPr>
                 <w:rFonts w:ascii="Calibri" w:eastAsia="Calibri" w:hAnsi="Calibri" w:cs="Calibri"/>
               </w:rPr>
-              <w:t>tr</w:t>
+              <w:t xml:space="preserve"> </w:t>
             </w:r>
             <w:r>
               <w:rPr>
                 <w:rFonts w:ascii="Calibri" w:eastAsia="Calibri" w:hAnsi="Calibri" w:cs="Calibri"/>
               </w:rPr>
-              <w:t xml:space="preserve"> end</w:t>
+              <w:t>row[</w:t>
             </w:r>
             <w:r>
               <w:rPr>
                 <w:rFonts w:ascii="Calibri" w:eastAsia="Calibri" w:hAnsi="Calibri" w:cs="Calibri"/>
               </w:rPr>
-              <w:t>f</w:t>
+              <w:t>3</w:t>
             </w:r>
             <w:r>
               <w:rPr>
                 <w:rFonts w:ascii="Calibri" w:eastAsia="Calibri" w:hAnsi="Calibri" w:cs="Calibri"/>
               </w:rPr>
-              <w:t>or %}</w:t>
+              <w:t>]</w:t>
+            </w:r>
+            <w:r>
+              <w:rPr>
+                <w:rFonts w:ascii="Calibri" w:eastAsia="Calibri" w:hAnsi="Calibri" w:cs="Calibri"/>
+              </w:rPr>
+              <w:t>}}</w:t>
+            </w:r>
+          </w:p>
+        </w:tc>
+        <w:tc>
+          <w:tcPr>
+            <w:tcW w:w="2694" w:type="dxa"/>
+            <w:tcBorders>
+              <w:top w:val="single" w:sz="4" w:space="0" w:color="000000"/>
+              <w:left w:val="single" w:sz="4" w:space="0" w:color="000000"/>
+              <w:bottom w:val="single" w:sz="4" w:space="0" w:color="000000"/>
+              <w:right w:val="single" w:sz="4" w:space="0" w:color="000000"/>
+            </w:tcBorders>
+          </w:tcPr>
+          <w:p>
+            <w:pPr>
+              <w:widowControl w:val="0"/>
+              <w:spacing w:after="0"/>
+              <w:rPr>
+                <w:rFonts w:ascii="Calibri" w:eastAsia="Calibri" w:hAnsi="Calibri" w:cs="Calibri"/>
+              </w:rPr>
+            </w:pPr>
+            <w:r>
+              <w:rPr>
+                <w:rFonts w:ascii="Calibri" w:eastAsia="Calibri" w:hAnsi="Calibri" w:cs="Calibri"/>
+              </w:rPr>
+              <w:t>{{</w:t>
+            </w:r>
+            <w:r>
+              <w:rPr>
+                <w:rFonts w:ascii="Calibri" w:eastAsia="Calibri" w:hAnsi="Calibri" w:cs="Calibri"/>
+              </w:rPr>
+              <w:t xml:space="preserve"> </w:t>
+            </w:r>
+            <w:r>
+              <w:rPr>
+                <w:rFonts w:ascii="Calibri" w:eastAsia="Calibri" w:hAnsi="Calibri" w:cs="Calibri"/>
+              </w:rPr>
+              <w:t>row[</w:t>
+            </w:r>
+            <w:r>
+              <w:rPr>
+                <w:rFonts w:ascii="Calibri" w:eastAsia="Calibri" w:hAnsi="Calibri" w:cs="Calibri"/>
+              </w:rPr>
+              <w:t>4</w:t>
+            </w:r>
+            <w:r>
+              <w:rPr>
+                <w:rFonts w:ascii="Calibri" w:eastAsia="Calibri" w:hAnsi="Calibri" w:cs="Calibri"/>
+              </w:rPr>
+              <w:t>]</w:t>
+            </w:r>
+            <w:r>
+              <w:rPr>
+                <w:rFonts w:ascii="Calibri" w:eastAsia="Calibri" w:hAnsi="Calibri" w:cs="Calibri"/>
+              </w:rPr>
+              <w:t>}}</w:t>
+            </w:r>
+          </w:p>
+        </w:tc>
+        <w:tc>
+          <w:tcPr>
+            <w:tcW w:w="848" w:type="dxa"/>
+            <w:tcBorders>
+              <w:top w:val="single" w:sz="4" w:space="0" w:color="000000"/>
+              <w:left w:val="single" w:sz="4" w:space="0" w:color="000000"/>
+              <w:bottom w:val="single" w:sz="4" w:space="0" w:color="000000"/>
+              <w:right w:val="single" w:sz="4" w:space="0" w:color="000000"/>
+            </w:tcBorders>
+          </w:tcPr>
+          <w:p>
+            <w:pPr>
+              <w:widowControl w:val="0"/>
+              <w:spacing w:after="0"/>
+              <w:rPr>
+                <w:rFonts w:ascii="Calibri" w:eastAsia="Calibri" w:hAnsi="Calibri" w:cs="Calibri"/>
+              </w:rPr>
+            </w:pPr>
+            <w:r>
+              <w:rPr>
+                <w:rFonts w:ascii="Calibri" w:eastAsia="Calibri" w:hAnsi="Calibri" w:cs="Calibri"/>
+              </w:rPr>
+              <w:t>{{</w:t>
+            </w:r>
+            <w:r>
+              <w:rPr>
+                <w:rFonts w:ascii="Calibri" w:eastAsia="Calibri" w:hAnsi="Calibri" w:cs="Calibri"/>
+              </w:rPr>
+              <w:t xml:space="preserve"> </w:t>
+            </w:r>
+            <w:r>
+              <w:rPr>
+                <w:rFonts w:ascii="Calibri" w:eastAsia="Calibri" w:hAnsi="Calibri" w:cs="Calibri"/>
+              </w:rPr>
+              <w:t>row[</w:t>
+            </w:r>
+            <w:r>
+              <w:rPr>
+                <w:rFonts w:ascii="Calibri" w:eastAsia="Calibri" w:hAnsi="Calibri" w:cs="Calibri"/>
+              </w:rPr>
+              <w:t>5</w:t>
+            </w:r>
+            <w:r>
+              <w:rPr>
+                <w:rFonts w:ascii="Calibri" w:eastAsia="Calibri" w:hAnsi="Calibri" w:cs="Calibri"/>
+              </w:rPr>
+              <w:t>]</w:t>
+            </w:r>
+            <w:r>
+              <w:rPr>
+                <w:rFonts w:ascii="Calibri" w:eastAsia="Calibri" w:hAnsi="Calibri" w:cs="Calibri"/>
+              </w:rPr>
+              <w:t>}}</w:t>
+            </w:r>
+          </w:p>
+        </w:tc>
+      </w:tr>
+      <w:tr>
+        <w:tc>
+          <w:tcPr>
+            <w:tcW w:w="10632" w:type="dxa"/>
+            <w:gridSpan w:val="6"/>
+            <w:tcBorders>
+              <w:top w:val="single" w:sz="4" w:space="0" w:color="000000"/>
+              <w:left w:val="single" w:sz="4" w:space="0" w:color="000000"/>
+              <w:bottom w:val="single" w:sz="4" w:space="0" w:color="000000"/>
+              <w:right w:val="single" w:sz="4" w:space="0" w:color="000000"/>
+            </w:tcBorders>
+          </w:tcPr>
+          <w:p>
+            <w:pPr>
+              <w:widowControl w:val="0"/>
+              <w:spacing w:after="0"/>
+              <w:rPr>
+                <w:rFonts w:ascii="Calibri" w:eastAsia="Calibri" w:hAnsi="Calibri" w:cs="Calibri"/>
+                <w:b/>
+                <w:bCs/>
+              </w:rPr>
+            </w:pPr>
+            <w:r>
+              <w:rPr>
+                <w:rFonts w:ascii="Calibri" w:eastAsia="Calibri" w:hAnsi="Calibri" w:cs="Calibri"/>
+              </w:rPr>
+              <w:t>{%tr endfor %}</w:t>
             </w:r>
           </w:p>
         </w:tc>
@@ -3530,6 +3955,7 @@
           <w:rFonts w:ascii="Calibri" w:eastAsia="Calibri" w:hAnsi="Calibri" w:cs="Calibri"/>
           <w:sz w:val="12"/>
           <w:szCs w:val="12"/>
+          <w:lang w:val="pt-BR"/>
         </w:rPr>
       </w:pPr>
     </w:p>
@@ -5461,6 +5887,7 @@
   <w:style w:type="character" w:default="1" w:styleId="Fontepargpadro">
     <w:name w:val="Default Paragraph Font"/>
     <w:uiPriority w:val="1"/>
+    <w:semiHidden/>
     <w:unhideWhenUsed/>
   </w:style>
   <w:style w:type="table" w:default="1" w:styleId="Tabelanormal">

</xml_diff>

<commit_message>
Ajustes no template do relatório e proplema com `pop` da lista prosync
</commit_message>
<xml_diff>
--- a/src/assets/report/template_provisorio.docx
+++ b/src/assets/report/template_provisorio.docx
@@ -119,7 +119,31 @@
           <w:szCs w:val="32"/>
           <w:lang w:val="pt-BR"/>
         </w:rPr>
-        <w:t>{name}}</w:t>
+        <w:t>{</w:t>
+      </w:r>
+      <w:proofErr w:type="spellStart"/>
+      <w:r>
+        <w:rPr>
+          <w:rFonts w:ascii="Calibri" w:eastAsia="Calibri" w:hAnsi="Calibri" w:cs="Calibri"/>
+          <w:b/>
+          <w:bCs/>
+          <w:sz w:val="32"/>
+          <w:szCs w:val="32"/>
+          <w:lang w:val="pt-BR"/>
+        </w:rPr>
+        <w:t>name</w:t>
+      </w:r>
+      <w:proofErr w:type="spellEnd"/>
+      <w:r>
+        <w:rPr>
+          <w:rFonts w:ascii="Calibri" w:eastAsia="Calibri" w:hAnsi="Calibri" w:cs="Calibri"/>
+          <w:b/>
+          <w:bCs/>
+          <w:sz w:val="32"/>
+          <w:szCs w:val="32"/>
+          <w:lang w:val="pt-BR"/>
+        </w:rPr>
+        <w:t>}}</w:t>
       </w:r>
     </w:p>
     <w:p>
@@ -164,7 +188,23 @@
           <w:rFonts w:ascii="Calibri" w:eastAsia="Calibri" w:hAnsi="Calibri" w:cs="Calibri"/>
           <w:lang w:val="pt-BR"/>
         </w:rPr>
-        <w:t xml:space="preserve">A biorressonância é uma avaliação funcional e complementar que observa padrões de resposta do organismo a diferentes estímulos. Ela não substitui diagnósticos médicos, mas auxilia na identificação de tendências de sobrecarga ou equilíbrio no funcionamento do corpo. </w:t>
+        <w:t xml:space="preserve">A </w:t>
+      </w:r>
+      <w:proofErr w:type="spellStart"/>
+      <w:r>
+        <w:rPr>
+          <w:rFonts w:ascii="Calibri" w:eastAsia="Calibri" w:hAnsi="Calibri" w:cs="Calibri"/>
+          <w:lang w:val="pt-BR"/>
+        </w:rPr>
+        <w:t>biorressonância</w:t>
+      </w:r>
+      <w:proofErr w:type="spellEnd"/>
+      <w:r>
+        <w:rPr>
+          <w:rFonts w:ascii="Calibri" w:eastAsia="Calibri" w:hAnsi="Calibri" w:cs="Calibri"/>
+          <w:lang w:val="pt-BR"/>
+        </w:rPr>
+        <w:t xml:space="preserve"> é uma avaliação funcional e complementar que observa padrões de resposta do organismo a diferentes estímulos. Ela não substitui diagnósticos médicos, mas auxilia na identificação de tendências de sobrecarga ou equilíbrio no funcionamento do corpo. </w:t>
       </w:r>
     </w:p>
     <w:p>
@@ -259,12 +299,69 @@
         </w:rPr>
         <w:t xml:space="preserve">2.2. Microrganismos </w:t>
       </w:r>
+      <w:proofErr w:type="gramStart"/>
       <w:r>
         <w:rPr>
           <w:rFonts w:ascii="Calibri" w:eastAsia="Calibri" w:hAnsi="Calibri" w:cs="Calibri"/>
           <w:lang w:val="pt-BR"/>
         </w:rPr>
-        <w:t>-  identifica vírus, bactérias, helmintos e protozoários que podem estar afetando o organismo , mas a manifestação varia conforme as particularidades fisiológicas e energéticas individuais, pois podem resultar da combinação sinérgica de cada microrganismo com toxinas  e até mesmo  com fatores psicoemocionais.</w:t>
+        <w:t>-  identifica</w:t>
+      </w:r>
+      <w:proofErr w:type="gramEnd"/>
+      <w:r>
+        <w:rPr>
+          <w:rFonts w:ascii="Calibri" w:eastAsia="Calibri" w:hAnsi="Calibri" w:cs="Calibri"/>
+          <w:lang w:val="pt-BR"/>
+        </w:rPr>
+        <w:t xml:space="preserve"> vírus, bactérias, helmintos e protozoários que podem estar afetando o </w:t>
+      </w:r>
+      <w:proofErr w:type="gramStart"/>
+      <w:r>
+        <w:rPr>
+          <w:rFonts w:ascii="Calibri" w:eastAsia="Calibri" w:hAnsi="Calibri" w:cs="Calibri"/>
+          <w:lang w:val="pt-BR"/>
+        </w:rPr>
+        <w:t>organismo ,</w:t>
+      </w:r>
+      <w:proofErr w:type="gramEnd"/>
+      <w:r>
+        <w:rPr>
+          <w:rFonts w:ascii="Calibri" w:eastAsia="Calibri" w:hAnsi="Calibri" w:cs="Calibri"/>
+          <w:lang w:val="pt-BR"/>
+        </w:rPr>
+        <w:t xml:space="preserve"> mas a manifestação varia conforme as particularidades fisiológicas e energéticas individuais, pois podem resultar da combinação sinérgica de cada microrganismo com </w:t>
+      </w:r>
+      <w:proofErr w:type="gramStart"/>
+      <w:r>
+        <w:rPr>
+          <w:rFonts w:ascii="Calibri" w:eastAsia="Calibri" w:hAnsi="Calibri" w:cs="Calibri"/>
+          <w:lang w:val="pt-BR"/>
+        </w:rPr>
+        <w:t>toxinas  e</w:t>
+      </w:r>
+      <w:proofErr w:type="gramEnd"/>
+      <w:r>
+        <w:rPr>
+          <w:rFonts w:ascii="Calibri" w:eastAsia="Calibri" w:hAnsi="Calibri" w:cs="Calibri"/>
+          <w:lang w:val="pt-BR"/>
+        </w:rPr>
+        <w:t xml:space="preserve"> até </w:t>
+      </w:r>
+      <w:proofErr w:type="gramStart"/>
+      <w:r>
+        <w:rPr>
+          <w:rFonts w:ascii="Calibri" w:eastAsia="Calibri" w:hAnsi="Calibri" w:cs="Calibri"/>
+          <w:lang w:val="pt-BR"/>
+        </w:rPr>
+        <w:t>mesmo  com</w:t>
+      </w:r>
+      <w:proofErr w:type="gramEnd"/>
+      <w:r>
+        <w:rPr>
+          <w:rFonts w:ascii="Calibri" w:eastAsia="Calibri" w:hAnsi="Calibri" w:cs="Calibri"/>
+          <w:lang w:val="pt-BR"/>
+        </w:rPr>
+        <w:t xml:space="preserve"> fatores psicoemocionais.</w:t>
       </w:r>
     </w:p>
     <w:p>
@@ -284,14 +381,50 @@
           <w:bCs/>
           <w:lang w:val="pt-BR"/>
         </w:rPr>
-        <w:t xml:space="preserve">2.3. Toxinas  - </w:t>
+        <w:t xml:space="preserve">2.3. </w:t>
+      </w:r>
+      <w:proofErr w:type="gramStart"/>
+      <w:r>
+        <w:rPr>
+          <w:rFonts w:ascii="Calibri" w:eastAsia="Calibri" w:hAnsi="Calibri" w:cs="Calibri"/>
+          <w:b/>
+          <w:bCs/>
+          <w:lang w:val="pt-BR"/>
+        </w:rPr>
+        <w:t>Toxinas  -</w:t>
+      </w:r>
+      <w:proofErr w:type="gramEnd"/>
+      <w:r>
+        <w:rPr>
+          <w:rFonts w:ascii="Calibri" w:eastAsia="Calibri" w:hAnsi="Calibri" w:cs="Calibri"/>
+          <w:b/>
+          <w:bCs/>
+          <w:lang w:val="pt-BR"/>
+        </w:rPr>
+        <w:t xml:space="preserve"> </w:t>
       </w:r>
       <w:r>
         <w:rPr>
           <w:rFonts w:ascii="Calibri" w:eastAsia="Calibri" w:hAnsi="Calibri" w:cs="Calibri"/>
           <w:lang w:val="pt-BR"/>
         </w:rPr>
-        <w:t>identifica metais pesados, solventes, agrotóxicos, xenoestrógenos, radiação e toxinas diversas (ambientais, alimentares, intestinais, nervosas e farmacológicas). Tais substâncias contribuem para o aumento do estresse oxidativo, desestabilização metabólica e redução da eficiência imunológica, bem como alteram o pH dos tecidos e favorecem a disbiose, facilitando a proliferação de microrganismos oportunistas.</w:t>
+        <w:t xml:space="preserve">identifica metais pesados, solventes, agrotóxicos, </w:t>
+      </w:r>
+      <w:proofErr w:type="spellStart"/>
+      <w:r>
+        <w:rPr>
+          <w:rFonts w:ascii="Calibri" w:eastAsia="Calibri" w:hAnsi="Calibri" w:cs="Calibri"/>
+          <w:lang w:val="pt-BR"/>
+        </w:rPr>
+        <w:t>xenoestrógenos</w:t>
+      </w:r>
+      <w:proofErr w:type="spellEnd"/>
+      <w:r>
+        <w:rPr>
+          <w:rFonts w:ascii="Calibri" w:eastAsia="Calibri" w:hAnsi="Calibri" w:cs="Calibri"/>
+          <w:lang w:val="pt-BR"/>
+        </w:rPr>
+        <w:t>, radiação e toxinas diversas (ambientais, alimentares, intestinais, nervosas e farmacológicas). Tais substâncias contribuem para o aumento do estresse oxidativo, desestabilização metabólica e redução da eficiência imunológica, bem como alteram o pH dos tecidos e favorecem a disbiose, facilitando a proliferação de microrganismos oportunistas.</w:t>
       </w:r>
     </w:p>
     <w:p>
@@ -311,7 +444,27 @@
           <w:bCs/>
           <w:lang w:val="pt-BR"/>
         </w:rPr>
-        <w:t xml:space="preserve">2.4. Campo morfogenético - </w:t>
+        <w:t xml:space="preserve">2.4. Campo </w:t>
+      </w:r>
+      <w:proofErr w:type="spellStart"/>
+      <w:r>
+        <w:rPr>
+          <w:rFonts w:ascii="Calibri" w:eastAsia="Calibri" w:hAnsi="Calibri" w:cs="Calibri"/>
+          <w:b/>
+          <w:bCs/>
+          <w:lang w:val="pt-BR"/>
+        </w:rPr>
+        <w:t>morfogenético</w:t>
+      </w:r>
+      <w:proofErr w:type="spellEnd"/>
+      <w:r>
+        <w:rPr>
+          <w:rFonts w:ascii="Calibri" w:eastAsia="Calibri" w:hAnsi="Calibri" w:cs="Calibri"/>
+          <w:b/>
+          <w:bCs/>
+          <w:lang w:val="pt-BR"/>
+        </w:rPr>
+        <w:t xml:space="preserve"> - </w:t>
       </w:r>
       <w:r>
         <w:rPr>
@@ -414,7 +567,27 @@
           <w:bCs/>
           <w:lang w:val="pt-BR"/>
         </w:rPr>
-        <w:t>3. INTERPRETAÇÃO DOS  RESULTADOS DAS ANÁLISES</w:t>
+        <w:t xml:space="preserve">3. INTERPRETAÇÃO </w:t>
+      </w:r>
+      <w:proofErr w:type="gramStart"/>
+      <w:r>
+        <w:rPr>
+          <w:rFonts w:ascii="Calibri" w:eastAsia="Calibri" w:hAnsi="Calibri" w:cs="Calibri"/>
+          <w:b/>
+          <w:bCs/>
+          <w:lang w:val="pt-BR"/>
+        </w:rPr>
+        <w:t>DOS  RESULTADOS</w:t>
+      </w:r>
+      <w:proofErr w:type="gramEnd"/>
+      <w:r>
+        <w:rPr>
+          <w:rFonts w:ascii="Calibri" w:eastAsia="Calibri" w:hAnsi="Calibri" w:cs="Calibri"/>
+          <w:b/>
+          <w:bCs/>
+          <w:lang w:val="pt-BR"/>
+        </w:rPr>
+        <w:t xml:space="preserve"> DAS ANÁLISES</w:t>
       </w:r>
     </w:p>
     <w:p>
@@ -425,13 +598,23 @@
           <w:lang w:val="pt-BR"/>
         </w:rPr>
       </w:pPr>
+      <w:proofErr w:type="gramStart"/>
       <w:r>
         <w:rPr>
           <w:rFonts w:ascii="Calibri" w:eastAsia="Calibri" w:hAnsi="Calibri" w:cs="Calibri"/>
           <w:u w:val="single"/>
           <w:lang w:val="pt-BR"/>
         </w:rPr>
-        <w:t>D  é o índice de divergência ou grau de desvio</w:t>
+        <w:t>D  é</w:t>
+      </w:r>
+      <w:proofErr w:type="gramEnd"/>
+      <w:r>
+        <w:rPr>
+          <w:rFonts w:ascii="Calibri" w:eastAsia="Calibri" w:hAnsi="Calibri" w:cs="Calibri"/>
+          <w:u w:val="single"/>
+          <w:lang w:val="pt-BR"/>
+        </w:rPr>
+        <w:t xml:space="preserve"> o índice de divergência ou grau de desvio</w:t>
       </w:r>
       <w:r>
         <w:rPr>
@@ -465,8 +648,19 @@
           <w:bCs/>
           <w:lang w:val="pt-BR"/>
         </w:rPr>
-        <w:t>No sistema ProSync</w:t>
+        <w:t xml:space="preserve">No sistema </w:t>
       </w:r>
+      <w:proofErr w:type="spellStart"/>
+      <w:r>
+        <w:rPr>
+          <w:rFonts w:ascii="Calibri" w:eastAsia="Calibri" w:hAnsi="Calibri" w:cs="Calibri"/>
+          <w:b/>
+          <w:bCs/>
+          <w:lang w:val="pt-BR"/>
+        </w:rPr>
+        <w:t>ProSync</w:t>
+      </w:r>
+      <w:proofErr w:type="spellEnd"/>
       <w:r>
         <w:rPr>
           <w:rFonts w:ascii="Calibri" w:eastAsia="Calibri" w:hAnsi="Calibri" w:cs="Calibri"/>
@@ -511,8 +705,7 @@
     </w:p>
     <w:tbl>
       <w:tblPr>
-        <w:tblStyle w:val="affffffff2"/>
-        <w:tblW w:w="10485" w:type="dxa"/>
+        <w:tblW w:w="9643" w:type="dxa"/>
         <w:tblInd w:w="-5" w:type="dxa"/>
         <w:tblLayout w:type="fixed"/>
         <w:tblLook w:val="0400" w:firstRow="0" w:lastRow="0" w:firstColumn="0" w:lastColumn="0" w:noHBand="0" w:noVBand="1"/>
@@ -520,7 +713,7 @@
       <w:tblGrid>
         <w:gridCol w:w="1423"/>
         <w:gridCol w:w="1417"/>
-        <w:gridCol w:w="7645"/>
+        <w:gridCol w:w="6803"/>
       </w:tblGrid>
       <w:tr>
         <w:tc>
@@ -536,12 +729,14 @@
                 <w:rFonts w:ascii="Calibri" w:eastAsia="Calibri" w:hAnsi="Calibri" w:cs="Calibri"/>
               </w:rPr>
             </w:pPr>
+            <w:proofErr w:type="spellStart"/>
             <w:r>
               <w:rPr>
                 <w:rFonts w:ascii="Calibri" w:eastAsia="Calibri" w:hAnsi="Calibri" w:cs="Calibri"/>
               </w:rPr>
               <w:t>Aspectos</w:t>
             </w:r>
+            <w:proofErr w:type="spellEnd"/>
           </w:p>
         </w:tc>
         <w:tc>
@@ -573,7 +768,7 @@
         </w:tc>
         <w:tc>
           <w:tcPr>
-            <w:tcW w:w="7645" w:type="dxa"/>
+            <w:tcW w:w="6803" w:type="dxa"/>
             <w:shd w:val="clear" w:color="auto" w:fill="D9D9D9"/>
             <w:tcMar>
               <w:top w:w="0" w:type="dxa"/>
@@ -590,12 +785,14 @@
                 <w:rFonts w:ascii="Calibri" w:eastAsia="Calibri" w:hAnsi="Calibri" w:cs="Calibri"/>
               </w:rPr>
             </w:pPr>
+            <w:proofErr w:type="spellStart"/>
             <w:r>
               <w:rPr>
                 <w:rFonts w:ascii="Calibri" w:eastAsia="Calibri" w:hAnsi="Calibri" w:cs="Calibri"/>
               </w:rPr>
               <w:t>Interpretação</w:t>
             </w:r>
+            <w:proofErr w:type="spellEnd"/>
           </w:p>
         </w:tc>
       </w:tr>
@@ -616,6 +813,7 @@
                 <w:szCs w:val="20"/>
               </w:rPr>
             </w:pPr>
+            <w:proofErr w:type="spellStart"/>
             <w:r>
               <w:rPr>
                 <w:rFonts w:ascii="Calibri" w:eastAsia="Calibri" w:hAnsi="Calibri" w:cs="Calibri"/>
@@ -624,6 +822,7 @@
               </w:rPr>
               <w:t>Microrganismos</w:t>
             </w:r>
+            <w:proofErr w:type="spellEnd"/>
           </w:p>
         </w:tc>
         <w:tc>
@@ -660,7 +859,7 @@
         </w:tc>
         <w:tc>
           <w:tcPr>
-            <w:tcW w:w="7645" w:type="dxa"/>
+            <w:tcW w:w="6803" w:type="dxa"/>
             <w:tcMar>
               <w:top w:w="0" w:type="dxa"/>
               <w:left w:w="108" w:type="dxa"/>
@@ -753,7 +952,7 @@
         </w:tc>
         <w:tc>
           <w:tcPr>
-            <w:tcW w:w="7645" w:type="dxa"/>
+            <w:tcW w:w="6803" w:type="dxa"/>
             <w:tcMar>
               <w:top w:w="0" w:type="dxa"/>
               <w:left w:w="108" w:type="dxa"/>
@@ -844,7 +1043,7 @@
         </w:tc>
         <w:tc>
           <w:tcPr>
-            <w:tcW w:w="7645" w:type="dxa"/>
+            <w:tcW w:w="6803" w:type="dxa"/>
             <w:tcMar>
               <w:top w:w="0" w:type="dxa"/>
               <w:left w:w="108" w:type="dxa"/>
@@ -904,6 +1103,7 @@
                 <w:szCs w:val="20"/>
               </w:rPr>
             </w:pPr>
+            <w:proofErr w:type="spellStart"/>
             <w:r>
               <w:rPr>
                 <w:rFonts w:ascii="Calibri" w:eastAsia="Calibri" w:hAnsi="Calibri" w:cs="Calibri"/>
@@ -912,6 +1112,7 @@
               </w:rPr>
               <w:t>Toxinas</w:t>
             </w:r>
+            <w:proofErr w:type="spellEnd"/>
           </w:p>
         </w:tc>
         <w:tc>
@@ -941,29 +1142,13 @@
                 <w:sz w:val="20"/>
                 <w:szCs w:val="20"/>
               </w:rPr>
-              <w:t xml:space="preserve">0 </w:t>
-            </w:r>
-            <w:r>
-              <w:rPr>
-                <w:rFonts w:ascii="Calibri" w:eastAsia="Calibri" w:hAnsi="Calibri" w:cs="Calibri"/>
-                <w:sz w:val="20"/>
-                <w:szCs w:val="20"/>
-              </w:rPr>
-              <w:t>–</w:t>
-            </w:r>
-            <w:r>
-              <w:rPr>
-                <w:rFonts w:ascii="Calibri" w:eastAsia="Calibri" w:hAnsi="Calibri" w:cs="Calibri"/>
-                <w:sz w:val="20"/>
-                <w:szCs w:val="20"/>
-              </w:rPr>
-              <w:t xml:space="preserve"> 0,300</w:t>
+              <w:t>0 – 0,300</w:t>
             </w:r>
           </w:p>
         </w:tc>
         <w:tc>
           <w:tcPr>
-            <w:tcW w:w="7645" w:type="dxa"/>
+            <w:tcW w:w="6803" w:type="dxa"/>
             <w:shd w:val="clear" w:color="auto" w:fill="D9D9D9"/>
           </w:tcPr>
           <w:p>
@@ -1054,29 +1239,13 @@
                 <w:sz w:val="20"/>
                 <w:szCs w:val="20"/>
               </w:rPr>
-              <w:t xml:space="preserve">0,300 </w:t>
-            </w:r>
-            <w:r>
-              <w:rPr>
-                <w:rFonts w:ascii="Calibri" w:eastAsia="Calibri" w:hAnsi="Calibri" w:cs="Calibri"/>
-                <w:sz w:val="20"/>
-                <w:szCs w:val="20"/>
-              </w:rPr>
-              <w:t>–</w:t>
-            </w:r>
-            <w:r>
-              <w:rPr>
-                <w:rFonts w:ascii="Calibri" w:eastAsia="Calibri" w:hAnsi="Calibri" w:cs="Calibri"/>
-                <w:sz w:val="20"/>
-                <w:szCs w:val="20"/>
-              </w:rPr>
-              <w:t xml:space="preserve"> 0,700</w:t>
+              <w:t>0,300 – 0,700</w:t>
             </w:r>
           </w:p>
         </w:tc>
         <w:tc>
           <w:tcPr>
-            <w:tcW w:w="7645" w:type="dxa"/>
+            <w:tcW w:w="6803" w:type="dxa"/>
             <w:shd w:val="clear" w:color="auto" w:fill="D9D9D9"/>
           </w:tcPr>
           <w:p>
@@ -1173,7 +1342,7 @@
         </w:tc>
         <w:tc>
           <w:tcPr>
-            <w:tcW w:w="7645" w:type="dxa"/>
+            <w:tcW w:w="6803" w:type="dxa"/>
             <w:shd w:val="clear" w:color="auto" w:fill="D9D9D9"/>
           </w:tcPr>
           <w:p>
@@ -1270,7 +1439,7 @@
         </w:tc>
         <w:tc>
           <w:tcPr>
-            <w:tcW w:w="7645" w:type="dxa"/>
+            <w:tcW w:w="6803" w:type="dxa"/>
             <w:shd w:val="clear" w:color="auto" w:fill="D9D9D9"/>
           </w:tcPr>
           <w:p>
@@ -1299,13 +1468,41 @@
               </w:rPr>
               <w:t xml:space="preserve">Não ressoa com o organismo. </w:t>
             </w:r>
+            <w:proofErr w:type="spellStart"/>
             <w:r>
               <w:rPr>
                 <w:rFonts w:ascii="Calibri" w:eastAsia="Calibri" w:hAnsi="Calibri" w:cs="Calibri"/>
                 <w:sz w:val="20"/>
                 <w:szCs w:val="20"/>
               </w:rPr>
-              <w:t>Ausência de carga tóxica.</w:t>
+              <w:t>Ausência</w:t>
+            </w:r>
+            <w:proofErr w:type="spellEnd"/>
+            <w:r>
+              <w:rPr>
+                <w:rFonts w:ascii="Calibri" w:eastAsia="Calibri" w:hAnsi="Calibri" w:cs="Calibri"/>
+                <w:sz w:val="20"/>
+                <w:szCs w:val="20"/>
+              </w:rPr>
+              <w:t xml:space="preserve"> de carga </w:t>
+            </w:r>
+            <w:proofErr w:type="spellStart"/>
+            <w:r>
+              <w:rPr>
+                <w:rFonts w:ascii="Calibri" w:eastAsia="Calibri" w:hAnsi="Calibri" w:cs="Calibri"/>
+                <w:sz w:val="20"/>
+                <w:szCs w:val="20"/>
+              </w:rPr>
+              <w:t>tóxica</w:t>
+            </w:r>
+            <w:proofErr w:type="spellEnd"/>
+            <w:r>
+              <w:rPr>
+                <w:rFonts w:ascii="Calibri" w:eastAsia="Calibri" w:hAnsi="Calibri" w:cs="Calibri"/>
+                <w:sz w:val="20"/>
+                <w:szCs w:val="20"/>
+              </w:rPr>
+              <w:t>.</w:t>
             </w:r>
           </w:p>
         </w:tc>
@@ -1344,8 +1541,18 @@
                 <w:sz w:val="20"/>
                 <w:szCs w:val="20"/>
               </w:rPr>
-              <w:t>Campo morfogenético</w:t>
-            </w:r>
+              <w:t xml:space="preserve">Campo </w:t>
+            </w:r>
+            <w:proofErr w:type="spellStart"/>
+            <w:r>
+              <w:rPr>
+                <w:rFonts w:ascii="Calibri" w:eastAsia="Calibri" w:hAnsi="Calibri" w:cs="Calibri"/>
+                <w:sz w:val="20"/>
+                <w:szCs w:val="20"/>
+              </w:rPr>
+              <w:t>morfogenético</w:t>
+            </w:r>
+            <w:proofErr w:type="spellEnd"/>
           </w:p>
         </w:tc>
         <w:tc>
@@ -1374,29 +1581,13 @@
                 <w:sz w:val="20"/>
                 <w:szCs w:val="20"/>
               </w:rPr>
-              <w:t xml:space="preserve">0 </w:t>
-            </w:r>
-            <w:r>
-              <w:rPr>
-                <w:rFonts w:ascii="Calibri" w:eastAsia="Calibri" w:hAnsi="Calibri" w:cs="Calibri"/>
-                <w:sz w:val="20"/>
-                <w:szCs w:val="20"/>
-              </w:rPr>
-              <w:t>–</w:t>
-            </w:r>
-            <w:r>
-              <w:rPr>
-                <w:rFonts w:ascii="Calibri" w:eastAsia="Calibri" w:hAnsi="Calibri" w:cs="Calibri"/>
-                <w:sz w:val="20"/>
-                <w:szCs w:val="20"/>
-              </w:rPr>
-              <w:t xml:space="preserve"> 0,300</w:t>
+              <w:t>0 – 0,300</w:t>
             </w:r>
           </w:p>
         </w:tc>
         <w:tc>
           <w:tcPr>
-            <w:tcW w:w="7645" w:type="dxa"/>
+            <w:tcW w:w="6803" w:type="dxa"/>
             <w:vAlign w:val="center"/>
           </w:tcPr>
           <w:p>
@@ -1424,7 +1615,27 @@
                 <w:szCs w:val="20"/>
                 <w:lang w:val="pt-BR"/>
               </w:rPr>
-              <w:t>Emoção ativa e ressoante que está afetando os campos  emocional/mental no momento.</w:t>
+              <w:t xml:space="preserve">Emoção ativa e ressoante que está afetando os </w:t>
+            </w:r>
+            <w:proofErr w:type="gramStart"/>
+            <w:r>
+              <w:rPr>
+                <w:rFonts w:ascii="Calibri" w:eastAsia="Calibri" w:hAnsi="Calibri" w:cs="Calibri"/>
+                <w:sz w:val="20"/>
+                <w:szCs w:val="20"/>
+                <w:lang w:val="pt-BR"/>
+              </w:rPr>
+              <w:t>campos  emocional</w:t>
+            </w:r>
+            <w:proofErr w:type="gramEnd"/>
+            <w:r>
+              <w:rPr>
+                <w:rFonts w:ascii="Calibri" w:eastAsia="Calibri" w:hAnsi="Calibri" w:cs="Calibri"/>
+                <w:sz w:val="20"/>
+                <w:szCs w:val="20"/>
+                <w:lang w:val="pt-BR"/>
+              </w:rPr>
+              <w:t>/mental no momento.</w:t>
             </w:r>
           </w:p>
         </w:tc>
@@ -1485,29 +1696,13 @@
                 <w:sz w:val="20"/>
                 <w:szCs w:val="20"/>
               </w:rPr>
-              <w:t xml:space="preserve">0,300 </w:t>
-            </w:r>
-            <w:r>
-              <w:rPr>
-                <w:rFonts w:ascii="Calibri" w:eastAsia="Calibri" w:hAnsi="Calibri" w:cs="Calibri"/>
-                <w:sz w:val="20"/>
-                <w:szCs w:val="20"/>
-              </w:rPr>
-              <w:t>–</w:t>
-            </w:r>
-            <w:r>
-              <w:rPr>
-                <w:rFonts w:ascii="Calibri" w:eastAsia="Calibri" w:hAnsi="Calibri" w:cs="Calibri"/>
-                <w:sz w:val="20"/>
-                <w:szCs w:val="20"/>
-              </w:rPr>
-              <w:t xml:space="preserve"> 0,700</w:t>
+              <w:t>0,300 – 0,700</w:t>
             </w:r>
           </w:p>
         </w:tc>
         <w:tc>
           <w:tcPr>
-            <w:tcW w:w="7645" w:type="dxa"/>
+            <w:tcW w:w="6803" w:type="dxa"/>
             <w:vAlign w:val="center"/>
           </w:tcPr>
           <w:p>
@@ -1542,7 +1737,115 @@
                 <w:sz w:val="20"/>
                 <w:szCs w:val="20"/>
               </w:rPr>
-              <w:t>Pode estar ligada a memórias ou padrões recorrentes.</w:t>
+              <w:t xml:space="preserve">Pode </w:t>
+            </w:r>
+            <w:proofErr w:type="spellStart"/>
+            <w:r>
+              <w:rPr>
+                <w:rFonts w:ascii="Calibri" w:eastAsia="Calibri" w:hAnsi="Calibri" w:cs="Calibri"/>
+                <w:sz w:val="20"/>
+                <w:szCs w:val="20"/>
+              </w:rPr>
+              <w:t>estar</w:t>
+            </w:r>
+            <w:proofErr w:type="spellEnd"/>
+            <w:r>
+              <w:rPr>
+                <w:rFonts w:ascii="Calibri" w:eastAsia="Calibri" w:hAnsi="Calibri" w:cs="Calibri"/>
+                <w:sz w:val="20"/>
+                <w:szCs w:val="20"/>
+              </w:rPr>
+              <w:t xml:space="preserve"> </w:t>
+            </w:r>
+            <w:proofErr w:type="spellStart"/>
+            <w:r>
+              <w:rPr>
+                <w:rFonts w:ascii="Calibri" w:eastAsia="Calibri" w:hAnsi="Calibri" w:cs="Calibri"/>
+                <w:sz w:val="20"/>
+                <w:szCs w:val="20"/>
+              </w:rPr>
+              <w:t>ligada</w:t>
+            </w:r>
+            <w:proofErr w:type="spellEnd"/>
+            <w:r>
+              <w:rPr>
+                <w:rFonts w:ascii="Calibri" w:eastAsia="Calibri" w:hAnsi="Calibri" w:cs="Calibri"/>
+                <w:sz w:val="20"/>
+                <w:szCs w:val="20"/>
+              </w:rPr>
+              <w:t xml:space="preserve"> a </w:t>
+            </w:r>
+            <w:proofErr w:type="spellStart"/>
+            <w:r>
+              <w:rPr>
+                <w:rFonts w:ascii="Calibri" w:eastAsia="Calibri" w:hAnsi="Calibri" w:cs="Calibri"/>
+                <w:sz w:val="20"/>
+                <w:szCs w:val="20"/>
+              </w:rPr>
+              <w:t>memórias</w:t>
+            </w:r>
+            <w:proofErr w:type="spellEnd"/>
+            <w:r>
+              <w:rPr>
+                <w:rFonts w:ascii="Calibri" w:eastAsia="Calibri" w:hAnsi="Calibri" w:cs="Calibri"/>
+                <w:sz w:val="20"/>
+                <w:szCs w:val="20"/>
+              </w:rPr>
+              <w:t xml:space="preserve"> </w:t>
+            </w:r>
+            <w:proofErr w:type="spellStart"/>
+            <w:r>
+              <w:rPr>
+                <w:rFonts w:ascii="Calibri" w:eastAsia="Calibri" w:hAnsi="Calibri" w:cs="Calibri"/>
+                <w:sz w:val="20"/>
+                <w:szCs w:val="20"/>
+              </w:rPr>
+              <w:t>ou</w:t>
+            </w:r>
+            <w:proofErr w:type="spellEnd"/>
+            <w:r>
+              <w:rPr>
+                <w:rFonts w:ascii="Calibri" w:eastAsia="Calibri" w:hAnsi="Calibri" w:cs="Calibri"/>
+                <w:sz w:val="20"/>
+                <w:szCs w:val="20"/>
+              </w:rPr>
+              <w:t xml:space="preserve"> </w:t>
+            </w:r>
+            <w:proofErr w:type="spellStart"/>
+            <w:r>
+              <w:rPr>
+                <w:rFonts w:ascii="Calibri" w:eastAsia="Calibri" w:hAnsi="Calibri" w:cs="Calibri"/>
+                <w:sz w:val="20"/>
+                <w:szCs w:val="20"/>
+              </w:rPr>
+              <w:t>padrões</w:t>
+            </w:r>
+            <w:proofErr w:type="spellEnd"/>
+            <w:r>
+              <w:rPr>
+                <w:rFonts w:ascii="Calibri" w:eastAsia="Calibri" w:hAnsi="Calibri" w:cs="Calibri"/>
+                <w:sz w:val="20"/>
+                <w:szCs w:val="20"/>
+              </w:rPr>
+              <w:t xml:space="preserve"> </w:t>
+            </w:r>
+            <w:proofErr w:type="spellStart"/>
+            <w:r>
+              <w:rPr>
+                <w:rFonts w:ascii="Calibri" w:eastAsia="Calibri" w:hAnsi="Calibri" w:cs="Calibri"/>
+                <w:sz w:val="20"/>
+                <w:szCs w:val="20"/>
+              </w:rPr>
+              <w:t>recorrentes</w:t>
+            </w:r>
+            <w:proofErr w:type="spellEnd"/>
+            <w:r>
+              <w:rPr>
+                <w:rFonts w:ascii="Calibri" w:eastAsia="Calibri" w:hAnsi="Calibri" w:cs="Calibri"/>
+                <w:sz w:val="20"/>
+                <w:szCs w:val="20"/>
+              </w:rPr>
+              <w:t>.</w:t>
             </w:r>
           </w:p>
         </w:tc>
@@ -1608,7 +1911,7 @@
         </w:tc>
         <w:tc>
           <w:tcPr>
-            <w:tcW w:w="7645" w:type="dxa"/>
+            <w:tcW w:w="6803" w:type="dxa"/>
             <w:vAlign w:val="center"/>
           </w:tcPr>
           <w:p>
@@ -1703,7 +2006,7 @@
         </w:tc>
         <w:tc>
           <w:tcPr>
-            <w:tcW w:w="7645" w:type="dxa"/>
+            <w:tcW w:w="6803" w:type="dxa"/>
             <w:vAlign w:val="center"/>
           </w:tcPr>
           <w:p>
@@ -1793,29 +2096,13 @@
                 <w:sz w:val="20"/>
                 <w:szCs w:val="20"/>
               </w:rPr>
-              <w:t xml:space="preserve">0 </w:t>
-            </w:r>
-            <w:r>
-              <w:rPr>
-                <w:rFonts w:ascii="Calibri" w:eastAsia="Calibri" w:hAnsi="Calibri" w:cs="Calibri"/>
-                <w:sz w:val="20"/>
-                <w:szCs w:val="20"/>
-              </w:rPr>
-              <w:t>–</w:t>
-            </w:r>
-            <w:r>
-              <w:rPr>
-                <w:rFonts w:ascii="Calibri" w:eastAsia="Calibri" w:hAnsi="Calibri" w:cs="Calibri"/>
-                <w:sz w:val="20"/>
-                <w:szCs w:val="20"/>
-              </w:rPr>
-              <w:t xml:space="preserve"> 0,300</w:t>
+              <w:t>0 – 0,300</w:t>
             </w:r>
           </w:p>
         </w:tc>
         <w:tc>
           <w:tcPr>
-            <w:tcW w:w="7645" w:type="dxa"/>
+            <w:tcW w:w="6803" w:type="dxa"/>
             <w:shd w:val="clear" w:color="auto" w:fill="D9D9D9"/>
             <w:tcMar>
               <w:top w:w="0" w:type="dxa"/>
@@ -1908,29 +2195,13 @@
                 <w:sz w:val="20"/>
                 <w:szCs w:val="20"/>
               </w:rPr>
-              <w:t xml:space="preserve">0,300 </w:t>
-            </w:r>
-            <w:r>
-              <w:rPr>
-                <w:rFonts w:ascii="Calibri" w:eastAsia="Calibri" w:hAnsi="Calibri" w:cs="Calibri"/>
-                <w:sz w:val="20"/>
-                <w:szCs w:val="20"/>
-              </w:rPr>
-              <w:t>–</w:t>
-            </w:r>
-            <w:r>
-              <w:rPr>
-                <w:rFonts w:ascii="Calibri" w:eastAsia="Calibri" w:hAnsi="Calibri" w:cs="Calibri"/>
-                <w:sz w:val="20"/>
-                <w:szCs w:val="20"/>
-              </w:rPr>
-              <w:t xml:space="preserve"> 0,700</w:t>
+              <w:t>0,300 – 0,700</w:t>
             </w:r>
           </w:p>
         </w:tc>
         <w:tc>
           <w:tcPr>
-            <w:tcW w:w="7645" w:type="dxa"/>
+            <w:tcW w:w="6803" w:type="dxa"/>
             <w:shd w:val="clear" w:color="auto" w:fill="D9D9D9"/>
             <w:tcMar>
               <w:top w:w="0" w:type="dxa"/>
@@ -2032,7 +2303,7 @@
         </w:tc>
         <w:tc>
           <w:tcPr>
-            <w:tcW w:w="7645" w:type="dxa"/>
+            <w:tcW w:w="6803" w:type="dxa"/>
             <w:shd w:val="clear" w:color="auto" w:fill="D9D9D9"/>
             <w:tcMar>
               <w:top w:w="0" w:type="dxa"/>
@@ -2127,7 +2398,7 @@
         </w:tc>
         <w:tc>
           <w:tcPr>
-            <w:tcW w:w="7645" w:type="dxa"/>
+            <w:tcW w:w="6803" w:type="dxa"/>
             <w:shd w:val="clear" w:color="auto" w:fill="D9D9D9"/>
             <w:tcMar>
               <w:top w:w="0" w:type="dxa"/>
@@ -2157,6 +2428,286 @@
                 <w:lang w:val="pt-BR"/>
               </w:rPr>
               <w:t>Incompatível – potencial alergênico, inflamatório ou intoxicante.</w:t>
+            </w:r>
+          </w:p>
+        </w:tc>
+      </w:tr>
+      <w:tr>
+        <w:tc>
+          <w:tcPr>
+            <w:tcW w:w="1423" w:type="dxa"/>
+            <w:vMerge w:val="restart"/>
+            <w:vAlign w:val="center"/>
+          </w:tcPr>
+          <w:p>
+            <w:pPr>
+              <w:widowControl w:val="0"/>
+              <w:pBdr>
+                <w:top w:val="nil"/>
+                <w:left w:val="nil"/>
+                <w:bottom w:val="nil"/>
+                <w:right w:val="nil"/>
+                <w:between w:val="nil"/>
+              </w:pBdr>
+              <w:spacing w:after="0"/>
+              <w:jc w:val="center"/>
+              <w:rPr>
+                <w:rFonts w:ascii="Calibri" w:eastAsia="Calibri" w:hAnsi="Calibri" w:cs="Calibri"/>
+                <w:sz w:val="20"/>
+                <w:szCs w:val="20"/>
+              </w:rPr>
+            </w:pPr>
+            <w:proofErr w:type="spellStart"/>
+            <w:r>
+              <w:rPr>
+                <w:rFonts w:ascii="Calibri" w:eastAsia="Calibri" w:hAnsi="Calibri" w:cs="Calibri"/>
+                <w:sz w:val="20"/>
+                <w:szCs w:val="20"/>
+              </w:rPr>
+              <w:t>Patologias</w:t>
+            </w:r>
+            <w:proofErr w:type="spellEnd"/>
+          </w:p>
+        </w:tc>
+        <w:tc>
+          <w:tcPr>
+            <w:tcW w:w="1417" w:type="dxa"/>
+            <w:tcMar>
+              <w:top w:w="0" w:type="dxa"/>
+              <w:left w:w="108" w:type="dxa"/>
+              <w:bottom w:w="0" w:type="dxa"/>
+              <w:right w:w="108" w:type="dxa"/>
+            </w:tcMar>
+          </w:tcPr>
+          <w:p>
+            <w:pPr>
+              <w:spacing w:after="0" w:line="240" w:lineRule="auto"/>
+              <w:jc w:val="center"/>
+              <w:rPr>
+                <w:rFonts w:ascii="Calibri" w:eastAsia="Calibri" w:hAnsi="Calibri" w:cs="Calibri"/>
+                <w:sz w:val="20"/>
+                <w:szCs w:val="20"/>
+              </w:rPr>
+            </w:pPr>
+            <w:r>
+              <w:rPr>
+                <w:rFonts w:ascii="Calibri" w:eastAsia="Calibri" w:hAnsi="Calibri" w:cs="Calibri"/>
+                <w:sz w:val="20"/>
+                <w:szCs w:val="20"/>
+              </w:rPr>
+              <w:t>0 – 0,300</w:t>
+            </w:r>
+          </w:p>
+        </w:tc>
+        <w:tc>
+          <w:tcPr>
+            <w:tcW w:w="6803" w:type="dxa"/>
+            <w:tcMar>
+              <w:top w:w="0" w:type="dxa"/>
+              <w:left w:w="108" w:type="dxa"/>
+              <w:bottom w:w="0" w:type="dxa"/>
+              <w:right w:w="108" w:type="dxa"/>
+            </w:tcMar>
+          </w:tcPr>
+          <w:p>
+            <w:pPr>
+              <w:spacing w:after="0" w:line="240" w:lineRule="auto"/>
+              <w:rPr>
+                <w:rFonts w:ascii="Calibri" w:eastAsia="Calibri" w:hAnsi="Calibri" w:cs="Calibri"/>
+                <w:sz w:val="20"/>
+                <w:szCs w:val="20"/>
+                <w:lang w:val="pt-BR"/>
+              </w:rPr>
+            </w:pPr>
+            <w:r>
+              <w:rPr>
+                <w:rFonts w:ascii="Calibri" w:hAnsi="Calibri" w:cs="Calibri"/>
+                <w:color w:val="000000"/>
+                <w:sz w:val="20"/>
+                <w:szCs w:val="20"/>
+                <w:lang w:val="pt-BR"/>
+              </w:rPr>
+              <w:t>Processo altamente provável. Pode haver sintomas visíveis.</w:t>
+            </w:r>
+          </w:p>
+        </w:tc>
+      </w:tr>
+      <w:tr>
+        <w:tc>
+          <w:tcPr>
+            <w:tcW w:w="1423" w:type="dxa"/>
+            <w:vMerge/>
+            <w:vAlign w:val="center"/>
+          </w:tcPr>
+          <w:p>
+            <w:pPr>
+              <w:widowControl w:val="0"/>
+              <w:pBdr>
+                <w:top w:val="nil"/>
+                <w:left w:val="nil"/>
+                <w:bottom w:val="nil"/>
+                <w:right w:val="nil"/>
+                <w:between w:val="nil"/>
+              </w:pBdr>
+              <w:spacing w:after="0"/>
+              <w:rPr>
+                <w:rFonts w:ascii="Calibri" w:eastAsia="Calibri" w:hAnsi="Calibri" w:cs="Calibri"/>
+                <w:sz w:val="20"/>
+                <w:szCs w:val="20"/>
+                <w:lang w:val="pt-BR"/>
+              </w:rPr>
+            </w:pPr>
+          </w:p>
+        </w:tc>
+        <w:tc>
+          <w:tcPr>
+            <w:tcW w:w="1417" w:type="dxa"/>
+            <w:tcMar>
+              <w:top w:w="0" w:type="dxa"/>
+              <w:left w:w="108" w:type="dxa"/>
+              <w:bottom w:w="0" w:type="dxa"/>
+              <w:right w:w="108" w:type="dxa"/>
+            </w:tcMar>
+          </w:tcPr>
+          <w:p>
+            <w:pPr>
+              <w:spacing w:after="0" w:line="240" w:lineRule="auto"/>
+              <w:jc w:val="center"/>
+              <w:rPr>
+                <w:rFonts w:ascii="Calibri" w:eastAsia="Calibri" w:hAnsi="Calibri" w:cs="Calibri"/>
+                <w:sz w:val="20"/>
+                <w:szCs w:val="20"/>
+              </w:rPr>
+            </w:pPr>
+            <w:r>
+              <w:rPr>
+                <w:rFonts w:ascii="Calibri" w:eastAsia="Calibri" w:hAnsi="Calibri" w:cs="Calibri"/>
+                <w:sz w:val="20"/>
+                <w:szCs w:val="20"/>
+              </w:rPr>
+              <w:t>0,300 – 0,700</w:t>
+            </w:r>
+          </w:p>
+        </w:tc>
+        <w:tc>
+          <w:tcPr>
+            <w:tcW w:w="6803" w:type="dxa"/>
+            <w:tcMar>
+              <w:top w:w="0" w:type="dxa"/>
+              <w:left w:w="108" w:type="dxa"/>
+              <w:bottom w:w="0" w:type="dxa"/>
+              <w:right w:w="108" w:type="dxa"/>
+            </w:tcMar>
+          </w:tcPr>
+          <w:p>
+            <w:pPr>
+              <w:spacing w:after="0" w:line="240" w:lineRule="auto"/>
+              <w:rPr>
+                <w:rFonts w:ascii="Calibri" w:eastAsia="Calibri" w:hAnsi="Calibri" w:cs="Calibri"/>
+                <w:sz w:val="20"/>
+                <w:szCs w:val="20"/>
+                <w:lang w:val="pt-BR"/>
+              </w:rPr>
+            </w:pPr>
+            <w:r>
+              <w:rPr>
+                <w:rFonts w:ascii="Calibri" w:hAnsi="Calibri" w:cs="Calibri"/>
+                <w:color w:val="000000"/>
+                <w:sz w:val="20"/>
+                <w:szCs w:val="20"/>
+                <w:lang w:val="pt-BR"/>
+              </w:rPr>
+              <w:t>Fase de desenvolvimento inicial, subclínica.</w:t>
+            </w:r>
+          </w:p>
+        </w:tc>
+      </w:tr>
+      <w:tr>
+        <w:tc>
+          <w:tcPr>
+            <w:tcW w:w="1423" w:type="dxa"/>
+            <w:vMerge/>
+            <w:vAlign w:val="center"/>
+          </w:tcPr>
+          <w:p>
+            <w:pPr>
+              <w:widowControl w:val="0"/>
+              <w:pBdr>
+                <w:top w:val="nil"/>
+                <w:left w:val="nil"/>
+                <w:bottom w:val="nil"/>
+                <w:right w:val="nil"/>
+                <w:between w:val="nil"/>
+              </w:pBdr>
+              <w:spacing w:after="0"/>
+              <w:rPr>
+                <w:rFonts w:ascii="Calibri" w:eastAsia="Calibri" w:hAnsi="Calibri" w:cs="Calibri"/>
+                <w:sz w:val="20"/>
+                <w:szCs w:val="20"/>
+                <w:lang w:val="pt-BR"/>
+              </w:rPr>
+            </w:pPr>
+          </w:p>
+        </w:tc>
+        <w:tc>
+          <w:tcPr>
+            <w:tcW w:w="1417" w:type="dxa"/>
+            <w:tcMar>
+              <w:top w:w="0" w:type="dxa"/>
+              <w:left w:w="108" w:type="dxa"/>
+              <w:bottom w:w="0" w:type="dxa"/>
+              <w:right w:w="108" w:type="dxa"/>
+            </w:tcMar>
+          </w:tcPr>
+          <w:p>
+            <w:pPr>
+              <w:spacing w:after="0" w:line="240" w:lineRule="auto"/>
+              <w:jc w:val="center"/>
+              <w:rPr>
+                <w:rFonts w:ascii="Calibri" w:eastAsia="Calibri" w:hAnsi="Calibri" w:cs="Calibri"/>
+                <w:sz w:val="20"/>
+                <w:szCs w:val="20"/>
+              </w:rPr>
+            </w:pPr>
+            <w:r>
+              <w:rPr>
+                <w:rFonts w:ascii="Calibri" w:eastAsia="Calibri" w:hAnsi="Calibri" w:cs="Calibri"/>
+                <w:sz w:val="20"/>
+                <w:szCs w:val="20"/>
+              </w:rPr>
+              <w:t>0,710 -1,000</w:t>
+            </w:r>
+          </w:p>
+        </w:tc>
+        <w:tc>
+          <w:tcPr>
+            <w:tcW w:w="6803" w:type="dxa"/>
+            <w:tcMar>
+              <w:top w:w="0" w:type="dxa"/>
+              <w:left w:w="108" w:type="dxa"/>
+              <w:bottom w:w="0" w:type="dxa"/>
+              <w:right w:w="108" w:type="dxa"/>
+            </w:tcMar>
+          </w:tcPr>
+          <w:p>
+            <w:pPr>
+              <w:spacing w:after="0" w:line="240" w:lineRule="auto"/>
+              <w:rPr>
+                <w:rFonts w:ascii="Calibri" w:eastAsia="Calibri" w:hAnsi="Calibri" w:cs="Calibri"/>
+                <w:sz w:val="20"/>
+                <w:szCs w:val="20"/>
+                <w:lang w:val="pt-BR"/>
+              </w:rPr>
+            </w:pPr>
+            <w:r>
+              <w:rPr>
+                <w:rFonts w:ascii="Calibri" w:hAnsi="Calibri" w:cs="Calibri"/>
+                <w:color w:val="000000"/>
+                <w:sz w:val="20"/>
+                <w:szCs w:val="20"/>
+                <w:lang w:val="pt-BR"/>
+              </w:rPr>
+              <w:t>Sem expressão ativa, mas pode estar em latência ou ser um traço genético.</w:t>
             </w:r>
           </w:p>
         </w:tc>
@@ -2306,6 +2857,7 @@
               </w:rPr>
               <w:t xml:space="preserve">{%tr for k, v in </w:t>
             </w:r>
+            <w:proofErr w:type="spellStart"/>
             <w:r>
               <w:rPr>
                 <w:rFonts w:ascii="Calibri" w:eastAsia="Calibri" w:hAnsi="Calibri" w:cs="Calibri"/>
@@ -2325,13 +2877,29 @@
                 <w:rFonts w:ascii="Calibri" w:eastAsia="Calibri" w:hAnsi="Calibri" w:cs="Calibri"/>
                 <w:lang w:val="en-US"/>
               </w:rPr>
-              <w:t>_patologies</w:t>
-            </w:r>
-            <w:r>
-              <w:rPr>
-                <w:rFonts w:ascii="Calibri" w:eastAsia="Calibri" w:hAnsi="Calibri" w:cs="Calibri"/>
-              </w:rPr>
-              <w:t>.items()%}</w:t>
+              <w:t>_</w:t>
+            </w:r>
+            <w:proofErr w:type="gramStart"/>
+            <w:r>
+              <w:rPr>
+                <w:rFonts w:ascii="Calibri" w:eastAsia="Calibri" w:hAnsi="Calibri" w:cs="Calibri"/>
+                <w:lang w:val="en-US"/>
+              </w:rPr>
+              <w:t>patologies</w:t>
+            </w:r>
+            <w:proofErr w:type="spellEnd"/>
+            <w:r>
+              <w:rPr>
+                <w:rFonts w:ascii="Calibri" w:eastAsia="Calibri" w:hAnsi="Calibri" w:cs="Calibri"/>
+              </w:rPr>
+              <w:t>.items()%</w:t>
+            </w:r>
+            <w:proofErr w:type="gramEnd"/>
+            <w:r>
+              <w:rPr>
+                <w:rFonts w:ascii="Calibri" w:eastAsia="Calibri" w:hAnsi="Calibri" w:cs="Calibri"/>
+              </w:rPr>
+              <w:t>}</w:t>
             </w:r>
           </w:p>
         </w:tc>
@@ -2415,7 +2983,21 @@
               <w:rPr>
                 <w:rFonts w:ascii="Calibri" w:eastAsia="Calibri" w:hAnsi="Calibri" w:cs="Calibri"/>
               </w:rPr>
-              <w:t>{%tr endfor %}</w:t>
+              <w:t xml:space="preserve">{%tr </w:t>
+            </w:r>
+            <w:proofErr w:type="spellStart"/>
+            <w:r>
+              <w:rPr>
+                <w:rFonts w:ascii="Calibri" w:eastAsia="Calibri" w:hAnsi="Calibri" w:cs="Calibri"/>
+              </w:rPr>
+              <w:t>endfor</w:t>
+            </w:r>
+            <w:proofErr w:type="spellEnd"/>
+            <w:r>
+              <w:rPr>
+                <w:rFonts w:ascii="Calibri" w:eastAsia="Calibri" w:hAnsi="Calibri" w:cs="Calibri"/>
+              </w:rPr>
+              <w:t xml:space="preserve"> %}</w:t>
             </w:r>
           </w:p>
         </w:tc>
@@ -2453,6 +3035,7 @@
       <w:tr>
         <w:trPr>
           <w:trHeight w:val="279"/>
+          <w:tblHeader/>
         </w:trPr>
         <w:tc>
           <w:tcPr>
@@ -2582,7 +3165,21 @@
               <w:rPr>
                 <w:rFonts w:ascii="Calibri" w:eastAsia="Calibri" w:hAnsi="Calibri" w:cs="Calibri"/>
               </w:rPr>
-              <w:t>{%tr for item in table_microorganism%}</w:t>
+              <w:t xml:space="preserve">{%tr for item in </w:t>
+            </w:r>
+            <w:proofErr w:type="spellStart"/>
+            <w:r>
+              <w:rPr>
+                <w:rFonts w:ascii="Calibri" w:eastAsia="Calibri" w:hAnsi="Calibri" w:cs="Calibri"/>
+              </w:rPr>
+              <w:t>table_microorganism</w:t>
+            </w:r>
+            <w:proofErr w:type="spellEnd"/>
+            <w:r>
+              <w:rPr>
+                <w:rFonts w:ascii="Calibri" w:eastAsia="Calibri" w:hAnsi="Calibri" w:cs="Calibri"/>
+              </w:rPr>
+              <w:t>%}</w:t>
             </w:r>
           </w:p>
         </w:tc>
@@ -2608,7 +3205,27 @@
                 <w:b/>
                 <w:bCs/>
               </w:rPr>
-              <w:t>{{item.nome}}</w:t>
+              <w:t>{{</w:t>
+            </w:r>
+            <w:proofErr w:type="spellStart"/>
+            <w:proofErr w:type="gramStart"/>
+            <w:r>
+              <w:rPr>
+                <w:rFonts w:ascii="Calibri" w:eastAsia="Calibri" w:hAnsi="Calibri" w:cs="Calibri"/>
+                <w:b/>
+                <w:bCs/>
+              </w:rPr>
+              <w:t>item.nome</w:t>
+            </w:r>
+            <w:proofErr w:type="spellEnd"/>
+            <w:proofErr w:type="gramEnd"/>
+            <w:r>
+              <w:rPr>
+                <w:rFonts w:ascii="Calibri" w:eastAsia="Calibri" w:hAnsi="Calibri" w:cs="Calibri"/>
+                <w:b/>
+                <w:bCs/>
+              </w:rPr>
+              <w:t>}}</w:t>
             </w:r>
             <w:r>
               <w:rPr>
@@ -2620,7 +3237,23 @@
               <w:rPr>
                 <w:rFonts w:ascii="Calibri" w:eastAsia="Calibri" w:hAnsi="Calibri" w:cs="Calibri"/>
               </w:rPr>
-              <w:t>{{item.tipo}}</w:t>
+              <w:t>{{</w:t>
+            </w:r>
+            <w:proofErr w:type="spellStart"/>
+            <w:proofErr w:type="gramStart"/>
+            <w:r>
+              <w:rPr>
+                <w:rFonts w:ascii="Calibri" w:eastAsia="Calibri" w:hAnsi="Calibri" w:cs="Calibri"/>
+              </w:rPr>
+              <w:t>item.tipo</w:t>
+            </w:r>
+            <w:proofErr w:type="spellEnd"/>
+            <w:proofErr w:type="gramEnd"/>
+            <w:r>
+              <w:rPr>
+                <w:rFonts w:ascii="Calibri" w:eastAsia="Calibri" w:hAnsi="Calibri" w:cs="Calibri"/>
+              </w:rPr>
+              <w:t>}}</w:t>
             </w:r>
             <w:r>
               <w:rPr>
@@ -2644,7 +3277,23 @@
               <w:rPr>
                 <w:rFonts w:ascii="Calibri" w:eastAsia="Calibri" w:hAnsi="Calibri" w:cs="Calibri"/>
               </w:rPr>
-              <w:t>{{item.sintomas}}</w:t>
+              <w:t>{{</w:t>
+            </w:r>
+            <w:proofErr w:type="spellStart"/>
+            <w:proofErr w:type="gramStart"/>
+            <w:r>
+              <w:rPr>
+                <w:rFonts w:ascii="Calibri" w:eastAsia="Calibri" w:hAnsi="Calibri" w:cs="Calibri"/>
+              </w:rPr>
+              <w:t>item.sintomas</w:t>
+            </w:r>
+            <w:proofErr w:type="spellEnd"/>
+            <w:proofErr w:type="gramEnd"/>
+            <w:r>
+              <w:rPr>
+                <w:rFonts w:ascii="Calibri" w:eastAsia="Calibri" w:hAnsi="Calibri" w:cs="Calibri"/>
+              </w:rPr>
+              <w:t>}}</w:t>
             </w:r>
           </w:p>
         </w:tc>
@@ -2664,7 +3313,23 @@
               <w:rPr>
                 <w:rFonts w:ascii="Calibri" w:eastAsia="Calibri" w:hAnsi="Calibri" w:cs="Calibri"/>
               </w:rPr>
-              <w:t>{{item.D}}</w:t>
+              <w:t>{{</w:t>
+            </w:r>
+            <w:proofErr w:type="spellStart"/>
+            <w:proofErr w:type="gramStart"/>
+            <w:r>
+              <w:rPr>
+                <w:rFonts w:ascii="Calibri" w:eastAsia="Calibri" w:hAnsi="Calibri" w:cs="Calibri"/>
+              </w:rPr>
+              <w:t>item.D</w:t>
+            </w:r>
+            <w:proofErr w:type="spellEnd"/>
+            <w:proofErr w:type="gramEnd"/>
+            <w:r>
+              <w:rPr>
+                <w:rFonts w:ascii="Calibri" w:eastAsia="Calibri" w:hAnsi="Calibri" w:cs="Calibri"/>
+              </w:rPr>
+              <w:t>}}</w:t>
             </w:r>
           </w:p>
         </w:tc>
@@ -2690,12 +3355,70 @@
               <w:rPr>
                 <w:rFonts w:ascii="Calibri" w:eastAsia="Calibri" w:hAnsi="Calibri" w:cs="Calibri"/>
               </w:rPr>
-              <w:t>{%tr endfor %}</w:t>
+              <w:t xml:space="preserve">{%tr </w:t>
+            </w:r>
+            <w:proofErr w:type="spellStart"/>
+            <w:r>
+              <w:rPr>
+                <w:rFonts w:ascii="Calibri" w:eastAsia="Calibri" w:hAnsi="Calibri" w:cs="Calibri"/>
+              </w:rPr>
+              <w:t>endfor</w:t>
+            </w:r>
+            <w:proofErr w:type="spellEnd"/>
+            <w:r>
+              <w:rPr>
+                <w:rFonts w:ascii="Calibri" w:eastAsia="Calibri" w:hAnsi="Calibri" w:cs="Calibri"/>
+              </w:rPr>
+              <w:t xml:space="preserve"> %}</w:t>
             </w:r>
           </w:p>
         </w:tc>
       </w:tr>
     </w:tbl>
+    <w:p>
+      <w:pPr>
+        <w:widowControl w:val="0"/>
+        <w:spacing w:after="0"/>
+        <w:rPr>
+          <w:rFonts w:ascii="Calibri" w:eastAsia="Calibri" w:hAnsi="Calibri" w:cs="Calibri"/>
+          <w:sz w:val="12"/>
+          <w:szCs w:val="12"/>
+        </w:rPr>
+      </w:pPr>
+    </w:p>
+    <w:p>
+      <w:pPr>
+        <w:widowControl w:val="0"/>
+        <w:spacing w:after="0"/>
+        <w:rPr>
+          <w:rFonts w:ascii="Calibri" w:eastAsia="Calibri" w:hAnsi="Calibri" w:cs="Calibri"/>
+          <w:sz w:val="12"/>
+          <w:szCs w:val="12"/>
+        </w:rPr>
+      </w:pPr>
+    </w:p>
+    <w:p>
+      <w:pPr>
+        <w:widowControl w:val="0"/>
+        <w:spacing w:after="0"/>
+        <w:rPr>
+          <w:rFonts w:ascii="Calibri" w:eastAsia="Calibri" w:hAnsi="Calibri" w:cs="Calibri"/>
+          <w:sz w:val="12"/>
+          <w:szCs w:val="12"/>
+        </w:rPr>
+      </w:pPr>
+    </w:p>
+    <w:p>
+      <w:pPr>
+        <w:widowControl w:val="0"/>
+        <w:spacing w:after="0"/>
+        <w:rPr>
+          <w:rFonts w:ascii="Calibri" w:eastAsia="Calibri" w:hAnsi="Calibri" w:cs="Calibri"/>
+          <w:sz w:val="12"/>
+          <w:szCs w:val="12"/>
+        </w:rPr>
+      </w:pPr>
+    </w:p>
     <w:p>
       <w:pPr>
         <w:widowControl w:val="0"/>
@@ -2729,6 +3452,7 @@
       <w:tr>
         <w:trPr>
           <w:trHeight w:val="279"/>
+          <w:tblHeader/>
         </w:trPr>
         <w:tc>
           <w:tcPr>
@@ -2753,6 +3477,7 @@
                 <w:bCs/>
                 <w:lang w:val="pt-BR"/>
               </w:rPr>
+              <w:lastRenderedPageBreak/>
               <w:t xml:space="preserve">MICRORGANISMOS DETECTADOS NO </w:t>
             </w:r>
             <w:r>
@@ -2831,7 +3556,14 @@
               <w:rPr>
                 <w:rFonts w:ascii="Calibri" w:eastAsia="Calibri" w:hAnsi="Calibri" w:cs="Calibri"/>
               </w:rPr>
-              <w:t>{%tr for item in tab</w:t>
+              <w:t xml:space="preserve">{%tr for item in </w:t>
+            </w:r>
+            <w:proofErr w:type="spellStart"/>
+            <w:r>
+              <w:rPr>
+                <w:rFonts w:ascii="Calibri" w:eastAsia="Calibri" w:hAnsi="Calibri" w:cs="Calibri"/>
+              </w:rPr>
+              <w:t>tab</w:t>
             </w:r>
             <w:r>
               <w:rPr>
@@ -2839,6 +3571,7 @@
               </w:rPr>
               <w:t>le_prosync</w:t>
             </w:r>
+            <w:proofErr w:type="spellEnd"/>
             <w:r>
               <w:rPr>
                 <w:rFonts w:ascii="Calibri" w:eastAsia="Calibri" w:hAnsi="Calibri" w:cs="Calibri"/>
@@ -2869,13 +3602,49 @@
                 <w:b/>
                 <w:bCs/>
               </w:rPr>
-              <w:t>{{item.nome}}</w:t>
-            </w:r>
-            <w:r>
-              <w:rPr>
-                <w:rFonts w:ascii="Calibri" w:eastAsia="Calibri" w:hAnsi="Calibri" w:cs="Calibri"/>
-              </w:rPr>
-              <w:t xml:space="preserve"> – {{item.tipo}} </w:t>
+              <w:t>{{</w:t>
+            </w:r>
+            <w:proofErr w:type="spellStart"/>
+            <w:proofErr w:type="gramStart"/>
+            <w:r>
+              <w:rPr>
+                <w:rFonts w:ascii="Calibri" w:eastAsia="Calibri" w:hAnsi="Calibri" w:cs="Calibri"/>
+                <w:b/>
+                <w:bCs/>
+              </w:rPr>
+              <w:t>item.nome</w:t>
+            </w:r>
+            <w:proofErr w:type="spellEnd"/>
+            <w:proofErr w:type="gramEnd"/>
+            <w:r>
+              <w:rPr>
+                <w:rFonts w:ascii="Calibri" w:eastAsia="Calibri" w:hAnsi="Calibri" w:cs="Calibri"/>
+                <w:b/>
+                <w:bCs/>
+              </w:rPr>
+              <w:t>}}</w:t>
+            </w:r>
+            <w:r>
+              <w:rPr>
+                <w:rFonts w:ascii="Calibri" w:eastAsia="Calibri" w:hAnsi="Calibri" w:cs="Calibri"/>
+              </w:rPr>
+              <w:t xml:space="preserve"> – {{</w:t>
+            </w:r>
+            <w:proofErr w:type="spellStart"/>
+            <w:proofErr w:type="gramStart"/>
+            <w:r>
+              <w:rPr>
+                <w:rFonts w:ascii="Calibri" w:eastAsia="Calibri" w:hAnsi="Calibri" w:cs="Calibri"/>
+              </w:rPr>
+              <w:t>item.tipo</w:t>
+            </w:r>
+            <w:proofErr w:type="spellEnd"/>
+            <w:proofErr w:type="gramEnd"/>
+            <w:r>
+              <w:rPr>
+                <w:rFonts w:ascii="Calibri" w:eastAsia="Calibri" w:hAnsi="Calibri" w:cs="Calibri"/>
+              </w:rPr>
+              <w:t xml:space="preserve">}} </w:t>
             </w:r>
             <w:r>
               <w:rPr>
@@ -2887,7 +3656,23 @@
               <w:rPr>
                 <w:rFonts w:ascii="Calibri" w:eastAsia="Calibri" w:hAnsi="Calibri" w:cs="Calibri"/>
               </w:rPr>
-              <w:t xml:space="preserve"> {{item.sintomas}}</w:t>
+              <w:t xml:space="preserve"> {{</w:t>
+            </w:r>
+            <w:proofErr w:type="spellStart"/>
+            <w:proofErr w:type="gramStart"/>
+            <w:r>
+              <w:rPr>
+                <w:rFonts w:ascii="Calibri" w:eastAsia="Calibri" w:hAnsi="Calibri" w:cs="Calibri"/>
+              </w:rPr>
+              <w:t>item.sintomas</w:t>
+            </w:r>
+            <w:proofErr w:type="spellEnd"/>
+            <w:proofErr w:type="gramEnd"/>
+            <w:r>
+              <w:rPr>
+                <w:rFonts w:ascii="Calibri" w:eastAsia="Calibri" w:hAnsi="Calibri" w:cs="Calibri"/>
+              </w:rPr>
+              <w:t>}}</w:t>
             </w:r>
           </w:p>
         </w:tc>
@@ -2907,7 +3692,23 @@
               <w:rPr>
                 <w:rFonts w:ascii="Calibri" w:eastAsia="Calibri" w:hAnsi="Calibri" w:cs="Calibri"/>
               </w:rPr>
-              <w:t>{{item.D}}</w:t>
+              <w:t>{{</w:t>
+            </w:r>
+            <w:proofErr w:type="spellStart"/>
+            <w:proofErr w:type="gramStart"/>
+            <w:r>
+              <w:rPr>
+                <w:rFonts w:ascii="Calibri" w:eastAsia="Calibri" w:hAnsi="Calibri" w:cs="Calibri"/>
+              </w:rPr>
+              <w:t>item.D</w:t>
+            </w:r>
+            <w:proofErr w:type="spellEnd"/>
+            <w:proofErr w:type="gramEnd"/>
+            <w:r>
+              <w:rPr>
+                <w:rFonts w:ascii="Calibri" w:eastAsia="Calibri" w:hAnsi="Calibri" w:cs="Calibri"/>
+              </w:rPr>
+              <w:t>}}</w:t>
             </w:r>
           </w:p>
         </w:tc>
@@ -2933,7 +3734,21 @@
               <w:rPr>
                 <w:rFonts w:ascii="Calibri" w:eastAsia="Calibri" w:hAnsi="Calibri" w:cs="Calibri"/>
               </w:rPr>
-              <w:t>{%tr endfor %}</w:t>
+              <w:t xml:space="preserve">{%tr </w:t>
+            </w:r>
+            <w:proofErr w:type="spellStart"/>
+            <w:r>
+              <w:rPr>
+                <w:rFonts w:ascii="Calibri" w:eastAsia="Calibri" w:hAnsi="Calibri" w:cs="Calibri"/>
+              </w:rPr>
+              <w:t>endfor</w:t>
+            </w:r>
+            <w:proofErr w:type="spellEnd"/>
+            <w:r>
+              <w:rPr>
+                <w:rFonts w:ascii="Calibri" w:eastAsia="Calibri" w:hAnsi="Calibri" w:cs="Calibri"/>
+              </w:rPr>
+              <w:t xml:space="preserve"> %}</w:t>
             </w:r>
           </w:p>
         </w:tc>
@@ -3004,6 +3819,9 @@
         <w:gridCol w:w="1139"/>
       </w:tblGrid>
       <w:tr>
+        <w:trPr>
+          <w:tblHeader/>
+        </w:trPr>
         <w:tc>
           <w:tcPr>
             <w:tcW w:w="9498" w:type="dxa"/>
@@ -3027,7 +3845,6 @@
                 <w:bCs/>
                 <w:lang w:val="pt-BR"/>
               </w:rPr>
-              <w:lastRenderedPageBreak/>
               <w:t>TOXINAS E POSSÍVEIS SINTOMAS NO ORGANISMO</w:t>
             </w:r>
           </w:p>
@@ -3076,7 +3893,21 @@
               <w:rPr>
                 <w:rFonts w:ascii="Calibri" w:eastAsia="Calibri" w:hAnsi="Calibri" w:cs="Calibri"/>
               </w:rPr>
-              <w:t>{%tr for item in table_toxins%}</w:t>
+              <w:t xml:space="preserve">{%tr for item in </w:t>
+            </w:r>
+            <w:proofErr w:type="spellStart"/>
+            <w:r>
+              <w:rPr>
+                <w:rFonts w:ascii="Calibri" w:eastAsia="Calibri" w:hAnsi="Calibri" w:cs="Calibri"/>
+              </w:rPr>
+              <w:t>table_toxins</w:t>
+            </w:r>
+            <w:proofErr w:type="spellEnd"/>
+            <w:r>
+              <w:rPr>
+                <w:rFonts w:ascii="Calibri" w:eastAsia="Calibri" w:hAnsi="Calibri" w:cs="Calibri"/>
+              </w:rPr>
+              <w:t>%}</w:t>
             </w:r>
           </w:p>
         </w:tc>
@@ -3101,14 +3932,34 @@
                 <w:b/>
                 <w:bCs/>
               </w:rPr>
-              <w:t>{{item.nome}}</w:t>
-            </w:r>
+              <w:t>{{</w:t>
+            </w:r>
+            <w:proofErr w:type="spellStart"/>
+            <w:proofErr w:type="gramStart"/>
             <w:r>
               <w:rPr>
                 <w:rFonts w:ascii="Calibri" w:eastAsia="Calibri" w:hAnsi="Calibri" w:cs="Calibri"/>
                 <w:b/>
                 <w:bCs/>
               </w:rPr>
+              <w:t>item.nome</w:t>
+            </w:r>
+            <w:proofErr w:type="spellEnd"/>
+            <w:proofErr w:type="gramEnd"/>
+            <w:r>
+              <w:rPr>
+                <w:rFonts w:ascii="Calibri" w:eastAsia="Calibri" w:hAnsi="Calibri" w:cs="Calibri"/>
+                <w:b/>
+                <w:bCs/>
+              </w:rPr>
+              <w:t>}}</w:t>
+            </w:r>
+            <w:r>
+              <w:rPr>
+                <w:rFonts w:ascii="Calibri" w:eastAsia="Calibri" w:hAnsi="Calibri" w:cs="Calibri"/>
+                <w:b/>
+                <w:bCs/>
+              </w:rPr>
               <w:t xml:space="preserve"> </w:t>
             </w:r>
             <w:r>
@@ -3129,7 +3980,23 @@
               <w:rPr>
                 <w:rFonts w:ascii="Calibri" w:eastAsia="Calibri" w:hAnsi="Calibri" w:cs="Calibri"/>
               </w:rPr>
-              <w:t>{{item.efeitos}}</w:t>
+              <w:t>{{</w:t>
+            </w:r>
+            <w:proofErr w:type="spellStart"/>
+            <w:proofErr w:type="gramStart"/>
+            <w:r>
+              <w:rPr>
+                <w:rFonts w:ascii="Calibri" w:eastAsia="Calibri" w:hAnsi="Calibri" w:cs="Calibri"/>
+              </w:rPr>
+              <w:t>item.efeitos</w:t>
+            </w:r>
+            <w:proofErr w:type="spellEnd"/>
+            <w:proofErr w:type="gramEnd"/>
+            <w:r>
+              <w:rPr>
+                <w:rFonts w:ascii="Calibri" w:eastAsia="Calibri" w:hAnsi="Calibri" w:cs="Calibri"/>
+              </w:rPr>
+              <w:t>}}</w:t>
             </w:r>
           </w:p>
         </w:tc>
@@ -3149,7 +4016,23 @@
               <w:rPr>
                 <w:rFonts w:ascii="Calibri" w:eastAsia="Calibri" w:hAnsi="Calibri" w:cs="Calibri"/>
               </w:rPr>
-              <w:t>{{item.D}}</w:t>
+              <w:t>{{</w:t>
+            </w:r>
+            <w:proofErr w:type="spellStart"/>
+            <w:proofErr w:type="gramStart"/>
+            <w:r>
+              <w:rPr>
+                <w:rFonts w:ascii="Calibri" w:eastAsia="Calibri" w:hAnsi="Calibri" w:cs="Calibri"/>
+              </w:rPr>
+              <w:t>item.D</w:t>
+            </w:r>
+            <w:proofErr w:type="spellEnd"/>
+            <w:proofErr w:type="gramEnd"/>
+            <w:r>
+              <w:rPr>
+                <w:rFonts w:ascii="Calibri" w:eastAsia="Calibri" w:hAnsi="Calibri" w:cs="Calibri"/>
+              </w:rPr>
+              <w:t>}}</w:t>
             </w:r>
           </w:p>
         </w:tc>
@@ -3171,7 +4054,21 @@
               <w:rPr>
                 <w:rFonts w:ascii="Calibri" w:eastAsia="Calibri" w:hAnsi="Calibri" w:cs="Calibri"/>
               </w:rPr>
-              <w:t>{%tr endfor %}</w:t>
+              <w:t xml:space="preserve">{%tr </w:t>
+            </w:r>
+            <w:proofErr w:type="spellStart"/>
+            <w:r>
+              <w:rPr>
+                <w:rFonts w:ascii="Calibri" w:eastAsia="Calibri" w:hAnsi="Calibri" w:cs="Calibri"/>
+              </w:rPr>
+              <w:t>endfor</w:t>
+            </w:r>
+            <w:proofErr w:type="spellEnd"/>
+            <w:r>
+              <w:rPr>
+                <w:rFonts w:ascii="Calibri" w:eastAsia="Calibri" w:hAnsi="Calibri" w:cs="Calibri"/>
+              </w:rPr>
+              <w:t xml:space="preserve"> %}</w:t>
             </w:r>
           </w:p>
         </w:tc>
@@ -3232,6 +4129,7 @@
             <w:pPr>
               <w:widowControl w:val="0"/>
               <w:spacing w:after="0"/>
+              <w:jc w:val="center"/>
               <w:rPr>
                 <w:rFonts w:ascii="Calibri" w:eastAsia="Calibri" w:hAnsi="Calibri" w:cs="Calibri"/>
                 <w:b/>
@@ -3269,6 +4167,7 @@
             <w:pPr>
               <w:widowControl w:val="0"/>
               <w:spacing w:after="0"/>
+              <w:jc w:val="center"/>
               <w:rPr>
                 <w:rFonts w:ascii="Calibri" w:eastAsia="Calibri" w:hAnsi="Calibri" w:cs="Calibri"/>
                 <w:b/>
@@ -3301,6 +4200,7 @@
             <w:pPr>
               <w:widowControl w:val="0"/>
               <w:spacing w:after="0"/>
+              <w:jc w:val="center"/>
               <w:rPr>
                 <w:rFonts w:ascii="Calibri" w:eastAsia="Calibri" w:hAnsi="Calibri" w:cs="Calibri"/>
                 <w:b/>
@@ -3333,6 +4233,7 @@
             <w:pPr>
               <w:widowControl w:val="0"/>
               <w:spacing w:after="0"/>
+              <w:jc w:val="center"/>
               <w:rPr>
                 <w:rFonts w:ascii="Calibri" w:eastAsia="Calibri" w:hAnsi="Calibri" w:cs="Calibri"/>
                 <w:b/>
@@ -3365,6 +4266,7 @@
             <w:pPr>
               <w:widowControl w:val="0"/>
               <w:spacing w:after="0"/>
+              <w:jc w:val="center"/>
               <w:rPr>
                 <w:rFonts w:ascii="Calibri" w:eastAsia="Calibri" w:hAnsi="Calibri" w:cs="Calibri"/>
                 <w:b/>
@@ -3397,19 +4299,30 @@
             <w:pPr>
               <w:widowControl w:val="0"/>
               <w:spacing w:after="0"/>
+              <w:jc w:val="center"/>
               <w:rPr>
                 <w:rFonts w:ascii="Calibri" w:eastAsia="Calibri" w:hAnsi="Calibri" w:cs="Calibri"/>
                 <w:b/>
                 <w:bCs/>
               </w:rPr>
             </w:pPr>
+            <w:proofErr w:type="gramStart"/>
             <w:r>
               <w:rPr>
                 <w:rFonts w:ascii="Calibri" w:eastAsia="Calibri" w:hAnsi="Calibri" w:cs="Calibri"/>
                 <w:b/>
                 <w:bCs/>
               </w:rPr>
-              <w:t>A EVITAR</w:t>
+              <w:t>A</w:t>
+            </w:r>
+            <w:proofErr w:type="gramEnd"/>
+            <w:r>
+              <w:rPr>
+                <w:rFonts w:ascii="Calibri" w:eastAsia="Calibri" w:hAnsi="Calibri" w:cs="Calibri"/>
+                <w:b/>
+                <w:bCs/>
+              </w:rPr>
+              <w:t xml:space="preserve"> EVITAR</w:t>
             </w:r>
           </w:p>
         </w:tc>
@@ -3429,6 +4342,7 @@
             <w:pPr>
               <w:widowControl w:val="0"/>
               <w:spacing w:after="0"/>
+              <w:jc w:val="center"/>
               <w:rPr>
                 <w:rFonts w:ascii="Calibri" w:eastAsia="Calibri" w:hAnsi="Calibri" w:cs="Calibri"/>
                 <w:b/>
@@ -3488,7 +4402,14 @@
               <w:rPr>
                 <w:rFonts w:ascii="Calibri" w:eastAsia="Calibri" w:hAnsi="Calibri" w:cs="Calibri"/>
               </w:rPr>
-              <w:t>in table_</w:t>
+              <w:t xml:space="preserve">in </w:t>
+            </w:r>
+            <w:proofErr w:type="spellStart"/>
+            <w:r>
+              <w:rPr>
+                <w:rFonts w:ascii="Calibri" w:eastAsia="Calibri" w:hAnsi="Calibri" w:cs="Calibri"/>
+              </w:rPr>
+              <w:t>table_</w:t>
             </w:r>
             <w:r>
               <w:rPr>
@@ -3496,6 +4417,7 @@
               </w:rPr>
               <w:t>food</w:t>
             </w:r>
+            <w:proofErr w:type="spellEnd"/>
             <w:r>
               <w:rPr>
                 <w:rFonts w:ascii="Calibri" w:eastAsia="Calibri" w:hAnsi="Calibri" w:cs="Calibri"/>
@@ -3530,6 +4452,7 @@
               </w:rPr>
               <w:t>{{</w:t>
             </w:r>
+            <w:proofErr w:type="gramStart"/>
             <w:r>
               <w:rPr>
                 <w:rFonts w:ascii="Calibri" w:eastAsia="Calibri" w:hAnsi="Calibri" w:cs="Calibri"/>
@@ -3540,7 +4463,14 @@
               <w:rPr>
                 <w:rFonts w:ascii="Calibri" w:eastAsia="Calibri" w:hAnsi="Calibri" w:cs="Calibri"/>
               </w:rPr>
-              <w:t>[0]</w:t>
+              <w:t>[</w:t>
+            </w:r>
+            <w:proofErr w:type="gramEnd"/>
+            <w:r>
+              <w:rPr>
+                <w:rFonts w:ascii="Calibri" w:eastAsia="Calibri" w:hAnsi="Calibri" w:cs="Calibri"/>
+              </w:rPr>
+              <w:t>0]</w:t>
             </w:r>
             <w:r>
               <w:rPr>
@@ -3568,6 +4498,7 @@
                 <w:rFonts w:ascii="Calibri" w:eastAsia="Calibri" w:hAnsi="Calibri" w:cs="Calibri"/>
               </w:rPr>
             </w:pPr>
+            <w:proofErr w:type="gramStart"/>
             <w:r>
               <w:rPr>
                 <w:rFonts w:ascii="Calibri" w:eastAsia="Calibri" w:hAnsi="Calibri" w:cs="Calibri"/>
@@ -3578,25 +4509,14 @@
               <w:rPr>
                 <w:rFonts w:ascii="Calibri" w:eastAsia="Calibri" w:hAnsi="Calibri" w:cs="Calibri"/>
               </w:rPr>
-              <w:t xml:space="preserve"> </w:t>
-            </w:r>
-            <w:r>
-              <w:rPr>
-                <w:rFonts w:ascii="Calibri" w:eastAsia="Calibri" w:hAnsi="Calibri" w:cs="Calibri"/>
-              </w:rPr>
-              <w:t>row[</w:t>
-            </w:r>
-            <w:r>
-              <w:rPr>
-                <w:rFonts w:ascii="Calibri" w:eastAsia="Calibri" w:hAnsi="Calibri" w:cs="Calibri"/>
-              </w:rPr>
-              <w:t>1</w:t>
-            </w:r>
-            <w:r>
-              <w:rPr>
-                <w:rFonts w:ascii="Calibri" w:eastAsia="Calibri" w:hAnsi="Calibri" w:cs="Calibri"/>
-              </w:rPr>
-              <w:t>]</w:t>
+              <w:t xml:space="preserve"> row</w:t>
+            </w:r>
+            <w:proofErr w:type="gramEnd"/>
+            <w:r>
+              <w:rPr>
+                <w:rFonts w:ascii="Calibri" w:eastAsia="Calibri" w:hAnsi="Calibri" w:cs="Calibri"/>
+              </w:rPr>
+              <w:t>[1]</w:t>
             </w:r>
             <w:r>
               <w:rPr>
@@ -3630,11 +4550,19 @@
               </w:rPr>
               <w:t>{{</w:t>
             </w:r>
-            <w:r>
-              <w:rPr>
-                <w:rFonts w:ascii="Calibri" w:eastAsia="Calibri" w:hAnsi="Calibri" w:cs="Calibri"/>
-              </w:rPr>
-              <w:t>row[2]</w:t>
+            <w:proofErr w:type="gramStart"/>
+            <w:r>
+              <w:rPr>
+                <w:rFonts w:ascii="Calibri" w:eastAsia="Calibri" w:hAnsi="Calibri" w:cs="Calibri"/>
+              </w:rPr>
+              <w:t>row[</w:t>
+            </w:r>
+            <w:proofErr w:type="gramEnd"/>
+            <w:r>
+              <w:rPr>
+                <w:rFonts w:ascii="Calibri" w:eastAsia="Calibri" w:hAnsi="Calibri" w:cs="Calibri"/>
+              </w:rPr>
+              <w:t>2]</w:t>
             </w:r>
             <w:r>
               <w:rPr>
@@ -3662,6 +4590,7 @@
                 <w:rFonts w:ascii="Calibri" w:eastAsia="Calibri" w:hAnsi="Calibri" w:cs="Calibri"/>
               </w:rPr>
             </w:pPr>
+            <w:proofErr w:type="gramStart"/>
             <w:r>
               <w:rPr>
                 <w:rFonts w:ascii="Calibri" w:eastAsia="Calibri" w:hAnsi="Calibri" w:cs="Calibri"/>
@@ -3672,25 +4601,14 @@
               <w:rPr>
                 <w:rFonts w:ascii="Calibri" w:eastAsia="Calibri" w:hAnsi="Calibri" w:cs="Calibri"/>
               </w:rPr>
-              <w:t xml:space="preserve"> </w:t>
-            </w:r>
-            <w:r>
-              <w:rPr>
-                <w:rFonts w:ascii="Calibri" w:eastAsia="Calibri" w:hAnsi="Calibri" w:cs="Calibri"/>
-              </w:rPr>
-              <w:t>row[</w:t>
-            </w:r>
-            <w:r>
-              <w:rPr>
-                <w:rFonts w:ascii="Calibri" w:eastAsia="Calibri" w:hAnsi="Calibri" w:cs="Calibri"/>
-              </w:rPr>
-              <w:t>3</w:t>
-            </w:r>
-            <w:r>
-              <w:rPr>
-                <w:rFonts w:ascii="Calibri" w:eastAsia="Calibri" w:hAnsi="Calibri" w:cs="Calibri"/>
-              </w:rPr>
-              <w:t>]</w:t>
+              <w:t xml:space="preserve"> row</w:t>
+            </w:r>
+            <w:proofErr w:type="gramEnd"/>
+            <w:r>
+              <w:rPr>
+                <w:rFonts w:ascii="Calibri" w:eastAsia="Calibri" w:hAnsi="Calibri" w:cs="Calibri"/>
+              </w:rPr>
+              <w:t>[3]</w:t>
             </w:r>
             <w:r>
               <w:rPr>
@@ -3718,6 +4636,7 @@
                 <w:rFonts w:ascii="Calibri" w:eastAsia="Calibri" w:hAnsi="Calibri" w:cs="Calibri"/>
               </w:rPr>
             </w:pPr>
+            <w:proofErr w:type="gramStart"/>
             <w:r>
               <w:rPr>
                 <w:rFonts w:ascii="Calibri" w:eastAsia="Calibri" w:hAnsi="Calibri" w:cs="Calibri"/>
@@ -3728,25 +4647,14 @@
               <w:rPr>
                 <w:rFonts w:ascii="Calibri" w:eastAsia="Calibri" w:hAnsi="Calibri" w:cs="Calibri"/>
               </w:rPr>
-              <w:t xml:space="preserve"> </w:t>
-            </w:r>
-            <w:r>
-              <w:rPr>
-                <w:rFonts w:ascii="Calibri" w:eastAsia="Calibri" w:hAnsi="Calibri" w:cs="Calibri"/>
-              </w:rPr>
-              <w:t>row[</w:t>
-            </w:r>
-            <w:r>
-              <w:rPr>
-                <w:rFonts w:ascii="Calibri" w:eastAsia="Calibri" w:hAnsi="Calibri" w:cs="Calibri"/>
-              </w:rPr>
-              <w:t>4</w:t>
-            </w:r>
-            <w:r>
-              <w:rPr>
-                <w:rFonts w:ascii="Calibri" w:eastAsia="Calibri" w:hAnsi="Calibri" w:cs="Calibri"/>
-              </w:rPr>
-              <w:t>]</w:t>
+              <w:t xml:space="preserve"> row</w:t>
+            </w:r>
+            <w:proofErr w:type="gramEnd"/>
+            <w:r>
+              <w:rPr>
+                <w:rFonts w:ascii="Calibri" w:eastAsia="Calibri" w:hAnsi="Calibri" w:cs="Calibri"/>
+              </w:rPr>
+              <w:t>[4]</w:t>
             </w:r>
             <w:r>
               <w:rPr>
@@ -3774,6 +4682,7 @@
                 <w:rFonts w:ascii="Calibri" w:eastAsia="Calibri" w:hAnsi="Calibri" w:cs="Calibri"/>
               </w:rPr>
             </w:pPr>
+            <w:proofErr w:type="gramStart"/>
             <w:r>
               <w:rPr>
                 <w:rFonts w:ascii="Calibri" w:eastAsia="Calibri" w:hAnsi="Calibri" w:cs="Calibri"/>
@@ -3784,25 +4693,14 @@
               <w:rPr>
                 <w:rFonts w:ascii="Calibri" w:eastAsia="Calibri" w:hAnsi="Calibri" w:cs="Calibri"/>
               </w:rPr>
-              <w:t xml:space="preserve"> </w:t>
-            </w:r>
-            <w:r>
-              <w:rPr>
-                <w:rFonts w:ascii="Calibri" w:eastAsia="Calibri" w:hAnsi="Calibri" w:cs="Calibri"/>
-              </w:rPr>
-              <w:t>row[</w:t>
-            </w:r>
-            <w:r>
-              <w:rPr>
-                <w:rFonts w:ascii="Calibri" w:eastAsia="Calibri" w:hAnsi="Calibri" w:cs="Calibri"/>
-              </w:rPr>
-              <w:t>5</w:t>
-            </w:r>
-            <w:r>
-              <w:rPr>
-                <w:rFonts w:ascii="Calibri" w:eastAsia="Calibri" w:hAnsi="Calibri" w:cs="Calibri"/>
-              </w:rPr>
-              <w:t>]</w:t>
+              <w:t xml:space="preserve"> row</w:t>
+            </w:r>
+            <w:proofErr w:type="gramEnd"/>
+            <w:r>
+              <w:rPr>
+                <w:rFonts w:ascii="Calibri" w:eastAsia="Calibri" w:hAnsi="Calibri" w:cs="Calibri"/>
+              </w:rPr>
+              <w:t>[5]</w:t>
             </w:r>
             <w:r>
               <w:rPr>
@@ -3839,7 +4737,21 @@
               <w:rPr>
                 <w:rFonts w:ascii="Calibri" w:eastAsia="Calibri" w:hAnsi="Calibri" w:cs="Calibri"/>
               </w:rPr>
-              <w:t>{%tr endfor %}</w:t>
+              <w:t xml:space="preserve">{%tr </w:t>
+            </w:r>
+            <w:proofErr w:type="spellStart"/>
+            <w:r>
+              <w:rPr>
+                <w:rFonts w:ascii="Calibri" w:eastAsia="Calibri" w:hAnsi="Calibri" w:cs="Calibri"/>
+              </w:rPr>
+              <w:t>endfor</w:t>
+            </w:r>
+            <w:proofErr w:type="spellEnd"/>
+            <w:r>
+              <w:rPr>
+                <w:rFonts w:ascii="Calibri" w:eastAsia="Calibri" w:hAnsi="Calibri" w:cs="Calibri"/>
+              </w:rPr>
+              <w:t xml:space="preserve"> %}</w:t>
             </w:r>
           </w:p>
         </w:tc>
@@ -4080,7 +4992,35 @@
               <w:rPr>
                 <w:rFonts w:ascii="Calibri" w:eastAsia="Calibri" w:hAnsi="Calibri" w:cs="Calibri"/>
               </w:rPr>
-              <w:t>{%tr for k, v in table_emotions.items()%}</w:t>
+              <w:t xml:space="preserve">{%tr for k, v in </w:t>
+            </w:r>
+            <w:proofErr w:type="spellStart"/>
+            <w:r>
+              <w:rPr>
+                <w:rFonts w:ascii="Calibri" w:eastAsia="Calibri" w:hAnsi="Calibri" w:cs="Calibri"/>
+              </w:rPr>
+              <w:t>table_</w:t>
+            </w:r>
+            <w:proofErr w:type="gramStart"/>
+            <w:r>
+              <w:rPr>
+                <w:rFonts w:ascii="Calibri" w:eastAsia="Calibri" w:hAnsi="Calibri" w:cs="Calibri"/>
+              </w:rPr>
+              <w:t>emotions.items</w:t>
+            </w:r>
+            <w:proofErr w:type="spellEnd"/>
+            <w:r>
+              <w:rPr>
+                <w:rFonts w:ascii="Calibri" w:eastAsia="Calibri" w:hAnsi="Calibri" w:cs="Calibri"/>
+              </w:rPr>
+              <w:t>()%</w:t>
+            </w:r>
+            <w:proofErr w:type="gramEnd"/>
+            <w:r>
+              <w:rPr>
+                <w:rFonts w:ascii="Calibri" w:eastAsia="Calibri" w:hAnsi="Calibri" w:cs="Calibri"/>
+              </w:rPr>
+              <w:t>}</w:t>
             </w:r>
           </w:p>
         </w:tc>
@@ -4164,7 +5104,21 @@
               <w:rPr>
                 <w:rFonts w:ascii="Calibri" w:eastAsia="Calibri" w:hAnsi="Calibri" w:cs="Calibri"/>
               </w:rPr>
-              <w:t>{%tr endfor %}</w:t>
+              <w:t xml:space="preserve">{%tr </w:t>
+            </w:r>
+            <w:proofErr w:type="spellStart"/>
+            <w:r>
+              <w:rPr>
+                <w:rFonts w:ascii="Calibri" w:eastAsia="Calibri" w:hAnsi="Calibri" w:cs="Calibri"/>
+              </w:rPr>
+              <w:t>endfor</w:t>
+            </w:r>
+            <w:proofErr w:type="spellEnd"/>
+            <w:r>
+              <w:rPr>
+                <w:rFonts w:ascii="Calibri" w:eastAsia="Calibri" w:hAnsi="Calibri" w:cs="Calibri"/>
+              </w:rPr>
+              <w:t xml:space="preserve"> %}</w:t>
             </w:r>
           </w:p>
         </w:tc>
@@ -4248,6 +5202,9 @@
         <w:gridCol w:w="1560"/>
       </w:tblGrid>
       <w:tr>
+        <w:trPr>
+          <w:tblHeader/>
+        </w:trPr>
         <w:tc>
           <w:tcPr>
             <w:tcW w:w="1701" w:type="dxa"/>
@@ -4391,7 +5348,21 @@
               <w:rPr>
                 <w:rFonts w:ascii="Calibri" w:eastAsia="Calibri" w:hAnsi="Calibri" w:cs="Calibri"/>
               </w:rPr>
-              <w:t>{%tr for item in table_crystals%}</w:t>
+              <w:t xml:space="preserve">{%tr for item in </w:t>
+            </w:r>
+            <w:proofErr w:type="spellStart"/>
+            <w:r>
+              <w:rPr>
+                <w:rFonts w:ascii="Calibri" w:eastAsia="Calibri" w:hAnsi="Calibri" w:cs="Calibri"/>
+              </w:rPr>
+              <w:t>table_crystals</w:t>
+            </w:r>
+            <w:proofErr w:type="spellEnd"/>
+            <w:r>
+              <w:rPr>
+                <w:rFonts w:ascii="Calibri" w:eastAsia="Calibri" w:hAnsi="Calibri" w:cs="Calibri"/>
+              </w:rPr>
+              <w:t>%}</w:t>
             </w:r>
           </w:p>
         </w:tc>
@@ -4417,7 +5388,23 @@
               <w:rPr>
                 <w:rFonts w:ascii="Calibri" w:eastAsia="Calibri" w:hAnsi="Calibri" w:cs="Calibri"/>
               </w:rPr>
-              <w:t>{{item.cristal}}</w:t>
+              <w:t>{{</w:t>
+            </w:r>
+            <w:proofErr w:type="spellStart"/>
+            <w:proofErr w:type="gramStart"/>
+            <w:r>
+              <w:rPr>
+                <w:rFonts w:ascii="Calibri" w:eastAsia="Calibri" w:hAnsi="Calibri" w:cs="Calibri"/>
+              </w:rPr>
+              <w:t>item.cristal</w:t>
+            </w:r>
+            <w:proofErr w:type="spellEnd"/>
+            <w:proofErr w:type="gramEnd"/>
+            <w:r>
+              <w:rPr>
+                <w:rFonts w:ascii="Calibri" w:eastAsia="Calibri" w:hAnsi="Calibri" w:cs="Calibri"/>
+              </w:rPr>
+              <w:t>}}</w:t>
             </w:r>
           </w:p>
         </w:tc>
@@ -4443,7 +5430,32 @@
                 <w:rFonts w:ascii="Calibri" w:eastAsia="Calibri" w:hAnsi="Calibri" w:cs="Calibri"/>
                 <w:lang w:val="pt-BR"/>
               </w:rPr>
-              <w:t>{{item.beneficios_fisicos}}</w:t>
+              <w:t>{{</w:t>
+            </w:r>
+            <w:proofErr w:type="spellStart"/>
+            <w:proofErr w:type="gramStart"/>
+            <w:r>
+              <w:rPr>
+                <w:rFonts w:ascii="Calibri" w:eastAsia="Calibri" w:hAnsi="Calibri" w:cs="Calibri"/>
+                <w:lang w:val="pt-BR"/>
+              </w:rPr>
+              <w:t>item.beneficios</w:t>
+            </w:r>
+            <w:proofErr w:type="gramEnd"/>
+            <w:r>
+              <w:rPr>
+                <w:rFonts w:ascii="Calibri" w:eastAsia="Calibri" w:hAnsi="Calibri" w:cs="Calibri"/>
+                <w:lang w:val="pt-BR"/>
+              </w:rPr>
+              <w:t>_fisicos</w:t>
+            </w:r>
+            <w:proofErr w:type="spellEnd"/>
+            <w:r>
+              <w:rPr>
+                <w:rFonts w:ascii="Calibri" w:eastAsia="Calibri" w:hAnsi="Calibri" w:cs="Calibri"/>
+                <w:lang w:val="pt-BR"/>
+              </w:rPr>
+              <w:t>}}</w:t>
             </w:r>
           </w:p>
         </w:tc>
@@ -4469,7 +5481,32 @@
                 <w:rFonts w:ascii="Calibri" w:eastAsia="Calibri" w:hAnsi="Calibri" w:cs="Calibri"/>
                 <w:lang w:val="pt-BR"/>
               </w:rPr>
-              <w:t>{{item.beneficios_emocionais}}</w:t>
+              <w:t>{{</w:t>
+            </w:r>
+            <w:proofErr w:type="spellStart"/>
+            <w:proofErr w:type="gramStart"/>
+            <w:r>
+              <w:rPr>
+                <w:rFonts w:ascii="Calibri" w:eastAsia="Calibri" w:hAnsi="Calibri" w:cs="Calibri"/>
+                <w:lang w:val="pt-BR"/>
+              </w:rPr>
+              <w:t>item.beneficios</w:t>
+            </w:r>
+            <w:proofErr w:type="gramEnd"/>
+            <w:r>
+              <w:rPr>
+                <w:rFonts w:ascii="Calibri" w:eastAsia="Calibri" w:hAnsi="Calibri" w:cs="Calibri"/>
+                <w:lang w:val="pt-BR"/>
+              </w:rPr>
+              <w:t>_emocionais</w:t>
+            </w:r>
+            <w:proofErr w:type="spellEnd"/>
+            <w:r>
+              <w:rPr>
+                <w:rFonts w:ascii="Calibri" w:eastAsia="Calibri" w:hAnsi="Calibri" w:cs="Calibri"/>
+                <w:lang w:val="pt-BR"/>
+              </w:rPr>
+              <w:t>}}</w:t>
             </w:r>
           </w:p>
         </w:tc>
@@ -4494,7 +5531,23 @@
               <w:rPr>
                 <w:rFonts w:ascii="Calibri" w:eastAsia="Calibri" w:hAnsi="Calibri" w:cs="Calibri"/>
               </w:rPr>
-              <w:t>{{item.D}}</w:t>
+              <w:t>{{</w:t>
+            </w:r>
+            <w:proofErr w:type="spellStart"/>
+            <w:proofErr w:type="gramStart"/>
+            <w:r>
+              <w:rPr>
+                <w:rFonts w:ascii="Calibri" w:eastAsia="Calibri" w:hAnsi="Calibri" w:cs="Calibri"/>
+              </w:rPr>
+              <w:t>item.D</w:t>
+            </w:r>
+            <w:proofErr w:type="spellEnd"/>
+            <w:proofErr w:type="gramEnd"/>
+            <w:r>
+              <w:rPr>
+                <w:rFonts w:ascii="Calibri" w:eastAsia="Calibri" w:hAnsi="Calibri" w:cs="Calibri"/>
+              </w:rPr>
+              <w:t>}}</w:t>
             </w:r>
           </w:p>
         </w:tc>
@@ -4521,7 +5574,21 @@
               <w:rPr>
                 <w:rFonts w:ascii="Calibri" w:eastAsia="Calibri" w:hAnsi="Calibri" w:cs="Calibri"/>
               </w:rPr>
-              <w:t>{%tr endfor%}</w:t>
+              <w:t xml:space="preserve">{%tr </w:t>
+            </w:r>
+            <w:proofErr w:type="spellStart"/>
+            <w:r>
+              <w:rPr>
+                <w:rFonts w:ascii="Calibri" w:eastAsia="Calibri" w:hAnsi="Calibri" w:cs="Calibri"/>
+              </w:rPr>
+              <w:t>endfor</w:t>
+            </w:r>
+            <w:proofErr w:type="spellEnd"/>
+            <w:r>
+              <w:rPr>
+                <w:rFonts w:ascii="Calibri" w:eastAsia="Calibri" w:hAnsi="Calibri" w:cs="Calibri"/>
+              </w:rPr>
+              <w:t>%}</w:t>
             </w:r>
           </w:p>
         </w:tc>
@@ -4606,6 +5673,7 @@
         </w:rPr>
         <w:br/>
       </w:r>
+      <w:proofErr w:type="spellStart"/>
       <w:r>
         <w:rPr>
           <w:rFonts w:ascii="Calibri" w:eastAsia="Calibri" w:hAnsi="Calibri" w:cs="Calibri"/>
@@ -4613,7 +5681,17 @@
           <w:bCs/>
           <w:lang w:val="pt-BR"/>
         </w:rPr>
-        <w:t>Bienestar - Terapias Biofísicas</w:t>
+        <w:t>Bienestar</w:t>
+      </w:r>
+      <w:proofErr w:type="spellEnd"/>
+      <w:r>
+        <w:rPr>
+          <w:rFonts w:ascii="Calibri" w:eastAsia="Calibri" w:hAnsi="Calibri" w:cs="Calibri"/>
+          <w:b/>
+          <w:bCs/>
+          <w:lang w:val="pt-BR"/>
+        </w:rPr>
+        <w:t xml:space="preserve"> - Terapias Biofísicas</w:t>
       </w:r>
       <w:r>
         <w:rPr>
@@ -4637,7 +5715,23 @@
           <w:lang w:val="pt-BR"/>
         </w:rPr>
         <w:br/>
-        <w:t>Email: bienestarsantos@gmail.com | Instagram: @bienestarsantos  -    WhatsApp: (13) 99147-4404</w:t>
+        <w:t>Email: bienestarsantos@gmail.com | Instagram: @</w:t>
+      </w:r>
+      <w:proofErr w:type="gramStart"/>
+      <w:r>
+        <w:rPr>
+          <w:rFonts w:ascii="Calibri" w:eastAsia="Calibri" w:hAnsi="Calibri" w:cs="Calibri"/>
+          <w:lang w:val="pt-BR"/>
+        </w:rPr>
+        <w:t>bienestarsantos  -</w:t>
+      </w:r>
+      <w:proofErr w:type="gramEnd"/>
+      <w:r>
+        <w:rPr>
+          <w:rFonts w:ascii="Calibri" w:eastAsia="Calibri" w:hAnsi="Calibri" w:cs="Calibri"/>
+          <w:lang w:val="pt-BR"/>
+        </w:rPr>
+        <w:t xml:space="preserve">    WhatsApp: (13) 99147-4404</w:t>
       </w:r>
     </w:p>
     <w:sectPr>

</xml_diff>